<commit_message>
imkes vorschläge angenommen, blocksatz
</commit_message>
<xml_diff>
--- a/7_KI-Basismodule/KI-B1/KI-B1.3.1_Wimmelbild_ZusätzlicheErklärung.docx
+++ b/7_KI-Basismodule/KI-B1/KI-B1.3.1_Wimmelbild_ZusätzlicheErklärung.docx
@@ -1,9 +1,10 @@
 
 <file path=word/document.xml><?xml version="1.0" encoding="utf-8"?>
-<w:document xmlns:wpc="http://schemas.microsoft.com/office/word/2010/wordprocessingCanvas" xmlns:cx="http://schemas.microsoft.com/office/drawing/2014/chartex" xmlns:cx1="http://schemas.microsoft.com/office/drawing/2015/9/8/chartex" xmlns:cx2="http://schemas.microsoft.com/office/drawing/2015/10/21/chartex" xmlns:cx3="http://schemas.microsoft.com/office/drawing/2016/5/9/chartex" xmlns:cx4="http://schemas.microsoft.com/office/drawing/2016/5/10/chartex" xmlns:cx5="http://schemas.microsoft.com/office/drawing/2016/5/11/chartex" xmlns:cx6="http://schemas.microsoft.com/office/drawing/2016/5/12/chartex" xmlns:cx7="http://schemas.microsoft.com/office/drawing/2016/5/13/chartex" xmlns:cx8="http://schemas.microsoft.com/office/drawing/2016/5/14/chartex" xmlns:mc="http://schemas.openxmlformats.org/markup-compatibility/2006" xmlns:aink="http://schemas.microsoft.com/office/drawing/2016/ink" xmlns:am3d="http://schemas.microsoft.com/office/drawing/2017/model3d" xmlns:o="urn:schemas-microsoft-com:office:office" xmlns:r="http://schemas.openxmlformats.org/officeDocument/2006/relationships" xmlns:m="http://schemas.openxmlformats.org/officeDocument/2006/math" xmlns:v="urn:schemas-microsoft-com:vml" xmlns:wp14="http://schemas.microsoft.com/office/word/2010/wordprocessingDrawing" xmlns:wp="http://schemas.openxmlformats.org/drawingml/2006/wordprocessingDrawing" xmlns:w10="urn:schemas-microsoft-com:office:word" xmlns:w="http://schemas.openxmlformats.org/wordprocessingml/2006/main" xmlns:w14="http://schemas.microsoft.com/office/word/2010/wordml" xmlns:w15="http://schemas.microsoft.com/office/word/2012/wordml" xmlns:w16cid="http://schemas.microsoft.com/office/word/2016/wordml/cid" xmlns:w16se="http://schemas.microsoft.com/office/word/2015/wordml/symex" xmlns:wpg="http://schemas.microsoft.com/office/word/2010/wordprocessingGroup" xmlns:wpi="http://schemas.microsoft.com/office/word/2010/wordprocessingInk" xmlns:wne="http://schemas.microsoft.com/office/word/2006/wordml" xmlns:wps="http://schemas.microsoft.com/office/word/2010/wordprocessingShape" mc:Ignorable="w14 w15 w16se w16cid wp14">
+<w:document xmlns:wpc="http://schemas.microsoft.com/office/word/2010/wordprocessingCanvas" xmlns:cx="http://schemas.microsoft.com/office/drawing/2014/chartex" xmlns:cx1="http://schemas.microsoft.com/office/drawing/2015/9/8/chartex" xmlns:cx2="http://schemas.microsoft.com/office/drawing/2015/10/21/chartex" xmlns:cx3="http://schemas.microsoft.com/office/drawing/2016/5/9/chartex" xmlns:cx4="http://schemas.microsoft.com/office/drawing/2016/5/10/chartex" xmlns:cx5="http://schemas.microsoft.com/office/drawing/2016/5/11/chartex" xmlns:cx6="http://schemas.microsoft.com/office/drawing/2016/5/12/chartex" xmlns:cx7="http://schemas.microsoft.com/office/drawing/2016/5/13/chartex" xmlns:cx8="http://schemas.microsoft.com/office/drawing/2016/5/14/chartex" xmlns:mc="http://schemas.openxmlformats.org/markup-compatibility/2006" xmlns:aink="http://schemas.microsoft.com/office/drawing/2016/ink" xmlns:am3d="http://schemas.microsoft.com/office/drawing/2017/model3d" xmlns:o="urn:schemas-microsoft-com:office:office" xmlns:oel="http://schemas.microsoft.com/office/2019/extlst" xmlns:r="http://schemas.openxmlformats.org/officeDocument/2006/relationships" xmlns:m="http://schemas.openxmlformats.org/officeDocument/2006/math" xmlns:v="urn:schemas-microsoft-com:vml" xmlns:wp14="http://schemas.microsoft.com/office/word/2010/wordprocessingDrawing" xmlns:wp="http://schemas.openxmlformats.org/drawingml/2006/wordprocessingDrawing" xmlns:w10="urn:schemas-microsoft-com:office:word" xmlns:w="http://schemas.openxmlformats.org/wordprocessingml/2006/main" xmlns:w14="http://schemas.microsoft.com/office/word/2010/wordml" xmlns:w15="http://schemas.microsoft.com/office/word/2012/wordml" xmlns:w16cex="http://schemas.microsoft.com/office/word/2018/wordml/cex" xmlns:w16cid="http://schemas.microsoft.com/office/word/2016/wordml/cid" xmlns:w16="http://schemas.microsoft.com/office/word/2018/wordml" xmlns:w16du="http://schemas.microsoft.com/office/word/2023/wordml/word16du" xmlns:w16sdtdh="http://schemas.microsoft.com/office/word/2020/wordml/sdtdatahash" xmlns:w16se="http://schemas.microsoft.com/office/word/2015/wordml/symex" xmlns:wpg="http://schemas.microsoft.com/office/word/2010/wordprocessingGroup" xmlns:wpi="http://schemas.microsoft.com/office/word/2010/wordprocessingInk" xmlns:wne="http://schemas.microsoft.com/office/word/2006/wordml" xmlns:wps="http://schemas.microsoft.com/office/word/2010/wordprocessingShape" mc:Ignorable="w14 w15 w16se w16cid w16 w16cex w16sdtdh wp14">
   <w:body>
     <w:p>
       <w:pPr>
+        <w:jc w:val="both"/>
         <w:sectPr>
           <w:headerReference w:type="even" r:id="rId9"/>
           <w:headerReference w:type="default" r:id="rId10"/>
@@ -24,7 +25,7 @@
         <mc:AlternateContent>
           <mc:Choice Requires="wpg">
             <w:drawing>
-              <wp:anchor distT="0" distB="0" distL="114300" distR="114300" simplePos="0" relativeHeight="251658239" behindDoc="0" locked="0" layoutInCell="1" allowOverlap="1">
+              <wp:anchor distT="0" distB="0" distL="114300" distR="114300" simplePos="0" relativeHeight="251658239" behindDoc="0" locked="0" layoutInCell="1" allowOverlap="1" wp14:anchorId="1B516FCC" wp14:editId="1E3AB044">
                 <wp:simplePos x="0" y="0"/>
                 <wp:positionH relativeFrom="margin">
                   <wp:align>left</wp:align>
@@ -106,7 +107,7 @@
         <mc:AlternateContent>
           <mc:Choice Requires="wpg">
             <w:drawing>
-              <wp:anchor distT="0" distB="0" distL="114300" distR="114300" simplePos="0" relativeHeight="251705344" behindDoc="0" locked="0" layoutInCell="1" allowOverlap="1">
+              <wp:anchor distT="0" distB="0" distL="114300" distR="114300" simplePos="0" relativeHeight="251705344" behindDoc="0" locked="0" layoutInCell="1" allowOverlap="1" wp14:anchorId="4C88DB4C" wp14:editId="3951CE19">
                 <wp:simplePos x="0" y="0"/>
                 <wp:positionH relativeFrom="margin">
                   <wp:posOffset>5501640</wp:posOffset>
@@ -238,7 +239,7 @@
         <mc:AlternateContent>
           <mc:Choice Requires="wpg">
             <w:drawing>
-              <wp:anchor distT="0" distB="0" distL="114300" distR="114300" simplePos="0" relativeHeight="251701248" behindDoc="0" locked="0" layoutInCell="1" allowOverlap="1">
+              <wp:anchor distT="0" distB="0" distL="114300" distR="114300" simplePos="0" relativeHeight="251701248" behindDoc="0" locked="0" layoutInCell="1" allowOverlap="1" wp14:anchorId="125C669B" wp14:editId="7DD913C2">
                 <wp:simplePos x="0" y="0"/>
                 <wp:positionH relativeFrom="margin">
                   <wp:posOffset>5957570</wp:posOffset>
@@ -370,7 +371,7 @@
         <mc:AlternateContent>
           <mc:Choice Requires="wpg">
             <w:drawing>
-              <wp:anchor distT="0" distB="0" distL="114300" distR="114300" simplePos="0" relativeHeight="251703296" behindDoc="0" locked="0" layoutInCell="1" allowOverlap="1">
+              <wp:anchor distT="0" distB="0" distL="114300" distR="114300" simplePos="0" relativeHeight="251703296" behindDoc="0" locked="0" layoutInCell="1" allowOverlap="1" wp14:anchorId="0BD7F650" wp14:editId="7710FFD9">
                 <wp:simplePos x="0" y="0"/>
                 <wp:positionH relativeFrom="margin">
                   <wp:posOffset>4591050</wp:posOffset>
@@ -502,7 +503,7 @@
         <mc:AlternateContent>
           <mc:Choice Requires="wpg">
             <w:drawing>
-              <wp:anchor distT="0" distB="0" distL="114300" distR="114300" simplePos="0" relativeHeight="251711488" behindDoc="0" locked="0" layoutInCell="1" allowOverlap="1">
+              <wp:anchor distT="0" distB="0" distL="114300" distR="114300" simplePos="0" relativeHeight="251711488" behindDoc="0" locked="0" layoutInCell="1" allowOverlap="1" wp14:anchorId="62342F27" wp14:editId="0701C6CF">
                 <wp:simplePos x="0" y="0"/>
                 <wp:positionH relativeFrom="margin">
                   <wp:posOffset>4609465</wp:posOffset>
@@ -634,7 +635,7 @@
         <mc:AlternateContent>
           <mc:Choice Requires="wpg">
             <w:drawing>
-              <wp:anchor distT="0" distB="0" distL="114300" distR="114300" simplePos="0" relativeHeight="251709440" behindDoc="0" locked="0" layoutInCell="1" allowOverlap="1">
+              <wp:anchor distT="0" distB="0" distL="114300" distR="114300" simplePos="0" relativeHeight="251709440" behindDoc="0" locked="0" layoutInCell="1" allowOverlap="1" wp14:anchorId="6A34AC4B" wp14:editId="01C2A2D3">
                 <wp:simplePos x="0" y="0"/>
                 <wp:positionH relativeFrom="margin">
                   <wp:posOffset>2408473</wp:posOffset>
@@ -766,7 +767,7 @@
         <mc:AlternateContent>
           <mc:Choice Requires="wpg">
             <w:drawing>
-              <wp:anchor distT="0" distB="0" distL="114300" distR="114300" simplePos="0" relativeHeight="251707392" behindDoc="0" locked="0" layoutInCell="1" allowOverlap="1">
+              <wp:anchor distT="0" distB="0" distL="114300" distR="114300" simplePos="0" relativeHeight="251707392" behindDoc="0" locked="0" layoutInCell="1" allowOverlap="1" wp14:anchorId="22ED2982" wp14:editId="7F5E242F">
                 <wp:simplePos x="0" y="0"/>
                 <wp:positionH relativeFrom="margin">
                   <wp:posOffset>3312770</wp:posOffset>
@@ -898,7 +899,7 @@
         <mc:AlternateContent>
           <mc:Choice Requires="wpg">
             <w:drawing>
-              <wp:anchor distT="0" distB="0" distL="114300" distR="114300" simplePos="0" relativeHeight="251699200" behindDoc="0" locked="0" layoutInCell="1" allowOverlap="1">
+              <wp:anchor distT="0" distB="0" distL="114300" distR="114300" simplePos="0" relativeHeight="251699200" behindDoc="0" locked="0" layoutInCell="1" allowOverlap="1" wp14:anchorId="599F2C9D" wp14:editId="4A7F6185">
                 <wp:simplePos x="0" y="0"/>
                 <wp:positionH relativeFrom="margin">
                   <wp:posOffset>7858521</wp:posOffset>
@@ -1030,7 +1031,7 @@
         <mc:AlternateContent>
           <mc:Choice Requires="wpg">
             <w:drawing>
-              <wp:anchor distT="0" distB="0" distL="114300" distR="114300" simplePos="0" relativeHeight="251696128" behindDoc="0" locked="0" layoutInCell="1" allowOverlap="1">
+              <wp:anchor distT="0" distB="0" distL="114300" distR="114300" simplePos="0" relativeHeight="251696128" behindDoc="0" locked="0" layoutInCell="1" allowOverlap="1" wp14:anchorId="13CD0708" wp14:editId="3B937DF8">
                 <wp:simplePos x="0" y="0"/>
                 <wp:positionH relativeFrom="margin">
                   <wp:posOffset>6603472</wp:posOffset>
@@ -1162,7 +1163,7 @@
         <mc:AlternateContent>
           <mc:Choice Requires="wpg">
             <w:drawing>
-              <wp:anchor distT="0" distB="0" distL="114300" distR="114300" simplePos="0" relativeHeight="251691008" behindDoc="0" locked="0" layoutInCell="1" allowOverlap="1">
+              <wp:anchor distT="0" distB="0" distL="114300" distR="114300" simplePos="0" relativeHeight="251691008" behindDoc="0" locked="0" layoutInCell="1" allowOverlap="1" wp14:anchorId="2454788C" wp14:editId="57A16A73">
                 <wp:simplePos x="0" y="0"/>
                 <wp:positionH relativeFrom="margin">
                   <wp:posOffset>7575544</wp:posOffset>
@@ -1294,7 +1295,7 @@
         <mc:AlternateContent>
           <mc:Choice Requires="wpg">
             <w:drawing>
-              <wp:anchor distT="0" distB="0" distL="114300" distR="114300" simplePos="0" relativeHeight="251688960" behindDoc="0" locked="0" layoutInCell="1" allowOverlap="1">
+              <wp:anchor distT="0" distB="0" distL="114300" distR="114300" simplePos="0" relativeHeight="251688960" behindDoc="0" locked="0" layoutInCell="1" allowOverlap="1" wp14:anchorId="667DA494" wp14:editId="7D1FA3B2">
                 <wp:simplePos x="0" y="0"/>
                 <wp:positionH relativeFrom="margin">
                   <wp:posOffset>5903966</wp:posOffset>
@@ -1426,7 +1427,7 @@
         <mc:AlternateContent>
           <mc:Choice Requires="wpg">
             <w:drawing>
-              <wp:anchor distT="0" distB="0" distL="114300" distR="114300" simplePos="0" relativeHeight="251676672" behindDoc="0" locked="0" layoutInCell="1" allowOverlap="1">
+              <wp:anchor distT="0" distB="0" distL="114300" distR="114300" simplePos="0" relativeHeight="251676672" behindDoc="0" locked="0" layoutInCell="1" allowOverlap="1" wp14:anchorId="41D7CD03" wp14:editId="0EE0D4EB">
                 <wp:simplePos x="0" y="0"/>
                 <wp:positionH relativeFrom="margin">
                   <wp:posOffset>7012701</wp:posOffset>
@@ -1558,7 +1559,7 @@
         <mc:AlternateContent>
           <mc:Choice Requires="wpg">
             <w:drawing>
-              <wp:anchor distT="0" distB="0" distL="114300" distR="114300" simplePos="0" relativeHeight="251684864" behindDoc="0" locked="0" layoutInCell="1" allowOverlap="1">
+              <wp:anchor distT="0" distB="0" distL="114300" distR="114300" simplePos="0" relativeHeight="251684864" behindDoc="0" locked="0" layoutInCell="1" allowOverlap="1" wp14:anchorId="6254F344" wp14:editId="700564DF">
                 <wp:simplePos x="0" y="0"/>
                 <wp:positionH relativeFrom="margin">
                   <wp:posOffset>5891071</wp:posOffset>
@@ -1690,7 +1691,7 @@
         <mc:AlternateContent>
           <mc:Choice Requires="wpg">
             <w:drawing>
-              <wp:anchor distT="0" distB="0" distL="114300" distR="114300" simplePos="0" relativeHeight="251682816" behindDoc="0" locked="0" layoutInCell="1" allowOverlap="1">
+              <wp:anchor distT="0" distB="0" distL="114300" distR="114300" simplePos="0" relativeHeight="251682816" behindDoc="0" locked="0" layoutInCell="1" allowOverlap="1" wp14:anchorId="19FBB1CE" wp14:editId="67E0E9CD">
                 <wp:simplePos x="0" y="0"/>
                 <wp:positionH relativeFrom="margin">
                   <wp:posOffset>2689420</wp:posOffset>
@@ -1822,7 +1823,7 @@
         <mc:AlternateContent>
           <mc:Choice Requires="wpg">
             <w:drawing>
-              <wp:anchor distT="0" distB="0" distL="114300" distR="114300" simplePos="0" relativeHeight="251686912" behindDoc="0" locked="0" layoutInCell="1" allowOverlap="1">
+              <wp:anchor distT="0" distB="0" distL="114300" distR="114300" simplePos="0" relativeHeight="251686912" behindDoc="0" locked="0" layoutInCell="1" allowOverlap="1" wp14:anchorId="3A763FA1" wp14:editId="6573DB61">
                 <wp:simplePos x="0" y="0"/>
                 <wp:positionH relativeFrom="margin">
                   <wp:posOffset>4279007</wp:posOffset>
@@ -1954,7 +1955,7 @@
         <mc:AlternateContent>
           <mc:Choice Requires="wpg">
             <w:drawing>
-              <wp:anchor distT="0" distB="0" distL="114300" distR="114300" simplePos="0" relativeHeight="251680768" behindDoc="0" locked="0" layoutInCell="1" allowOverlap="1">
+              <wp:anchor distT="0" distB="0" distL="114300" distR="114300" simplePos="0" relativeHeight="251680768" behindDoc="0" locked="0" layoutInCell="1" allowOverlap="1" wp14:anchorId="28B3F48D" wp14:editId="1AB996AC">
                 <wp:simplePos x="0" y="0"/>
                 <wp:positionH relativeFrom="margin">
                   <wp:posOffset>3468860</wp:posOffset>
@@ -2086,7 +2087,7 @@
         <mc:AlternateContent>
           <mc:Choice Requires="wpg">
             <w:drawing>
-              <wp:anchor distT="0" distB="0" distL="114300" distR="114300" simplePos="0" relativeHeight="251678720" behindDoc="0" locked="0" layoutInCell="1" allowOverlap="1">
+              <wp:anchor distT="0" distB="0" distL="114300" distR="114300" simplePos="0" relativeHeight="251678720" behindDoc="0" locked="0" layoutInCell="1" allowOverlap="1" wp14:anchorId="5CD608F8" wp14:editId="1A22ECAF">
                 <wp:simplePos x="0" y="0"/>
                 <wp:positionH relativeFrom="margin">
                   <wp:posOffset>80104</wp:posOffset>
@@ -2218,7 +2219,7 @@
         <mc:AlternateContent>
           <mc:Choice Requires="wpg">
             <w:drawing>
-              <wp:anchor distT="0" distB="0" distL="114300" distR="114300" simplePos="0" relativeHeight="251674624" behindDoc="0" locked="0" layoutInCell="1" allowOverlap="1">
+              <wp:anchor distT="0" distB="0" distL="114300" distR="114300" simplePos="0" relativeHeight="251674624" behindDoc="0" locked="0" layoutInCell="1" allowOverlap="1" wp14:anchorId="48DEC034" wp14:editId="2480616F">
                 <wp:simplePos x="0" y="0"/>
                 <wp:positionH relativeFrom="margin">
                   <wp:posOffset>841312</wp:posOffset>
@@ -2350,7 +2351,7 @@
         <mc:AlternateContent>
           <mc:Choice Requires="wpg">
             <w:drawing>
-              <wp:anchor distT="0" distB="0" distL="114300" distR="114300" simplePos="0" relativeHeight="251672576" behindDoc="0" locked="0" layoutInCell="1" allowOverlap="1">
+              <wp:anchor distT="0" distB="0" distL="114300" distR="114300" simplePos="0" relativeHeight="251672576" behindDoc="0" locked="0" layoutInCell="1" allowOverlap="1" wp14:anchorId="6C26B14B" wp14:editId="236C7F83">
                 <wp:simplePos x="0" y="0"/>
                 <wp:positionH relativeFrom="margin">
                   <wp:posOffset>3272790</wp:posOffset>
@@ -2482,7 +2483,7 @@
         <mc:AlternateContent>
           <mc:Choice Requires="wpg">
             <w:drawing>
-              <wp:anchor distT="0" distB="0" distL="114300" distR="114300" simplePos="0" relativeHeight="251670528" behindDoc="0" locked="0" layoutInCell="1" allowOverlap="1">
+              <wp:anchor distT="0" distB="0" distL="114300" distR="114300" simplePos="0" relativeHeight="251670528" behindDoc="0" locked="0" layoutInCell="1" allowOverlap="1" wp14:anchorId="14648269" wp14:editId="6EEBA400">
                 <wp:simplePos x="0" y="0"/>
                 <wp:positionH relativeFrom="margin">
                   <wp:posOffset>2785745</wp:posOffset>
@@ -2614,7 +2615,7 @@
         <mc:AlternateContent>
           <mc:Choice Requires="wpg">
             <w:drawing>
-              <wp:anchor distT="0" distB="0" distL="114300" distR="114300" simplePos="0" relativeHeight="251668480" behindDoc="0" locked="0" layoutInCell="1" allowOverlap="1">
+              <wp:anchor distT="0" distB="0" distL="114300" distR="114300" simplePos="0" relativeHeight="251668480" behindDoc="0" locked="0" layoutInCell="1" allowOverlap="1" wp14:anchorId="60FF7422" wp14:editId="431717FD">
                 <wp:simplePos x="0" y="0"/>
                 <wp:positionH relativeFrom="margin">
                   <wp:posOffset>1892935</wp:posOffset>
@@ -2746,7 +2747,7 @@
         <mc:AlternateContent>
           <mc:Choice Requires="wpg">
             <w:drawing>
-              <wp:anchor distT="0" distB="0" distL="114300" distR="114300" simplePos="0" relativeHeight="251666432" behindDoc="0" locked="0" layoutInCell="1" allowOverlap="1">
+              <wp:anchor distT="0" distB="0" distL="114300" distR="114300" simplePos="0" relativeHeight="251666432" behindDoc="0" locked="0" layoutInCell="1" allowOverlap="1" wp14:anchorId="6800245E" wp14:editId="688013B8">
                 <wp:simplePos x="0" y="0"/>
                 <wp:positionH relativeFrom="margin">
                   <wp:posOffset>1412875</wp:posOffset>
@@ -2878,7 +2879,7 @@
         <mc:AlternateContent>
           <mc:Choice Requires="wpg">
             <w:drawing>
-              <wp:anchor distT="0" distB="0" distL="114300" distR="114300" simplePos="0" relativeHeight="251664384" behindDoc="0" locked="0" layoutInCell="1" allowOverlap="1">
+              <wp:anchor distT="0" distB="0" distL="114300" distR="114300" simplePos="0" relativeHeight="251664384" behindDoc="0" locked="0" layoutInCell="1" allowOverlap="1" wp14:anchorId="1481776D" wp14:editId="45CF548F">
                 <wp:simplePos x="0" y="0"/>
                 <wp:positionH relativeFrom="margin">
                   <wp:posOffset>874395</wp:posOffset>
@@ -3010,7 +3011,7 @@
         <mc:AlternateContent>
           <mc:Choice Requires="wpg">
             <w:drawing>
-              <wp:anchor distT="0" distB="0" distL="114300" distR="114300" simplePos="0" relativeHeight="251662336" behindDoc="0" locked="0" layoutInCell="1" allowOverlap="1">
+              <wp:anchor distT="0" distB="0" distL="114300" distR="114300" simplePos="0" relativeHeight="251662336" behindDoc="0" locked="0" layoutInCell="1" allowOverlap="1" wp14:anchorId="3DEBC21F" wp14:editId="188306BE">
                 <wp:simplePos x="0" y="0"/>
                 <wp:positionH relativeFrom="margin">
                   <wp:posOffset>145415</wp:posOffset>
@@ -3142,7 +3143,7 @@
         <mc:AlternateContent>
           <mc:Choice Requires="wpg">
             <w:drawing>
-              <wp:anchor distT="0" distB="0" distL="114300" distR="114300" simplePos="0" relativeHeight="251659264" behindDoc="0" locked="0" layoutInCell="1" allowOverlap="1">
+              <wp:anchor distT="0" distB="0" distL="114300" distR="114300" simplePos="0" relativeHeight="251659264" behindDoc="0" locked="0" layoutInCell="1" allowOverlap="1" wp14:anchorId="75A65494" wp14:editId="09079C64">
                 <wp:simplePos x="0" y="0"/>
                 <wp:positionH relativeFrom="margin">
                   <wp:posOffset>537845</wp:posOffset>
@@ -3271,9 +3272,7 @@
     <w:p>
       <w:pPr>
         <w:pStyle w:val="Titel"/>
-        <w:rPr>
-          <w:ins w:id="1" w:author="Imke Endjer" w:date="2022-12-13T10:02:00Z"/>
-        </w:rPr>
+        <w:jc w:val="both"/>
       </w:pPr>
       <w:r>
         <w:lastRenderedPageBreak/>
@@ -3283,48 +3282,10 @@
     <w:p>
       <w:pPr>
         <w:jc w:val="both"/>
-        <w:pPrChange w:id="2" w:author="Imke Endjer" w:date="2023-01-27T13:25:00Z">
-          <w:pPr/>
-        </w:pPrChange>
-      </w:pPr>
-      <w:ins w:id="3" w:author="Imke Endjer" w:date="2022-12-13T10:02:00Z">
-        <w:r>
-          <w:t>Das Wimmel</w:t>
-        </w:r>
-      </w:ins>
-      <w:ins w:id="4" w:author="Imke Endjer" w:date="2022-12-13T10:03:00Z">
-        <w:r>
-          <w:t xml:space="preserve">bild zeigt viele verschiedene Situationen, die von den Schülerinnen und Schülern als KI </w:t>
-        </w:r>
-      </w:ins>
-      <w:ins w:id="5" w:author="Imke Endjer" w:date="2022-12-13T10:04:00Z">
-        <w:r>
-          <w:t>klassifiziert werden könnten</w:t>
-        </w:r>
-      </w:ins>
-      <w:ins w:id="6" w:author="imke.endjer@uni-oldenburg.de" w:date="2023-01-27T11:56:00Z">
-        <w:r>
-          <w:t>.</w:t>
-        </w:r>
-      </w:ins>
-      <w:ins w:id="7" w:author="Imke Endjer" w:date="2022-12-13T10:04:00Z">
-        <w:del w:id="8" w:author="imke.endjer@uni-oldenburg.de" w:date="2023-01-27T11:56:00Z">
-          <w:r>
-            <w:delText>,</w:delText>
-          </w:r>
-        </w:del>
-        <w:r>
-          <w:t xml:space="preserve"> Hierbei kann es durchaus passieren, dass die Schülerinnen und Schüler Situationen als KI identifi</w:t>
-        </w:r>
-      </w:ins>
-      <w:ins w:id="9" w:author="Imke Endjer" w:date="2022-12-13T10:05:00Z">
-        <w:r>
-          <w:t>zieren, die gar keine sind oder bspw. ni</w:t>
-        </w:r>
-        <w:r>
-          <w:t xml:space="preserve">cht in dieser folgenden Liste auftauchen. </w:t>
-        </w:r>
-      </w:ins>
+      </w:pPr>
+      <w:r>
+        <w:t xml:space="preserve">Das Wimmelbild zeigt viele verschiedene Situationen, die von den Schülerinnen und Schülern als KI klassifiziert werden könnten. Hierbei kann es durchaus passieren, dass die Schülerinnen und Schüler Situationen als KI identifizieren, die gar keine sind oder bspw. nicht in dieser folgenden Liste auftauchen. </w:t>
+      </w:r>
     </w:p>
     <w:tbl>
       <w:tblPr>
@@ -3374,6 +3335,7 @@
                 <w:right w:val="none" w:sz="4" w:space="0" w:color="000000"/>
               </w:pBdr>
               <w:spacing w:line="252" w:lineRule="atLeast"/>
+              <w:jc w:val="both"/>
             </w:pPr>
             <w:r>
               <w:rPr>
@@ -3412,6 +3374,7 @@
                 <w:right w:val="none" w:sz="4" w:space="0" w:color="000000"/>
               </w:pBdr>
               <w:spacing w:line="252" w:lineRule="atLeast"/>
+              <w:jc w:val="both"/>
             </w:pPr>
             <w:r>
               <w:rPr>
@@ -3448,6 +3411,7 @@
                 <w:right w:val="none" w:sz="4" w:space="0" w:color="000000"/>
               </w:pBdr>
               <w:spacing w:line="252" w:lineRule="atLeast"/>
+              <w:jc w:val="both"/>
             </w:pPr>
             <w:r>
               <w:rPr>
@@ -3465,18 +3429,13 @@
                 <w:right w:val="none" w:sz="4" w:space="0" w:color="000000"/>
               </w:pBdr>
               <w:spacing w:line="252" w:lineRule="atLeast"/>
+              <w:jc w:val="both"/>
             </w:pPr>
             <w:r>
               <w:rPr>
                 <w:color w:val="000000"/>
               </w:rPr>
-              <w:t>Eine Überwachungskamera ist in erster Linie kein Beispiel für künstliche Intelligenz. Jedoch könnte hinter einem Überwachungssystem</w:t>
-            </w:r>
-            <w:r>
-              <w:rPr>
-                <w:color w:val="000000"/>
-              </w:rPr>
-              <w:t xml:space="preserve"> künstliche Intelligenz stecken, die beispielsweise einen Ladendiebstahl erkennt. Zudem gibt es auch Überwachungskameras, die mithilfe von künstlicher Intelligenz unter anderem Funktionen für die Gesichtserkennung oder Abstandsmessung integriert haben.</w:t>
+              <w:t>Eine Überwachungskamera ist in erster Linie kein Beispiel für künstliche Intelligenz. Jedoch könnte hinter einem Überwachungssystem künstliche Intelligenz stecken, die beispielsweise einen Ladendiebstahl erkennt. Zudem gibt es auch Überwachungskameras, die mithilfe von künstlicher Intelligenz unter anderem Funktionen für die Gesichtserkennung oder Abstandsmessung integriert haben.</w:t>
             </w:r>
           </w:p>
           <w:p>
@@ -3492,19 +3451,14 @@
                 <w:right w:val="none" w:sz="4" w:space="0" w:color="000000"/>
               </w:pBdr>
               <w:spacing w:before="120" w:line="252" w:lineRule="atLeast"/>
+              <w:jc w:val="both"/>
             </w:pPr>
             <w:hyperlink r:id="rId20" w:tooltip="https://www.sicherheit.info/deep-learning-ki-funktionen-fuer-ueberwachungskameras" w:history="1">
               <w:r>
                 <w:rPr>
                   <w:rStyle w:val="Hyperlink"/>
                 </w:rPr>
-                <w:t>https://www.sicherheit.info/deep-learning-ki-funktionen-fuer-ueberwachungs</w:t>
-              </w:r>
-              <w:r>
-                <w:rPr>
-                  <w:rStyle w:val="Hyperlink"/>
-                </w:rPr>
-                <w:t>kameras</w:t>
+                <w:t>https://www.sicherheit.info/deep-learning-ki-funktionen-fuer-ueberwachungskameras</w:t>
               </w:r>
             </w:hyperlink>
           </w:p>
@@ -3521,6 +3475,7 @@
                 <w:right w:val="none" w:sz="4" w:space="0" w:color="000000"/>
               </w:pBdr>
               <w:spacing w:before="120" w:line="252" w:lineRule="atLeast"/>
+              <w:jc w:val="both"/>
             </w:pPr>
             <w:hyperlink r:id="rId21" w:tooltip="https://business.panasonic.de/sicherheitslosungen/analytische-videouberwachung-auf-basis-von-kunstlicher-intelligenz-ki" w:history="1">
               <w:r>
@@ -3565,6 +3520,7 @@
                 <w:right w:val="none" w:sz="4" w:space="0" w:color="000000"/>
               </w:pBdr>
               <w:spacing w:line="252" w:lineRule="atLeast"/>
+              <w:jc w:val="both"/>
             </w:pPr>
             <w:r>
               <w:rPr>
@@ -3600,6 +3556,7 @@
                 <w:right w:val="none" w:sz="4" w:space="0" w:color="000000"/>
               </w:pBdr>
               <w:spacing w:line="252" w:lineRule="atLeast"/>
+              <w:jc w:val="both"/>
               <w:rPr>
                 <w:color w:val="000000"/>
               </w:rPr>
@@ -3620,6 +3577,7 @@
                 <w:right w:val="none" w:sz="4" w:space="0" w:color="000000"/>
               </w:pBdr>
               <w:spacing w:line="252" w:lineRule="atLeast"/>
+              <w:jc w:val="both"/>
               <w:rPr>
                 <w:color w:val="000000"/>
               </w:rPr>
@@ -3628,13 +3586,7 @@
               <w:rPr>
                 <w:color w:val="000000"/>
               </w:rPr>
-              <w:t>Ein Leergutautomat ist in erster Linie kein Bei</w:t>
-            </w:r>
-            <w:r>
-              <w:rPr>
-                <w:color w:val="000000"/>
-              </w:rPr>
-              <w:t xml:space="preserve">spiel für künstliche Intelligenz. Er verfügt zum Beispiel über einen Laserscanner zum Lesen von dem Strichcode und Pfandsymbol, einem Gewichtssensor und einer Kamera. Dabei erkennt der Leergutautomat mithilfe der Kamera, um welche Flasche es sich handelt: </w:t>
+              <w:t xml:space="preserve">Ein Leergutautomat ist in erster Linie kein Beispiel für künstliche Intelligenz. Er verfügt zum Beispiel über einen Laserscanner zum Lesen von dem Strichcode und Pfandsymbol, einem Gewichtssensor und einer Kamera. Dabei erkennt der Leergutautomat mithilfe der Kamera, um welche Flasche es sich handelt: </w:t>
             </w:r>
             <w:proofErr w:type="spellStart"/>
             <w:r>
@@ -3660,6 +3612,7 @@
                 <w:right w:val="none" w:sz="4" w:space="0" w:color="000000"/>
               </w:pBdr>
               <w:spacing w:line="252" w:lineRule="atLeast"/>
+              <w:jc w:val="both"/>
             </w:pPr>
           </w:p>
           <w:p>
@@ -3671,6 +3624,7 @@
                 <w:right w:val="none" w:sz="4" w:space="0" w:color="000000"/>
               </w:pBdr>
               <w:spacing w:line="252" w:lineRule="atLeast"/>
+              <w:jc w:val="both"/>
               <w:rPr>
                 <w:color w:val="000000"/>
               </w:rPr>
@@ -3696,6 +3650,7 @@
                 <w:right w:val="none" w:sz="4" w:space="0" w:color="000000"/>
               </w:pBdr>
               <w:spacing w:line="252" w:lineRule="atLeast"/>
+              <w:jc w:val="both"/>
               <w:rPr>
                 <w:rStyle w:val="Hyperlink"/>
                 <w:color w:val="auto"/>
@@ -3724,19 +3679,14 @@
                 <w:right w:val="none" w:sz="4" w:space="0" w:color="000000"/>
               </w:pBdr>
               <w:spacing w:before="0" w:after="0" w:line="252" w:lineRule="atLeast"/>
+              <w:jc w:val="both"/>
             </w:pPr>
             <w:hyperlink r:id="rId23" w:tooltip="https://www.all-electronics.de/automatisierung/mit-anderen-augen.html" w:history="1">
               <w:r>
                 <w:rPr>
                   <w:rStyle w:val="Hyperlink"/>
                 </w:rPr>
-                <w:t>https://www.all-electronics</w:t>
-              </w:r>
-              <w:r>
-                <w:rPr>
-                  <w:rStyle w:val="Hyperlink"/>
-                </w:rPr>
-                <w:t>.de/automatisierung/mit-anderen-augen.html</w:t>
+                <w:t>https://www.all-electronics.de/automatisierung/mit-anderen-augen.html</w:t>
               </w:r>
             </w:hyperlink>
             <w:r>
@@ -3757,6 +3707,7 @@
                 <w:right w:val="none" w:sz="4" w:space="0" w:color="000000"/>
               </w:pBdr>
               <w:spacing w:line="252" w:lineRule="atLeast"/>
+              <w:jc w:val="both"/>
             </w:pPr>
             <w:hyperlink r:id="rId24" w:tooltip="https://eu-recycling.com/Archive/31120" w:history="1">
               <w:r>
@@ -3796,6 +3747,7 @@
                 <w:right w:val="none" w:sz="4" w:space="0" w:color="000000"/>
               </w:pBdr>
               <w:spacing w:line="252" w:lineRule="atLeast"/>
+              <w:jc w:val="both"/>
             </w:pPr>
             <w:r>
               <w:rPr>
@@ -3832,6 +3784,7 @@
                 <w:right w:val="none" w:sz="4" w:space="0" w:color="000000"/>
               </w:pBdr>
               <w:spacing w:line="252" w:lineRule="atLeast"/>
+              <w:jc w:val="both"/>
             </w:pPr>
             <w:r>
               <w:rPr>
@@ -3849,6 +3802,7 @@
                 <w:right w:val="none" w:sz="4" w:space="0" w:color="000000"/>
               </w:pBdr>
               <w:spacing w:line="252" w:lineRule="atLeast"/>
+              <w:jc w:val="both"/>
               <w:rPr>
                 <w:color w:val="000000"/>
               </w:rPr>
@@ -3857,13 +3811,7 @@
               <w:rPr>
                 <w:color w:val="000000"/>
               </w:rPr>
-              <w:t xml:space="preserve">In den frühen Selbstbedienungskassen steckte noch keine künstliche Intelligenz. Jedoch werden die Selbstbedienungskassen fortlaufend weiterentwickelt. Dabei steckt künstliche Intelligenz bspw. in der Erkennung von Obst und Gemüse. So entfällt die manuelle </w:t>
-            </w:r>
-            <w:r>
-              <w:rPr>
-                <w:color w:val="000000"/>
-              </w:rPr>
-              <w:t xml:space="preserve">Auswahl aus dem Produktkatalog und eine Falschetikettierung wird verhindert. Unter dieser Annahme ist eine SB-Kasse durchaus als KI-System zu begreifen. </w:t>
+              <w:t xml:space="preserve">In den frühen Selbstbedienungskassen steckte noch keine künstliche Intelligenz. Jedoch werden die Selbstbedienungskassen fortlaufend weiterentwickelt. Dabei steckt künstliche Intelligenz bspw. in der Erkennung von Obst und Gemüse. So entfällt die manuelle Auswahl aus dem Produktkatalog und eine Falschetikettierung wird verhindert. Unter dieser Annahme ist eine SB-Kasse durchaus als KI-System zu begreifen. </w:t>
             </w:r>
           </w:p>
           <w:p>
@@ -3880,6 +3828,7 @@
                 <w:right w:val="none" w:sz="4" w:space="0" w:color="000000"/>
               </w:pBdr>
               <w:spacing w:line="252" w:lineRule="atLeast"/>
+              <w:jc w:val="both"/>
             </w:pPr>
             <w:hyperlink r:id="rId25" w:tooltip="https://de.wikipedia.org/wiki/Selbstbedienungskasse" w:history="1">
               <w:r>
@@ -3903,6 +3852,7 @@
                 <w:right w:val="none" w:sz="4" w:space="0" w:color="000000"/>
               </w:pBdr>
               <w:spacing w:before="120" w:line="252" w:lineRule="atLeast"/>
+              <w:jc w:val="both"/>
             </w:pPr>
             <w:hyperlink r:id="rId26" w:tooltip="https://www.ncr-news.de/2018/01/30/20-jahre-self-checkout-ncr-macht-selbstbedienungskassen-intelligent/" w:history="1">
               <w:r>
@@ -3947,6 +3897,7 @@
                 <w:right w:val="none" w:sz="4" w:space="0" w:color="000000"/>
               </w:pBdr>
               <w:spacing w:line="252" w:lineRule="atLeast"/>
+              <w:jc w:val="both"/>
             </w:pPr>
             <w:r>
               <w:rPr>
@@ -3982,6 +3933,7 @@
                 <w:right w:val="none" w:sz="4" w:space="0" w:color="000000"/>
               </w:pBdr>
               <w:spacing w:line="252" w:lineRule="atLeast"/>
+              <w:jc w:val="both"/>
             </w:pPr>
             <w:r>
               <w:rPr>
@@ -3999,6 +3951,7 @@
                 <w:right w:val="none" w:sz="4" w:space="0" w:color="000000"/>
               </w:pBdr>
               <w:spacing w:line="252" w:lineRule="atLeast"/>
+              <w:jc w:val="both"/>
               <w:rPr>
                 <w:color w:val="000000"/>
               </w:rPr>
@@ -4007,19 +3960,7 @@
               <w:rPr>
                 <w:color w:val="000000"/>
               </w:rPr>
-              <w:t>Transportbänder werden in der Logistik verwendet, um Waren zu transpor</w:t>
-            </w:r>
-            <w:r>
-              <w:rPr>
-                <w:color w:val="000000"/>
-              </w:rPr>
-              <w:t>tieren. Mit Hilfe von Sensoren, wie z.B. Lichtschranken oder Kameras, kann der Warentransport automatisiert werden. Diesbezüglich ist ein Warentransportband (so wie im Supermarkt) in erster Linie kein Beispiel für künstliche Intelligenz. In der Industrie k</w:t>
-            </w:r>
-            <w:r>
-              <w:rPr>
-                <w:color w:val="000000"/>
-              </w:rPr>
-              <w:t>ommen jedoch technisch anspruchsvollere Systeme zum Einsatz, die mittels KI automatisch Pakete erkennen und organisieren können:</w:t>
+              <w:t>Transportbänder werden in der Logistik verwendet, um Waren zu transportieren. Mit Hilfe von Sensoren, wie z.B. Lichtschranken oder Kameras, kann der Warentransport automatisiert werden. Diesbezüglich ist ein Warentransportband (so wie im Supermarkt) in erster Linie kein Beispiel für künstliche Intelligenz. In der Industrie kommen jedoch technisch anspruchsvollere Systeme zum Einsatz, die mittels KI automatisch Pakete erkennen und organisieren können:</w:t>
             </w:r>
           </w:p>
           <w:p>
@@ -4036,6 +3977,7 @@
                 <w:right w:val="none" w:sz="4" w:space="0" w:color="000000"/>
               </w:pBdr>
               <w:spacing w:before="0" w:after="0" w:line="252" w:lineRule="atLeast"/>
+              <w:jc w:val="both"/>
               <w:rPr>
                 <w:b/>
               </w:rPr>
@@ -4069,6 +4011,7 @@
                 <w:right w:val="none" w:sz="4" w:space="0" w:color="000000"/>
               </w:pBdr>
               <w:spacing w:before="0" w:after="0" w:line="252" w:lineRule="atLeast"/>
+              <w:jc w:val="both"/>
               <w:rPr>
                 <w:bCs w:val="0"/>
               </w:rPr>
@@ -4103,15 +4046,9 @@
                 <w:right w:val="none" w:sz="4" w:space="0" w:color="000000"/>
               </w:pBdr>
               <w:spacing w:before="0" w:after="0" w:line="252" w:lineRule="atLeast"/>
+              <w:jc w:val="both"/>
               <w:rPr>
-                <w:ins w:id="10" w:author="Imke Endjer" w:date="2023-01-27T13:22:00Z"/>
                 <w:b/>
-                <w:rPrChange w:id="11" w:author="Imke Endjer" w:date="2023-01-27T13:22:00Z">
-                  <w:rPr>
-                    <w:ins w:id="12" w:author="Imke Endjer" w:date="2023-01-27T13:22:00Z"/>
-                    <w:color w:val="000000"/>
-                  </w:rPr>
-                </w:rPrChange>
               </w:rPr>
             </w:pPr>
             <w:hyperlink r:id="rId29" w:tooltip="https://www.maschinenmarkt.vogel.de/sensoren-mit-integrierter-ki-a-814929/" w:history="1">
@@ -4138,8 +4075,8 @@
                 <w:right w:val="none" w:sz="4" w:space="0" w:color="000000"/>
               </w:pBdr>
               <w:spacing w:line="252" w:lineRule="atLeast"/>
+              <w:jc w:val="both"/>
               <w:rPr>
-                <w:ins w:id="13" w:author="Imke Endjer" w:date="2023-01-27T13:23:00Z"/>
                 <w:b/>
               </w:rPr>
             </w:pPr>
@@ -4153,28 +4090,10 @@
                 <w:right w:val="none" w:sz="4" w:space="0" w:color="000000"/>
               </w:pBdr>
               <w:spacing w:line="252" w:lineRule="atLeast"/>
+              <w:jc w:val="both"/>
               <w:rPr>
                 <w:b/>
-                <w:rPrChange w:id="14" w:author="Imke Endjer" w:date="2023-01-27T13:22:00Z">
-                  <w:rPr/>
-                </w:rPrChange>
               </w:rPr>
-              <w:pPrChange w:id="15" w:author="Imke Endjer" w:date="2023-01-27T13:22:00Z">
-                <w:pPr>
-                  <w:pStyle w:val="Listenabsatz"/>
-                  <w:numPr>
-                    <w:numId w:val="13"/>
-                  </w:numPr>
-                  <w:pBdr>
-                    <w:top w:val="none" w:sz="4" w:space="0" w:color="000000"/>
-                    <w:left w:val="none" w:sz="4" w:space="0" w:color="000000"/>
-                    <w:bottom w:val="none" w:sz="4" w:space="0" w:color="000000"/>
-                    <w:right w:val="none" w:sz="4" w:space="0" w:color="000000"/>
-                  </w:pBdr>
-                  <w:spacing w:before="0" w:after="0" w:line="252" w:lineRule="atLeast"/>
-                  <w:ind w:hanging="360"/>
-                </w:pPr>
-              </w:pPrChange>
             </w:pPr>
           </w:p>
         </w:tc>
@@ -4205,6 +4124,7 @@
                 <w:right w:val="none" w:sz="4" w:space="0" w:color="000000"/>
               </w:pBdr>
               <w:spacing w:line="252" w:lineRule="atLeast"/>
+              <w:jc w:val="both"/>
             </w:pPr>
             <w:r>
               <w:rPr>
@@ -4241,6 +4161,7 @@
                 <w:right w:val="none" w:sz="4" w:space="0" w:color="000000"/>
               </w:pBdr>
               <w:spacing w:line="252" w:lineRule="atLeast"/>
+              <w:jc w:val="both"/>
             </w:pPr>
             <w:r>
               <w:rPr>
@@ -4258,24 +4179,13 @@
                 <w:right w:val="none" w:sz="4" w:space="0" w:color="000000"/>
               </w:pBdr>
               <w:spacing w:line="252" w:lineRule="atLeast"/>
+              <w:jc w:val="both"/>
             </w:pPr>
             <w:r>
               <w:rPr>
                 <w:color w:val="000000"/>
               </w:rPr>
-              <w:t>Es gibt einige versch</w:t>
-            </w:r>
-            <w:r>
-              <w:rPr>
-                <w:color w:val="000000"/>
-              </w:rPr>
-              <w:t>iedene Arten und Modelle von Registrierkassen. Ihre Aufgabe ist es, bspw. den Preis und die Produktbezeichnung eines eingescannten Artikels auf einen Kassenbon zu drucken, das Ausrechnen des Wechselgeldes oder bargeldloses Bezahlen mithilfe eines Kartenter</w:t>
-            </w:r>
-            <w:r>
-              <w:rPr>
-                <w:color w:val="000000"/>
-              </w:rPr>
-              <w:t>minals zu ermöglichen. Diesbezüglich sind Registrierkassen kein Beispiel für künstliche Intelligenz. Dennoch könnte bspw. eine künstlich intelligente Videoüberwachung im Kassenbereich Diebstahl oder Fehler frühzeitig zu erkennen. (Siehe Überwachungskamera)</w:t>
+              <w:t>Es gibt einige verschiedene Arten und Modelle von Registrierkassen. Ihre Aufgabe ist es, bspw. den Preis und die Produktbezeichnung eines eingescannten Artikels auf einen Kassenbon zu drucken, das Ausrechnen des Wechselgeldes oder bargeldloses Bezahlen mithilfe eines Kartenterminals zu ermöglichen. Diesbezüglich sind Registrierkassen kein Beispiel für künstliche Intelligenz. Dennoch könnte bspw. eine künstlich intelligente Videoüberwachung im Kassenbereich Diebstahl oder Fehler frühzeitig zu erkennen. (Siehe Überwachungskamera)</w:t>
             </w:r>
           </w:p>
           <w:p>
@@ -4291,6 +4201,7 @@
                 <w:right w:val="none" w:sz="4" w:space="0" w:color="000000"/>
               </w:pBdr>
               <w:spacing w:before="120" w:line="252" w:lineRule="atLeast"/>
+              <w:jc w:val="both"/>
             </w:pPr>
             <w:hyperlink r:id="rId30" w:tooltip="https://de.wikipedia.org/wiki/Registrierkasse" w:history="1">
               <w:r>
@@ -4314,19 +4225,14 @@
                 <w:right w:val="none" w:sz="4" w:space="0" w:color="000000"/>
               </w:pBdr>
               <w:spacing w:before="120" w:line="252" w:lineRule="atLeast"/>
+              <w:jc w:val="both"/>
             </w:pPr>
             <w:hyperlink r:id="rId31" w:tooltip="https://digitaleweltmagazin.de/2018/06/20/5-beispiele-wie-der-einzelhandel-von-kuenstlicher-intelligenz-profitiert/" w:history="1">
               <w:r>
                 <w:rPr>
                   <w:rStyle w:val="Hyperlink"/>
                 </w:rPr>
-                <w:t>https://digitaleweltmagazin.de/2018/06/20/5-beispiele-wie-der-einzelhandel-von-kuenstlicher-intelli</w:t>
-              </w:r>
-              <w:r>
-                <w:rPr>
-                  <w:rStyle w:val="Hyperlink"/>
-                </w:rPr>
-                <w:t>genz-profitiert/</w:t>
+                <w:t>https://digitaleweltmagazin.de/2018/06/20/5-beispiele-wie-der-einzelhandel-von-kuenstlicher-intelligenz-profitiert/</w:t>
               </w:r>
             </w:hyperlink>
             <w:r>
@@ -4365,6 +4271,7 @@
                 <w:right w:val="none" w:sz="4" w:space="0" w:color="000000"/>
               </w:pBdr>
               <w:spacing w:line="252" w:lineRule="atLeast"/>
+              <w:jc w:val="both"/>
             </w:pPr>
             <w:r>
               <w:rPr>
@@ -4401,6 +4308,7 @@
                 <w:right w:val="none" w:sz="4" w:space="0" w:color="000000"/>
               </w:pBdr>
               <w:spacing w:line="252" w:lineRule="atLeast"/>
+              <w:jc w:val="both"/>
             </w:pPr>
             <w:r>
               <w:rPr>
@@ -4418,6 +4326,7 @@
                 <w:right w:val="none" w:sz="4" w:space="0" w:color="000000"/>
               </w:pBdr>
               <w:spacing w:line="252" w:lineRule="atLeast"/>
+              <w:jc w:val="both"/>
             </w:pPr>
             <w:r>
               <w:t>Es gibt stationäre und mobile Geräte, die Kartenzahlung in Geschäften ermöglicht.</w:t>
@@ -4432,6 +4341,7 @@
                 <w:right w:val="none" w:sz="4" w:space="0" w:color="000000"/>
               </w:pBdr>
               <w:spacing w:line="252" w:lineRule="atLeast"/>
+              <w:jc w:val="both"/>
             </w:pPr>
             <w:r>
               <w:t xml:space="preserve">Primär steckt hinter der Kartenzahlung keine künstliche Intelligenz. Mit der Eingabe der Pin oder einer Unterschrift bestätigten die Kartenbesitzenden, dass das Geld von ihrem Konto abgezogen werden kann. </w:t>
@@ -4446,12 +4356,10 @@
                 <w:right w:val="none" w:sz="4" w:space="0" w:color="000000"/>
               </w:pBdr>
               <w:spacing w:line="252" w:lineRule="atLeast"/>
+              <w:jc w:val="both"/>
             </w:pPr>
             <w:r>
-              <w:t>Dennoch kann und wird teilweise künstliche Intelli</w:t>
-            </w:r>
-            <w:r>
-              <w:t>genz bei der Sicherheit im Zahlungsverkehr und bei der Analyse von Daten in Bankenprozessen eingesetzt. Darüber hinaus könnte in Zukunft Kartenzahlung bzw. das bargeldlose Bezahlen mit der Stimme autorisiert werden, dass künstliche Intelligenz erfordert.</w:t>
+              <w:t>Dennoch kann und wird teilweise künstliche Intelligenz bei der Sicherheit im Zahlungsverkehr und bei der Analyse von Daten in Bankenprozessen eingesetzt. Darüber hinaus könnte in Zukunft Kartenzahlung bzw. das bargeldlose Bezahlen mit der Stimme autorisiert werden, dass künstliche Intelligenz erfordert.</w:t>
             </w:r>
           </w:p>
           <w:p>
@@ -4467,6 +4375,7 @@
                 <w:right w:val="none" w:sz="4" w:space="0" w:color="000000"/>
               </w:pBdr>
               <w:spacing w:before="120" w:line="252" w:lineRule="atLeast"/>
+              <w:jc w:val="both"/>
             </w:pPr>
             <w:hyperlink r:id="rId32" w:tooltip="https://www.techfacts.de/ratgeber/wie-funktioniert-kartenzahlung/" w:history="1">
               <w:r>
@@ -4490,6 +4399,7 @@
                 <w:right w:val="none" w:sz="4" w:space="0" w:color="000000"/>
               </w:pBdr>
               <w:spacing w:before="120" w:line="252" w:lineRule="atLeast"/>
+              <w:jc w:val="both"/>
             </w:pPr>
             <w:hyperlink r:id="rId33" w:tooltip="https://www.geldinstitute.de/callcenter4finance/2019/05/_kuenstliche_intelligenzkiwirddiesicherheitbeimcashlesspaymentwe.html" w:history="1">
               <w:r>
@@ -4534,6 +4444,7 @@
                 <w:right w:val="none" w:sz="4" w:space="0" w:color="000000"/>
               </w:pBdr>
               <w:spacing w:line="252" w:lineRule="atLeast"/>
+              <w:jc w:val="both"/>
             </w:pPr>
             <w:r>
               <w:rPr>
@@ -4569,6 +4480,7 @@
                 <w:right w:val="none" w:sz="4" w:space="0" w:color="000000"/>
               </w:pBdr>
               <w:spacing w:line="252" w:lineRule="atLeast"/>
+              <w:jc w:val="both"/>
             </w:pPr>
             <w:r>
               <w:rPr>
@@ -4586,24 +4498,13 @@
                 <w:right w:val="none" w:sz="4" w:space="0" w:color="000000"/>
               </w:pBdr>
               <w:spacing w:line="252" w:lineRule="atLeast"/>
+              <w:jc w:val="both"/>
             </w:pPr>
             <w:r>
               <w:rPr>
                 <w:color w:val="000000"/>
               </w:rPr>
-              <w:t>Ein reiner Lautsprecher erfordert keine künstliche Intelligenz, um akustische Signale zu erzeugen</w:t>
-            </w:r>
-            <w:r>
-              <w:rPr>
-                <w:color w:val="000000"/>
-              </w:rPr>
-              <w:t xml:space="preserve"> und ist deshalb kein Beispiel für eine künstliche Intelligenz. Handelt es sich allerdings bei dem Lautsprecher um ein Sprachassistenzsystem, wird künstliche Intelligenz bspw. für die Spracherkennung und Sprachsynthese benötigt. (Siehe Sprachassistenzsyste</w:t>
-            </w:r>
-            <w:r>
-              <w:rPr>
-                <w:color w:val="000000"/>
-              </w:rPr>
-              <w:t>me)</w:t>
+              <w:t>Ein reiner Lautsprecher erfordert keine künstliche Intelligenz, um akustische Signale zu erzeugen und ist deshalb kein Beispiel für eine künstliche Intelligenz. Handelt es sich allerdings bei dem Lautsprecher um ein Sprachassistenzsystem, wird künstliche Intelligenz bspw. für die Spracherkennung und Sprachsynthese benötigt. (Siehe Sprachassistenzsysteme)</w:t>
             </w:r>
           </w:p>
           <w:p>
@@ -4619,6 +4520,7 @@
                 <w:right w:val="none" w:sz="4" w:space="0" w:color="000000"/>
               </w:pBdr>
               <w:spacing w:before="120" w:line="252" w:lineRule="atLeast"/>
+              <w:jc w:val="both"/>
             </w:pPr>
             <w:hyperlink r:id="rId34" w:tooltip="https://de.wikipedia.org/wiki/Lautsprecher" w:history="1">
               <w:r>
@@ -4658,6 +4560,7 @@
                 <w:right w:val="none" w:sz="4" w:space="0" w:color="000000"/>
               </w:pBdr>
               <w:spacing w:line="252" w:lineRule="atLeast"/>
+              <w:jc w:val="both"/>
             </w:pPr>
             <w:r>
               <w:rPr>
@@ -4696,6 +4599,7 @@
                 <w:right w:val="none" w:sz="4" w:space="0" w:color="000000"/>
               </w:pBdr>
               <w:spacing w:line="252" w:lineRule="atLeast"/>
+              <w:jc w:val="both"/>
               <w:rPr>
                 <w:b/>
                 <w:color w:val="000000"/>
@@ -4736,6 +4640,7 @@
                 <w:right w:val="none" w:sz="4" w:space="0" w:color="000000"/>
               </w:pBdr>
               <w:spacing w:line="252" w:lineRule="atLeast"/>
+              <w:jc w:val="both"/>
               <w:rPr>
                 <w:color w:val="000000" w:themeColor="text1"/>
               </w:rPr>
@@ -4756,6 +4661,7 @@
                 <w:right w:val="none" w:sz="4" w:space="0" w:color="000000"/>
               </w:pBdr>
               <w:spacing w:line="252" w:lineRule="atLeast"/>
+              <w:jc w:val="both"/>
               <w:rPr>
                 <w:color w:val="000000"/>
               </w:rPr>
@@ -4764,13 +4670,7 @@
               <w:rPr>
                 <w:color w:val="000000"/>
               </w:rPr>
-              <w:t>Sprachassistenzsysteme, wie das auf dem Plakat beworben,</w:t>
-            </w:r>
-            <w:r>
-              <w:rPr>
-                <w:color w:val="000000"/>
-              </w:rPr>
-              <w:t xml:space="preserve"> sind ein klares Beispiel für künstliche Intelligenz (siehe Zusatzmaterial KI-B1.1.1 Erklärung zu Concept Cartoons)</w:t>
+              <w:t>Sprachassistenzsysteme, wie das auf dem Plakat beworben, sind ein klares Beispiel für künstliche Intelligenz (siehe Zusatzmaterial KI-B1.1.1 Erklärung zu Concept Cartoons)</w:t>
             </w:r>
           </w:p>
         </w:tc>
@@ -4802,6 +4702,7 @@
                 <w:right w:val="none" w:sz="4" w:space="0" w:color="000000"/>
               </w:pBdr>
               <w:spacing w:line="252" w:lineRule="atLeast"/>
+              <w:jc w:val="both"/>
               <w:rPr>
                 <w:b/>
                 <w:color w:val="000000"/>
@@ -4842,6 +4743,7 @@
                 <w:right w:val="none" w:sz="4" w:space="0" w:color="000000"/>
               </w:pBdr>
               <w:spacing w:line="252" w:lineRule="atLeast"/>
+              <w:jc w:val="both"/>
               <w:rPr>
                 <w:color w:val="000000"/>
               </w:rPr>
@@ -4862,18 +4764,13 @@
                 <w:right w:val="none" w:sz="4" w:space="0" w:color="000000"/>
               </w:pBdr>
               <w:spacing w:line="252" w:lineRule="atLeast"/>
+              <w:jc w:val="both"/>
             </w:pPr>
             <w:r>
               <w:rPr>
                 <w:color w:val="000000"/>
               </w:rPr>
-              <w:t>Ein Selfie-Filter ist ein Beispiel für künstliche Intelligenz, die bspw. bei der Gesichtserkennung und der Platzierung des</w:t>
-            </w:r>
-            <w:r>
-              <w:rPr>
-                <w:color w:val="000000"/>
-              </w:rPr>
-              <w:t xml:space="preserve"> Filters auf dem Gesicht zum Einsatz kommt (Siehe Zusatzmaterial KI-B1.1.1 Erklärung zu Concept Cartoons). Selfie-Filter oder Foto-Filter gibt es in vielen verschiedenen Apps und auf </w:t>
+              <w:t xml:space="preserve">Ein Selfie-Filter ist ein Beispiel für künstliche Intelligenz, die bspw. bei der Gesichtserkennung und der Platzierung des Filters auf dem Gesicht zum Einsatz kommt (Siehe Zusatzmaterial KI-B1.1.1 Erklärung zu Concept Cartoons). Selfie-Filter oder Foto-Filter gibt es in vielen verschiedenen Apps und auf </w:t>
             </w:r>
             <w:proofErr w:type="spellStart"/>
             <w:r>
@@ -4904,6 +4801,7 @@
                 <w:right w:val="none" w:sz="4" w:space="0" w:color="000000"/>
               </w:pBdr>
               <w:spacing w:after="0" w:line="252" w:lineRule="atLeast"/>
+              <w:jc w:val="both"/>
               <w:rPr>
                 <w:color w:val="000000"/>
               </w:rPr>
@@ -4913,13 +4811,7 @@
                 <w:rPr>
                   <w:rStyle w:val="Hyperlink"/>
                 </w:rPr>
-                <w:t>https://www.vivanty.de/auto-technik/k-nstliche-</w:t>
-              </w:r>
-              <w:r>
-                <w:rPr>
-                  <w:rStyle w:val="Hyperlink"/>
-                </w:rPr>
-                <w:t>intelligenz-f-r-aufsehenerregende-selfie-videos</w:t>
+                <w:t>https://www.vivanty.de/auto-technik/k-nstliche-intelligenz-f-r-aufsehenerregende-selfie-videos</w:t>
               </w:r>
             </w:hyperlink>
             <w:r>
@@ -4958,6 +4850,7 @@
                 <w:right w:val="none" w:sz="4" w:space="0" w:color="000000"/>
               </w:pBdr>
               <w:spacing w:line="252" w:lineRule="atLeast"/>
+              <w:jc w:val="both"/>
               <w:rPr>
                 <w:b/>
                 <w:color w:val="000000"/>
@@ -4998,6 +4891,7 @@
                 <w:right w:val="none" w:sz="4" w:space="0" w:color="000000"/>
               </w:pBdr>
               <w:spacing w:line="252" w:lineRule="atLeast"/>
+              <w:jc w:val="both"/>
               <w:rPr>
                 <w:color w:val="000000"/>
               </w:rPr>
@@ -5018,6 +4912,7 @@
                 <w:right w:val="none" w:sz="4" w:space="0" w:color="000000"/>
               </w:pBdr>
               <w:spacing w:line="252" w:lineRule="atLeast"/>
+              <w:jc w:val="both"/>
               <w:rPr>
                 <w:color w:val="000000"/>
               </w:rPr>
@@ -5026,20 +4921,23 @@
               <w:rPr>
                 <w:color w:val="000000"/>
               </w:rPr>
-              <w:t>In modernen Autos werden bereits Intelligente Systeme integriert, wie zum Beispiel die Spracherkennung, Abstandstempomaten oder Spurhalteassistenten. Auch bei Elektroautos gibt Navigationssysteme, d</w:t>
+              <w:t>In modernen Autos werden bereits Intelligente Systeme integriert, wie zum Beispiel die Spracherkennung, Abstandstempomaten oder Spurhalteassistenten. Auch bei Elektroautos gibt Navigationssysteme, die mit künstlicher Intelligenz den Fahrenden bei der Routenplanung unterstützen und anhand der jeweiligen Fahrweise lernt, wann ein Stopp nötig sein wird. Vor allem autonome Fahrzeuge sind ein klares Beispiel für den Einsatz künstlicher Intelligenz (siehe Zusatzmaterial KI-B1.1.1 Erklärung zu Concept Cartoons)</w:t>
             </w:r>
-            <w:r>
+          </w:p>
+          <w:p>
+            <w:pPr>
+              <w:pBdr>
+                <w:top w:val="none" w:sz="4" w:space="0" w:color="000000"/>
+                <w:left w:val="none" w:sz="4" w:space="0" w:color="000000"/>
+                <w:bottom w:val="none" w:sz="4" w:space="0" w:color="000000"/>
+                <w:right w:val="none" w:sz="4" w:space="0" w:color="000000"/>
+              </w:pBdr>
+              <w:spacing w:line="252" w:lineRule="atLeast"/>
+              <w:jc w:val="both"/>
               <w:rPr>
                 <w:color w:val="000000"/>
               </w:rPr>
-              <w:t xml:space="preserve">ie mit künstlicher Intelligenz den Fahrenden bei der Routenplanung unterstützen und anhand der jeweiligen Fahrweise lernt, wann ein Stopp nötig sein wird. Vor allem autonome Fahrzeuge sind ein klares Beispiel für den Einsatz künstlicher Intelligenz (siehe </w:t>
-            </w:r>
-            <w:r>
-              <w:rPr>
-                <w:color w:val="000000"/>
-              </w:rPr>
-              <w:t>Zusatzmaterial KI-B1.1.1 Erklärung zu Concept Cartoons)</w:t>
-            </w:r>
+            </w:pPr>
           </w:p>
         </w:tc>
       </w:tr>
@@ -5070,6 +4968,7 @@
                 <w:right w:val="none" w:sz="4" w:space="0" w:color="000000"/>
               </w:pBdr>
               <w:spacing w:line="252" w:lineRule="atLeast"/>
+              <w:jc w:val="both"/>
               <w:rPr>
                 <w:b/>
                 <w:color w:val="000000"/>
@@ -5110,6 +5009,7 @@
                 <w:right w:val="none" w:sz="4" w:space="0" w:color="000000"/>
               </w:pBdr>
               <w:spacing w:line="252" w:lineRule="atLeast"/>
+              <w:jc w:val="both"/>
             </w:pPr>
             <w:r>
               <w:rPr>
@@ -5127,6 +5027,7 @@
                 <w:right w:val="none" w:sz="4" w:space="0" w:color="000000"/>
               </w:pBdr>
               <w:spacing w:line="252" w:lineRule="atLeast"/>
+              <w:jc w:val="both"/>
             </w:pPr>
             <w:r>
               <w:lastRenderedPageBreak/>
@@ -5142,12 +5043,10 @@
                 <w:right w:val="none" w:sz="4" w:space="0" w:color="000000"/>
               </w:pBdr>
               <w:spacing w:line="252" w:lineRule="atLeast"/>
+              <w:jc w:val="both"/>
             </w:pPr>
             <w:r>
-              <w:t>Dabei sind Ampeln bspw. an einer Kreuzung miteinander über einen Schaltkasten verbunden und verfügen teilweise über ein festes Programm, das festlegt, welche Ampel wann grün ist. Aktuell sind die meisten Ampeln/ Lichtsignalanlagen keine Beispiele für künst</w:t>
-            </w:r>
-            <w:r>
-              <w:t xml:space="preserve">liche Intelligenz. </w:t>
+              <w:t xml:space="preserve">Dabei sind Ampeln bspw. an einer Kreuzung miteinander über einen Schaltkasten verbunden und verfügen teilweise über ein festes Programm, das festlegt, welche Ampel wann grün ist. Aktuell sind die meisten Ampeln/ Lichtsignalanlagen keine Beispiele für künstliche Intelligenz. </w:t>
             </w:r>
           </w:p>
           <w:p>
@@ -5159,12 +5058,10 @@
                 <w:right w:val="none" w:sz="4" w:space="0" w:color="000000"/>
               </w:pBdr>
               <w:spacing w:line="252" w:lineRule="atLeast"/>
+              <w:jc w:val="both"/>
             </w:pPr>
             <w:r>
-              <w:t>Dennoch gibt es bspw. bereits Ampelsysteme, die künstlich intelligente sind, um den Verkehrsfluss in Städten zu optimieren. Zudem sind weitere Projekte für die Integration von künstlicher Intelligenz in Ampelsysteme sind geplant. z.B. i</w:t>
-            </w:r>
-            <w:r>
-              <w:t>n Ingolstadt</w:t>
+              <w:t>Dennoch gibt es bspw. bereits Ampelsysteme, die künstlich intelligente sind, um den Verkehrsfluss in Städten zu optimieren. Zudem sind weitere Projekte für die Integration von künstlicher Intelligenz in Ampelsysteme sind geplant. z.B. in Ingolstadt</w:t>
             </w:r>
           </w:p>
           <w:p>
@@ -5181,6 +5078,7 @@
                 <w:right w:val="none" w:sz="4" w:space="0" w:color="000000"/>
               </w:pBdr>
               <w:spacing w:before="0" w:after="0" w:line="252" w:lineRule="atLeast"/>
+              <w:jc w:val="both"/>
             </w:pPr>
             <w:hyperlink r:id="rId36" w:tooltip="https://de.wikipedia.org/wiki/Ampel" w:history="1">
               <w:r>
@@ -5211,6 +5109,7 @@
                 <w:right w:val="none" w:sz="4" w:space="0" w:color="000000"/>
               </w:pBdr>
               <w:spacing w:before="0" w:after="0" w:line="252" w:lineRule="atLeast"/>
+              <w:jc w:val="both"/>
             </w:pPr>
             <w:hyperlink r:id="rId37" w:tooltip="https://www.youtube.com/watch?v=uZANL07_0Ps" w:history="1">
               <w:r>
@@ -5235,19 +5134,14 @@
                 <w:right w:val="none" w:sz="4" w:space="0" w:color="000000"/>
               </w:pBdr>
               <w:spacing w:before="0" w:after="0" w:line="252" w:lineRule="atLeast"/>
+              <w:jc w:val="both"/>
             </w:pPr>
             <w:hyperlink r:id="rId38" w:tooltip="https://www.bmvi.de/SharedDocs/DE/Artikel/DG/mfund-projekte/ki4lsa.html" w:history="1">
               <w:r>
                 <w:rPr>
                   <w:rStyle w:val="Hyperlink"/>
                 </w:rPr>
-                <w:t>https://www.bmvi.de/SharedDocs/DE/Artikel/DG/mf</w:t>
-              </w:r>
-              <w:r>
-                <w:rPr>
-                  <w:rStyle w:val="Hyperlink"/>
-                </w:rPr>
-                <w:t>und-projekte/ki4lsa.html</w:t>
+                <w:t>https://www.bmvi.de/SharedDocs/DE/Artikel/DG/mfund-projekte/ki4lsa.html</w:t>
               </w:r>
             </w:hyperlink>
           </w:p>
@@ -5265,6 +5159,7 @@
                 <w:right w:val="none" w:sz="4" w:space="0" w:color="000000"/>
               </w:pBdr>
               <w:spacing w:before="0" w:after="0" w:line="252" w:lineRule="atLeast"/>
+              <w:jc w:val="both"/>
             </w:pPr>
             <w:hyperlink r:id="rId39" w:tooltip="https://m.facebook.com/Weltspiegel/videos/444105632908840/" w:history="1">
               <w:r>
@@ -5310,6 +5205,7 @@
                 <w:right w:val="none" w:sz="4" w:space="0" w:color="000000"/>
               </w:pBdr>
               <w:spacing w:line="252" w:lineRule="atLeast"/>
+              <w:jc w:val="both"/>
               <w:rPr>
                 <w:b/>
                 <w:color w:val="000000"/>
@@ -5351,6 +5247,7 @@
                 <w:right w:val="none" w:sz="4" w:space="0" w:color="000000"/>
               </w:pBdr>
               <w:spacing w:line="252" w:lineRule="atLeast"/>
+              <w:jc w:val="both"/>
               <w:rPr>
                 <w:color w:val="000000"/>
               </w:rPr>
@@ -5371,6 +5268,7 @@
                 <w:right w:val="none" w:sz="4" w:space="0" w:color="000000"/>
               </w:pBdr>
               <w:spacing w:line="252" w:lineRule="atLeast"/>
+              <w:jc w:val="both"/>
               <w:rPr>
                 <w:color w:val="000000"/>
               </w:rPr>
@@ -5379,13 +5277,7 @@
               <w:rPr>
                 <w:color w:val="000000"/>
               </w:rPr>
-              <w:t>Ein Segway ist ein elektrisch angetriebenes Fahrzeug mit zwei Rädern und wird zur Beförderung einzelner Personen genutzt. Durch das Verlagern des Gewichtes auf dem Segway kann dieses gesteuert werden – Bedienelemente zum Bremsen oder Beschleunigen sind dah</w:t>
-            </w:r>
-            <w:r>
-              <w:rPr>
-                <w:color w:val="000000"/>
-              </w:rPr>
-              <w:t xml:space="preserve">er nicht vorgesehen. </w:t>
+              <w:t xml:space="preserve">Ein Segway ist ein elektrisch angetriebenes Fahrzeug mit zwei Rädern und wird zur Beförderung einzelner Personen genutzt. Durch das Verlagern des Gewichtes auf dem Segway kann dieses gesteuert werden – Bedienelemente zum Bremsen oder Beschleunigen sind daher nicht vorgesehen. </w:t>
             </w:r>
           </w:p>
           <w:p>
@@ -5397,6 +5289,7 @@
                 <w:right w:val="none" w:sz="4" w:space="0" w:color="000000"/>
               </w:pBdr>
               <w:spacing w:line="252" w:lineRule="atLeast"/>
+              <w:jc w:val="both"/>
               <w:rPr>
                 <w:color w:val="000000"/>
               </w:rPr>
@@ -5422,6 +5315,7 @@
                 <w:right w:val="none" w:sz="4" w:space="0" w:color="000000"/>
               </w:pBdr>
               <w:spacing w:after="0" w:line="252" w:lineRule="atLeast"/>
+              <w:jc w:val="both"/>
               <w:rPr>
                 <w:color w:val="000000"/>
               </w:rPr>
@@ -5470,6 +5364,7 @@
                 <w:right w:val="none" w:sz="4" w:space="0" w:color="000000"/>
               </w:pBdr>
               <w:spacing w:line="252" w:lineRule="atLeast"/>
+              <w:jc w:val="both"/>
               <w:rPr>
                 <w:b/>
                 <w:color w:val="000000"/>
@@ -5510,6 +5405,7 @@
                 <w:right w:val="none" w:sz="4" w:space="0" w:color="000000"/>
               </w:pBdr>
               <w:spacing w:line="252" w:lineRule="atLeast"/>
+              <w:jc w:val="both"/>
               <w:rPr>
                 <w:color w:val="000000"/>
               </w:rPr>
@@ -5530,6 +5426,7 @@
                 <w:right w:val="none" w:sz="4" w:space="0" w:color="000000"/>
               </w:pBdr>
               <w:spacing w:line="252" w:lineRule="atLeast"/>
+              <w:jc w:val="both"/>
               <w:rPr>
                 <w:color w:val="000000"/>
               </w:rPr>
@@ -5538,13 +5435,7 @@
               <w:rPr>
                 <w:color w:val="000000"/>
               </w:rPr>
-              <w:t>Diese Fahrgastinformationssysteme dienen als Informationsquelle für Fahrgäste. Diese Systeme werden im Bahn- und Busverkehr häufig verwendet und variieren je nach Einsatzort und Einsatzzweck. In erster Linie steckt hinter Fahrgastinformationssystemen keine</w:t>
-            </w:r>
-            <w:r>
-              <w:rPr>
-                <w:color w:val="000000"/>
-              </w:rPr>
-              <w:t xml:space="preserve"> künstliche Intelligenz. </w:t>
+              <w:t xml:space="preserve">Diese Fahrgastinformationssysteme dienen als Informationsquelle für Fahrgäste. Diese Systeme werden im Bahn- und Busverkehr häufig verwendet und variieren je nach Einsatzort und Einsatzzweck. In erster Linie steckt hinter Fahrgastinformationssystemen keine künstliche Intelligenz. </w:t>
             </w:r>
           </w:p>
           <w:p>
@@ -5556,6 +5447,7 @@
                 <w:right w:val="none" w:sz="4" w:space="0" w:color="000000"/>
               </w:pBdr>
               <w:spacing w:line="252" w:lineRule="atLeast"/>
+              <w:jc w:val="both"/>
               <w:rPr>
                 <w:color w:val="000000"/>
               </w:rPr>
@@ -5581,6 +5473,7 @@
                 <w:right w:val="none" w:sz="4" w:space="0" w:color="000000"/>
               </w:pBdr>
               <w:spacing w:after="0" w:line="252" w:lineRule="atLeast"/>
+              <w:jc w:val="both"/>
               <w:rPr>
                 <w:color w:val="000000"/>
               </w:rPr>
@@ -5629,6 +5522,7 @@
                 <w:right w:val="none" w:sz="4" w:space="0" w:color="000000"/>
               </w:pBdr>
               <w:spacing w:line="252" w:lineRule="atLeast"/>
+              <w:jc w:val="both"/>
             </w:pPr>
             <w:r>
               <w:rPr>
@@ -5665,6 +5559,7 @@
                 <w:right w:val="none" w:sz="4" w:space="0" w:color="000000"/>
               </w:pBdr>
               <w:spacing w:line="252" w:lineRule="atLeast"/>
+              <w:jc w:val="both"/>
             </w:pPr>
             <w:r>
               <w:rPr>
@@ -5682,6 +5577,7 @@
                 <w:right w:val="none" w:sz="4" w:space="0" w:color="000000"/>
               </w:pBdr>
               <w:spacing w:line="252" w:lineRule="atLeast"/>
+              <w:jc w:val="both"/>
               <w:rPr>
                 <w:color w:val="000000"/>
               </w:rPr>
@@ -5690,13 +5586,7 @@
               <w:rPr>
                 <w:color w:val="000000"/>
               </w:rPr>
-              <w:t>Auf dem Markt gibt es viele verschiedenen Smartpho</w:t>
-            </w:r>
-            <w:r>
-              <w:rPr>
-                <w:color w:val="000000"/>
-              </w:rPr>
-              <w:t>nes, die eine Vielzahl von Funktionen innehalten. Dabei wird in einem Smartphone viel künstliche Intelligenz eingesetzt, bspw. bei der Gesichtserkennung, Spracherkennung oder bei der Verbesserung der Akkulaufzeit.</w:t>
+              <w:t>Auf dem Markt gibt es viele verschiedenen Smartphones, die eine Vielzahl von Funktionen innehalten. Dabei wird in einem Smartphone viel künstliche Intelligenz eingesetzt, bspw. bei der Gesichtserkennung, Spracherkennung oder bei der Verbesserung der Akkulaufzeit.</w:t>
             </w:r>
             <w:r>
               <w:t xml:space="preserve"> </w:t>
@@ -5718,13 +5608,7 @@
               <w:rPr>
                 <w:color w:val="000000"/>
               </w:rPr>
-              <w:t>ph</w:t>
-            </w:r>
-            <w:r>
-              <w:rPr>
-                <w:color w:val="000000"/>
-              </w:rPr>
-              <w:t>ones als Beispielanwendungen künstlicher Intelligenz verstanden werden.</w:t>
+              <w:t>phones als Beispielanwendungen künstlicher Intelligenz verstanden werden.</w:t>
             </w:r>
           </w:p>
           <w:p>
@@ -5741,6 +5625,7 @@
                 <w:right w:val="none" w:sz="4" w:space="0" w:color="000000"/>
               </w:pBdr>
               <w:spacing w:before="0" w:after="0" w:line="252" w:lineRule="atLeast"/>
+              <w:jc w:val="both"/>
             </w:pPr>
             <w:hyperlink r:id="rId42" w:tooltip="https://www.wertgarantie.de/ratgeber/technik-news/smartphone/kuenstliche-intelligenz-smartphones-inwieweit-wird-sie-bereits-eingesetzt" w:history="1">
               <w:r>
@@ -5786,6 +5671,7 @@
                 <w:right w:val="none" w:sz="4" w:space="0" w:color="000000"/>
               </w:pBdr>
               <w:spacing w:line="252" w:lineRule="atLeast"/>
+              <w:jc w:val="both"/>
             </w:pPr>
             <w:r>
               <w:rPr>
@@ -5824,6 +5710,7 @@
                 <w:right w:val="none" w:sz="4" w:space="0" w:color="000000"/>
               </w:pBdr>
               <w:spacing w:line="252" w:lineRule="atLeast"/>
+              <w:jc w:val="both"/>
               <w:rPr>
                 <w:b/>
                 <w:color w:val="000000"/>
@@ -5864,6 +5751,7 @@
                 <w:right w:val="none" w:sz="4" w:space="0" w:color="000000"/>
               </w:pBdr>
               <w:spacing w:line="252" w:lineRule="atLeast"/>
+              <w:jc w:val="both"/>
               <w:rPr>
                 <w:color w:val="000000"/>
               </w:rPr>
@@ -5884,6 +5772,7 @@
                 <w:right w:val="none" w:sz="4" w:space="0" w:color="000000"/>
               </w:pBdr>
               <w:spacing w:line="252" w:lineRule="atLeast"/>
+              <w:jc w:val="both"/>
               <w:rPr>
                 <w:color w:val="000000"/>
               </w:rPr>
@@ -5892,19 +5781,7 @@
               <w:rPr>
                 <w:color w:val="000000"/>
               </w:rPr>
-              <w:t>Ein Rasenmähroboter ist mit vielen Sensoren ausgestattet</w:t>
-            </w:r>
-            <w:r>
-              <w:rPr>
-                <w:color w:val="000000"/>
-              </w:rPr>
-              <w:t>, die zur Routenplanung und Routenführung eingesetzt werden. Dadurch ist ein autonomes Mähen und Erreichen der Ladestation möglich. Neuere Rasenmähroboter verfügen bereits über künstliche Intelligenz und können damit auch selbstständig Entscheidungen treff</w:t>
-            </w:r>
-            <w:r>
-              <w:rPr>
-                <w:color w:val="000000"/>
-              </w:rPr>
-              <w:t>en. In diesem Sinne könnte ein Rasennähroboter als Beispiel für künstliche Intelligenz gelten.</w:t>
+              <w:t>Ein Rasenmähroboter ist mit vielen Sensoren ausgestattet, die zur Routenplanung und Routenführung eingesetzt werden. Dadurch ist ein autonomes Mähen und Erreichen der Ladestation möglich. Neuere Rasenmähroboter verfügen bereits über künstliche Intelligenz und können damit auch selbstständig Entscheidungen treffen. In diesem Sinne könnte ein Rasennähroboter als Beispiel für künstliche Intelligenz gelten.</w:t>
             </w:r>
           </w:p>
           <w:p>
@@ -5921,6 +5798,7 @@
                 <w:right w:val="none" w:sz="4" w:space="0" w:color="000000"/>
               </w:pBdr>
               <w:spacing w:after="0" w:line="252" w:lineRule="atLeast"/>
+              <w:jc w:val="both"/>
               <w:rPr>
                 <w:color w:val="000000"/>
               </w:rPr>
@@ -5969,6 +5847,7 @@
                 <w:right w:val="none" w:sz="4" w:space="0" w:color="000000"/>
               </w:pBdr>
               <w:spacing w:line="252" w:lineRule="atLeast"/>
+              <w:jc w:val="both"/>
             </w:pPr>
             <w:r>
               <w:rPr>
@@ -6005,6 +5884,7 @@
                 <w:right w:val="none" w:sz="4" w:space="0" w:color="000000"/>
               </w:pBdr>
               <w:spacing w:line="252" w:lineRule="atLeast"/>
+              <w:jc w:val="both"/>
               <w:rPr>
                 <w:color w:val="000000"/>
               </w:rPr>
@@ -6025,6 +5905,7 @@
                 <w:right w:val="none" w:sz="4" w:space="0" w:color="000000"/>
               </w:pBdr>
               <w:spacing w:line="252" w:lineRule="atLeast"/>
+              <w:jc w:val="both"/>
               <w:rPr>
                 <w:color w:val="000000"/>
               </w:rPr>
@@ -6064,6 +5945,7 @@
                 <w:right w:val="none" w:sz="4" w:space="0" w:color="000000"/>
               </w:pBdr>
               <w:spacing w:line="252" w:lineRule="atLeast"/>
+              <w:jc w:val="both"/>
             </w:pPr>
             <w:r>
               <w:rPr>
@@ -6099,6 +5981,7 @@
                 <w:right w:val="none" w:sz="4" w:space="0" w:color="000000"/>
               </w:pBdr>
               <w:spacing w:line="252" w:lineRule="atLeast"/>
+              <w:jc w:val="both"/>
               <w:rPr>
                 <w:color w:val="000000"/>
               </w:rPr>
@@ -6119,6 +6002,7 @@
                 <w:right w:val="none" w:sz="4" w:space="0" w:color="000000"/>
               </w:pBdr>
               <w:spacing w:line="252" w:lineRule="atLeast"/>
+              <w:jc w:val="both"/>
               <w:rPr>
                 <w:color w:val="000000"/>
               </w:rPr>
@@ -6128,13 +6012,7 @@
                 <w:color w:val="000000"/>
               </w:rPr>
               <w:lastRenderedPageBreak/>
-              <w:t>Ein gewöhnlicher Fernseher ist in</w:t>
-            </w:r>
-            <w:r>
-              <w:rPr>
-                <w:color w:val="000000"/>
-              </w:rPr>
-              <w:t xml:space="preserve"> erster Linie kein Beispiel für künstliche Intelligenz. Jedoch gibt es vermehrte Hersteller, die künstliche Intelligenz für die Verbesserung der Bildqualität einsetzten. </w:t>
+              <w:t xml:space="preserve">Ein gewöhnlicher Fernseher ist in erster Linie kein Beispiel für künstliche Intelligenz. Jedoch gibt es vermehrte Hersteller, die künstliche Intelligenz für die Verbesserung der Bildqualität einsetzten. </w:t>
             </w:r>
           </w:p>
           <w:p>
@@ -6146,6 +6024,7 @@
                 <w:right w:val="none" w:sz="4" w:space="0" w:color="000000"/>
               </w:pBdr>
               <w:spacing w:line="252" w:lineRule="atLeast"/>
+              <w:jc w:val="both"/>
               <w:rPr>
                 <w:color w:val="000000"/>
               </w:rPr>
@@ -6191,6 +6070,7 @@
                 <w:right w:val="none" w:sz="4" w:space="0" w:color="000000"/>
               </w:pBdr>
               <w:spacing w:line="252" w:lineRule="atLeast"/>
+              <w:jc w:val="both"/>
             </w:pPr>
             <w:r>
               <w:rPr>
@@ -6230,6 +6110,7 @@
                 <w:right w:val="none" w:sz="4" w:space="0" w:color="000000"/>
               </w:pBdr>
               <w:spacing w:line="252" w:lineRule="atLeast"/>
+              <w:jc w:val="both"/>
             </w:pPr>
             <w:r>
               <w:rPr>
@@ -6266,6 +6147,7 @@
                 <w:right w:val="none" w:sz="4" w:space="0" w:color="000000"/>
               </w:pBdr>
               <w:spacing w:line="252" w:lineRule="atLeast"/>
+              <w:jc w:val="both"/>
             </w:pPr>
             <w:r>
               <w:rPr>
@@ -6283,6 +6165,7 @@
                 <w:right w:val="none" w:sz="4" w:space="0" w:color="000000"/>
               </w:pBdr>
               <w:spacing w:line="252" w:lineRule="atLeast"/>
+              <w:jc w:val="both"/>
               <w:rPr>
                 <w:color w:val="000000"/>
               </w:rPr>
@@ -6291,13 +6174,7 @@
               <w:rPr>
                 <w:color w:val="000000"/>
               </w:rPr>
-              <w:t>In erster Linie ist eine einfache, manuell gesteuerte Drohne kein Beispiel für künstliche Intelligenz. Ausnahmen sind Drohnen, die z.B. autonom in Formationen fliegen können oder Objekten folgen können. Besonders umstritten ist der Einsatz autonomer, kampf</w:t>
-            </w:r>
-            <w:r>
-              <w:rPr>
-                <w:color w:val="000000"/>
-              </w:rPr>
-              <w:t>fähiger Drohnen im militärischen Kontext.</w:t>
+              <w:t>In erster Linie ist eine einfache, manuell gesteuerte Drohne kein Beispiel für künstliche Intelligenz. Ausnahmen sind Drohnen, die z.B. autonom in Formationen fliegen können oder Objekten folgen können. Besonders umstritten ist der Einsatz autonomer, kampffähiger Drohnen im militärischen Kontext.</w:t>
             </w:r>
           </w:p>
           <w:p>
@@ -6314,19 +6191,14 @@
                 <w:right w:val="none" w:sz="4" w:space="0" w:color="000000"/>
               </w:pBdr>
               <w:spacing w:before="0" w:after="0" w:line="252" w:lineRule="atLeast"/>
+              <w:jc w:val="both"/>
             </w:pPr>
             <w:hyperlink r:id="rId45" w:tooltip="https://cordis.europa.eu/article/id/251211-ai-powered-drones-for-difficult-maintenance-tasks/de" w:history="1">
               <w:r>
                 <w:rPr>
                   <w:rStyle w:val="Hyperlink"/>
                 </w:rPr>
-                <w:t>h</w:t>
-              </w:r>
-              <w:r>
-                <w:rPr>
-                  <w:rStyle w:val="Hyperlink"/>
-                </w:rPr>
-                <w:t>ttps://cordis.europa.eu/article/id/251211-ai-powered-drones-for-difficult-maintenance-tasks/de</w:t>
+                <w:t>https://cordis.europa.eu/article/id/251211-ai-powered-drones-for-difficult-maintenance-tasks/de</w:t>
               </w:r>
             </w:hyperlink>
             <w:r>
@@ -6350,6 +6222,7 @@
                 <w:right w:val="none" w:sz="4" w:space="0" w:color="000000"/>
               </w:pBdr>
               <w:spacing w:before="0" w:after="0" w:line="252" w:lineRule="atLeast"/>
+              <w:jc w:val="both"/>
             </w:pPr>
             <w:hyperlink r:id="rId46" w:tooltip="https://www.youtube.com/watch?v=LvYNHSf7FbI" w:history="1">
               <w:r>
@@ -6377,6 +6250,7 @@
                 <w:right w:val="none" w:sz="4" w:space="0" w:color="000000"/>
               </w:pBdr>
               <w:spacing w:before="0" w:after="0" w:line="252" w:lineRule="atLeast"/>
+              <w:jc w:val="both"/>
             </w:pPr>
             <w:hyperlink r:id="rId47" w:tooltip="https://www.trendreport.de/drohne-und-ki-im-einsatz/" w:history="1">
               <w:r>
@@ -6407,19 +6281,14 @@
                 <w:right w:val="none" w:sz="4" w:space="0" w:color="000000"/>
               </w:pBdr>
               <w:spacing w:before="0" w:after="0" w:line="252" w:lineRule="atLeast"/>
+              <w:jc w:val="both"/>
             </w:pPr>
             <w:hyperlink r:id="rId48" w:tooltip="https://www.technologyreview.com/2017/03/29/152895/ai-powered-drone-will-follow-you-around-and-take-pictures/" w:history="1">
               <w:r>
                 <w:rPr>
                   <w:rStyle w:val="Hyperlink"/>
                 </w:rPr>
-                <w:t>https://www.technologyreview.com/2017/03/29/152895/ai-powered-drone-will-follow-you-around-and-t</w:t>
-              </w:r>
-              <w:r>
-                <w:rPr>
-                  <w:rStyle w:val="Hyperlink"/>
-                </w:rPr>
-                <w:t>ake-pictures/</w:t>
+                <w:t>https://www.technologyreview.com/2017/03/29/152895/ai-powered-drone-will-follow-you-around-and-take-pictures/</w:t>
               </w:r>
             </w:hyperlink>
             <w:r>
@@ -6443,6 +6312,7 @@
                 <w:right w:val="none" w:sz="4" w:space="0" w:color="000000"/>
               </w:pBdr>
               <w:spacing w:before="0" w:after="0" w:line="252" w:lineRule="atLeast"/>
+              <w:jc w:val="both"/>
             </w:pPr>
             <w:hyperlink r:id="rId49" w:tooltip="https://www.youtube.com/watch?v=O-2tpwW0kmU" w:history="1">
               <w:r>
@@ -6467,6 +6337,7 @@
                 <w:right w:val="none" w:sz="4" w:space="0" w:color="000000"/>
               </w:pBdr>
               <w:spacing w:before="0" w:after="0" w:line="252" w:lineRule="atLeast"/>
+              <w:jc w:val="both"/>
             </w:pPr>
             <w:hyperlink r:id="rId50" w:tooltip="https://de.wikipedia.org/wiki/Loyal_Wingman" w:history="1">
               <w:r>
@@ -6512,6 +6383,7 @@
                 <w:right w:val="none" w:sz="4" w:space="0" w:color="000000"/>
               </w:pBdr>
               <w:spacing w:line="252" w:lineRule="atLeast"/>
+              <w:jc w:val="both"/>
               <w:rPr>
                 <w:b/>
                 <w:color w:val="000000"/>
@@ -6552,6 +6424,7 @@
                 <w:right w:val="none" w:sz="4" w:space="0" w:color="000000"/>
               </w:pBdr>
               <w:spacing w:line="252" w:lineRule="atLeast"/>
+              <w:jc w:val="both"/>
               <w:rPr>
                 <w:color w:val="000000"/>
               </w:rPr>
@@ -6572,6 +6445,7 @@
                 <w:right w:val="none" w:sz="4" w:space="0" w:color="000000"/>
               </w:pBdr>
               <w:spacing w:line="252" w:lineRule="atLeast"/>
+              <w:jc w:val="both"/>
               <w:rPr>
                 <w:color w:val="000000"/>
               </w:rPr>
@@ -6580,13 +6454,7 @@
               <w:rPr>
                 <w:color w:val="000000"/>
               </w:rPr>
-              <w:t xml:space="preserve">Der Blick durch eine VR-Brille suggeriert dem Gehirn eine virtuelle 3D-Welt. Wie in der realen Welt, kann man sich mit der VR-Brille durch Kopfbewegungen umsehen. </w:t>
-            </w:r>
-            <w:r>
-              <w:rPr>
-                <w:color w:val="000000"/>
-              </w:rPr>
-              <w:t>Die künstliche Intelligenz verbirgt sich hierbei jedoch nicht in der VR-Brille, sondern in der virtuellen Welt – beispielsweise in Computerspielen (siehe Zusatzmaterial KI-B1.1.1 Erklärung zu Concept Cartoons).</w:t>
+              <w:t>Der Blick durch eine VR-Brille suggeriert dem Gehirn eine virtuelle 3D-Welt. Wie in der realen Welt, kann man sich mit der VR-Brille durch Kopfbewegungen umsehen. Die künstliche Intelligenz verbirgt sich hierbei jedoch nicht in der VR-Brille, sondern in der virtuellen Welt – beispielsweise in Computerspielen (siehe Zusatzmaterial KI-B1.1.1 Erklärung zu Concept Cartoons).</w:t>
             </w:r>
           </w:p>
           <w:p>
@@ -6603,6 +6471,7 @@
                 <w:right w:val="none" w:sz="4" w:space="0" w:color="000000"/>
               </w:pBdr>
               <w:spacing w:before="0" w:after="0" w:line="252" w:lineRule="atLeast"/>
+              <w:jc w:val="both"/>
               <w:rPr>
                 <w:color w:val="000000"/>
               </w:rPr>
@@ -6612,13 +6481,7 @@
                 <w:rPr>
                   <w:rStyle w:val="Hyperlink"/>
                 </w:rPr>
-                <w:t>https://www.vdc-fellbach.de/nachrichten/2020/</w:t>
-              </w:r>
-              <w:r>
-                <w:rPr>
-                  <w:rStyle w:val="Hyperlink"/>
-                </w:rPr>
-                <w:t>08/11/wie-ki-die-virtuelle-realitaet-unterstuetzt/</w:t>
+                <w:t>https://www.vdc-fellbach.de/nachrichten/2020/08/11/wie-ki-die-virtuelle-realitaet-unterstuetzt/</w:t>
               </w:r>
             </w:hyperlink>
             <w:r>
@@ -6642,6 +6505,7 @@
                 <w:right w:val="none" w:sz="4" w:space="0" w:color="000000"/>
               </w:pBdr>
               <w:spacing w:before="0" w:after="0" w:line="252" w:lineRule="atLeast"/>
+              <w:jc w:val="both"/>
               <w:rPr>
                 <w:color w:val="000000"/>
               </w:rPr>
@@ -6691,6 +6555,7 @@
                 <w:right w:val="none" w:sz="4" w:space="0" w:color="000000"/>
               </w:pBdr>
               <w:spacing w:line="252" w:lineRule="atLeast"/>
+              <w:jc w:val="both"/>
             </w:pPr>
             <w:r>
               <w:rPr>
@@ -6728,6 +6593,7 @@
                 <w:right w:val="none" w:sz="4" w:space="0" w:color="000000"/>
               </w:pBdr>
               <w:spacing w:line="252" w:lineRule="atLeast"/>
+              <w:jc w:val="both"/>
             </w:pPr>
             <w:r>
               <w:rPr>
@@ -6763,6 +6629,7 @@
                 <w:right w:val="none" w:sz="4" w:space="0" w:color="000000"/>
               </w:pBdr>
               <w:spacing w:line="252" w:lineRule="atLeast"/>
+              <w:jc w:val="both"/>
               <w:rPr>
                 <w:color w:val="000000"/>
               </w:rPr>
@@ -6783,6 +6650,7 @@
                 <w:right w:val="none" w:sz="4" w:space="0" w:color="000000"/>
               </w:pBdr>
               <w:spacing w:line="252" w:lineRule="atLeast"/>
+              <w:jc w:val="both"/>
               <w:rPr>
                 <w:color w:val="000000"/>
               </w:rPr>
@@ -6791,59 +6659,21 @@
               <w:rPr>
                 <w:color w:val="000000"/>
               </w:rPr>
-              <w:t xml:space="preserve">In der Medizin </w:t>
-            </w:r>
-            <w:r>
-              <w:rPr>
-                <w:color w:val="000000"/>
-              </w:rPr>
-              <w:t>gehören Operationen zum Alltag. Dabei unterscheiden sich die verwendeten Instrumente, der Aufwand und auch die Dauer einer Operation stark. Eine künstliche Intelligenz kann Ärztinnen und Ärzten bei solchen Eingriffen unterstützen. Bei Operationen werden be</w:t>
-            </w:r>
-            <w:r>
-              <w:rPr>
-                <w:color w:val="000000"/>
-              </w:rPr>
-              <w:t xml:space="preserve">reits Roboter zur Unterstützung eingesetzt, wie beispielsweise der </w:t>
+              <w:t xml:space="preserve">In der Medizin gehören Operationen zum Alltag. Dabei unterscheiden sich die verwendeten Instrumente, der Aufwand und auch die Dauer einer Operation stark. Eine künstliche Intelligenz kann Ärztinnen und Ärzten bei solchen Eingriffen unterstützen. Bei Operationen werden bereits Roboter zur Unterstützung eingesetzt, wie beispielsweise der </w:t>
             </w:r>
             <w:hyperlink r:id="rId53" w:tooltip="https://www.ukaachen.de/kliniken-institute/klinik-fuer-urologie/sektion-robotik/" w:history="1">
               <w:r>
                 <w:rPr>
                   <w:rStyle w:val="Hyperlink"/>
                 </w:rPr>
-                <w:t>"Da Vi</w:t>
-              </w:r>
-              <w:r>
-                <w:rPr>
-                  <w:rStyle w:val="Hyperlink"/>
-                </w:rPr>
-                <w:t>nci"</w:t>
+                <w:t>"Da Vinci"</w:t>
               </w:r>
             </w:hyperlink>
             <w:r>
               <w:rPr>
                 <w:color w:val="000000"/>
               </w:rPr>
-              <w:t>. Jedoch liegt beim Da Vinci die Steuerung und Entscheidungen bei den Operierenden. Wenn aber ein entsprechender Roboter eigenständig Entscheidungen trifft oder Empfehlungen ausspricht, dann kann aufgrund dieser Funktionalität von KI gesprochen werden.</w:t>
-            </w:r>
-            <w:r>
-              <w:rPr>
-                <w:color w:val="000000"/>
-              </w:rPr>
-              <w:t xml:space="preserve"> In der Science-Fiction werden Operationen autonom von Robotern durchgeführt, wie zum Beispiel im Film „Star Wars: Die Rache der </w:t>
-            </w:r>
-            <w:proofErr w:type="spellStart"/>
-            <w:r>
-              <w:rPr>
-                <w:color w:val="000000"/>
-              </w:rPr>
-              <w:t>Sith</w:t>
-            </w:r>
-            <w:proofErr w:type="spellEnd"/>
-            <w:r>
-              <w:rPr>
-                <w:color w:val="000000"/>
-              </w:rPr>
-              <w:t>“ oder „Prometheus:</w:t>
+              <w:t>. Jedoch liegt beim Da Vinci die Steuerung und Entscheidungen bei den Operierenden. Wenn aber ein entsprechender Roboter eigenständig Entscheidungen trifft oder Empfehlungen ausspricht, dann kann aufgrund dieser Funktionalität von KI gesprochen werden. In der Science-Fiction werden Operationen autonom von Robotern durchgeführt, wie zum Beispiel im Film „Star Wars: Die Rache der Sith“ oder „Prometheus:</w:t>
             </w:r>
             <w:r>
               <w:t xml:space="preserve"> </w:t>
@@ -6852,13 +6682,7 @@
               <w:rPr>
                 <w:color w:val="000000"/>
               </w:rPr>
-              <w:t xml:space="preserve">Prometheus – Dunkle Zeichen“. Wann es in der realen Welt zu solchen Operationen kommt, steht jedoch in </w:t>
-            </w:r>
-            <w:r>
-              <w:rPr>
-                <w:color w:val="000000"/>
-              </w:rPr>
-              <w:t>den Sternen.</w:t>
+              <w:t>Prometheus – Dunkle Zeichen“. Wann es in der realen Welt zu solchen Operationen kommt, steht jedoch in den Sternen.</w:t>
             </w:r>
           </w:p>
           <w:p>
@@ -6875,6 +6699,7 @@
                 <w:right w:val="none" w:sz="4" w:space="0" w:color="000000"/>
               </w:pBdr>
               <w:spacing w:before="0" w:after="0" w:line="252" w:lineRule="atLeast"/>
+              <w:jc w:val="both"/>
               <w:rPr>
                 <w:color w:val="000000"/>
               </w:rPr>
@@ -6908,6 +6733,7 @@
                 <w:right w:val="none" w:sz="4" w:space="0" w:color="000000"/>
               </w:pBdr>
               <w:spacing w:before="0" w:after="0" w:line="252" w:lineRule="atLeast"/>
+              <w:jc w:val="both"/>
               <w:rPr>
                 <w:color w:val="000000"/>
               </w:rPr>
@@ -6941,6 +6767,7 @@
                 <w:right w:val="none" w:sz="4" w:space="0" w:color="000000"/>
               </w:pBdr>
               <w:spacing w:before="0" w:after="0" w:line="252" w:lineRule="atLeast"/>
+              <w:jc w:val="both"/>
               <w:rPr>
                 <w:color w:val="000000"/>
               </w:rPr>
@@ -6950,13 +6777,7 @@
                 <w:rPr>
                   <w:rStyle w:val="Hyperlink"/>
                 </w:rPr>
-                <w:t>https://www.aerzteblatt.de/archiv/17178/Kuenstliche-Intelligenz-Roboter-fuer-die-Gesichtschir</w:t>
-              </w:r>
-              <w:r>
-                <w:rPr>
-                  <w:rStyle w:val="Hyperlink"/>
-                </w:rPr>
-                <w:t>urgie</w:t>
+                <w:t>https://www.aerzteblatt.de/archiv/17178/Kuenstliche-Intelligenz-Roboter-fuer-die-Gesichtschirurgie</w:t>
               </w:r>
             </w:hyperlink>
             <w:r>
@@ -6980,8 +6801,8 @@
                 <w:right w:val="none" w:sz="4" w:space="0" w:color="000000"/>
               </w:pBdr>
               <w:spacing w:before="0" w:after="0" w:line="252" w:lineRule="atLeast"/>
+              <w:jc w:val="both"/>
               <w:rPr>
-                <w:ins w:id="16" w:author="Imke Endjer" w:date="2023-01-27T13:23:00Z"/>
                 <w:color w:val="000000"/>
               </w:rPr>
             </w:pPr>
@@ -7009,8 +6830,8 @@
                 <w:right w:val="none" w:sz="4" w:space="0" w:color="000000"/>
               </w:pBdr>
               <w:spacing w:line="252" w:lineRule="atLeast"/>
+              <w:jc w:val="both"/>
               <w:rPr>
-                <w:ins w:id="17" w:author="Imke Endjer" w:date="2023-01-27T13:23:00Z"/>
                 <w:color w:val="000000"/>
               </w:rPr>
             </w:pPr>
@@ -7024,8 +6845,8 @@
                 <w:right w:val="none" w:sz="4" w:space="0" w:color="000000"/>
               </w:pBdr>
               <w:spacing w:line="252" w:lineRule="atLeast"/>
+              <w:jc w:val="both"/>
               <w:rPr>
-                <w:ins w:id="18" w:author="Imke Endjer" w:date="2023-01-27T13:23:00Z"/>
                 <w:color w:val="000000"/>
               </w:rPr>
             </w:pPr>
@@ -7039,8 +6860,8 @@
                 <w:right w:val="none" w:sz="4" w:space="0" w:color="000000"/>
               </w:pBdr>
               <w:spacing w:line="252" w:lineRule="atLeast"/>
+              <w:jc w:val="both"/>
               <w:rPr>
-                <w:ins w:id="19" w:author="Imke Endjer" w:date="2023-01-27T13:23:00Z"/>
                 <w:color w:val="000000"/>
               </w:rPr>
             </w:pPr>
@@ -7054,28 +6875,10 @@
                 <w:right w:val="none" w:sz="4" w:space="0" w:color="000000"/>
               </w:pBdr>
               <w:spacing w:line="252" w:lineRule="atLeast"/>
+              <w:jc w:val="both"/>
               <w:rPr>
                 <w:color w:val="000000"/>
-                <w:rPrChange w:id="20" w:author="Imke Endjer" w:date="2023-01-27T13:23:00Z">
-                  <w:rPr/>
-                </w:rPrChange>
               </w:rPr>
-              <w:pPrChange w:id="21" w:author="Imke Endjer" w:date="2023-01-27T13:23:00Z">
-                <w:pPr>
-                  <w:pStyle w:val="Listenabsatz"/>
-                  <w:numPr>
-                    <w:numId w:val="15"/>
-                  </w:numPr>
-                  <w:pBdr>
-                    <w:top w:val="none" w:sz="4" w:space="0" w:color="000000"/>
-                    <w:left w:val="none" w:sz="4" w:space="0" w:color="000000"/>
-                    <w:bottom w:val="none" w:sz="4" w:space="0" w:color="000000"/>
-                    <w:right w:val="none" w:sz="4" w:space="0" w:color="000000"/>
-                  </w:pBdr>
-                  <w:spacing w:before="0" w:after="0" w:line="252" w:lineRule="atLeast"/>
-                  <w:ind w:hanging="360"/>
-                </w:pPr>
-              </w:pPrChange>
             </w:pPr>
           </w:p>
         </w:tc>
@@ -7107,6 +6910,7 @@
                 <w:right w:val="none" w:sz="4" w:space="0" w:color="000000"/>
               </w:pBdr>
               <w:spacing w:line="252" w:lineRule="atLeast"/>
+              <w:jc w:val="both"/>
             </w:pPr>
             <w:r>
               <w:rPr>
@@ -7143,6 +6947,7 @@
                 <w:right w:val="none" w:sz="4" w:space="0" w:color="000000"/>
               </w:pBdr>
               <w:spacing w:line="252" w:lineRule="atLeast"/>
+              <w:jc w:val="both"/>
               <w:rPr>
                 <w:color w:val="000000"/>
               </w:rPr>
@@ -7151,13 +6956,7 @@
               <w:rPr>
                 <w:color w:val="000000"/>
               </w:rPr>
-              <w:t>Magnetre</w:t>
-            </w:r>
-            <w:r>
-              <w:rPr>
-                <w:color w:val="000000"/>
-              </w:rPr>
-              <w:t>sonanztomographie (MRT):</w:t>
+              <w:t>Magnetresonanztomographie (MRT):</w:t>
             </w:r>
           </w:p>
           <w:p>
@@ -7169,6 +6968,7 @@
                 <w:right w:val="none" w:sz="4" w:space="0" w:color="000000"/>
               </w:pBdr>
               <w:spacing w:line="252" w:lineRule="atLeast"/>
+              <w:jc w:val="both"/>
               <w:rPr>
                 <w:color w:val="000000"/>
               </w:rPr>
@@ -7177,6 +6977,7 @@
               <w:rPr>
                 <w:color w:val="000000"/>
               </w:rPr>
+              <w:lastRenderedPageBreak/>
               <w:t xml:space="preserve">Das MRT ist in der Lage Schnittbilder des Körpers zu erstellen. Ärztinnen und Ärzte können mit Hilfe solcher Aufnahmen Krankheiten erkennen. Dies </w:t>
             </w:r>
             <w:proofErr w:type="gramStart"/>
@@ -7191,20 +6992,7 @@
               <w:rPr>
                 <w:color w:val="000000"/>
               </w:rPr>
-              <w:t xml:space="preserve"> jedoch eine lange Ausbildung und viel Erfahrung. Die reine Bildgebung durch</w:t>
-            </w:r>
-            <w:r>
-              <w:rPr>
-                <w:color w:val="000000"/>
-              </w:rPr>
-              <w:t xml:space="preserve"> das MRT ist nicht </w:t>
-            </w:r>
-            <w:r>
-              <w:rPr>
-                <w:color w:val="000000"/>
-              </w:rPr>
-              <w:lastRenderedPageBreak/>
-              <w:t xml:space="preserve">künstlich intelligent. Jedoch wird schon heute künstliche Intelligenz eingesetzt, um das medizinische Personal bei der Auswertung solcher Bilder zu unterstützen. </w:t>
+              <w:t xml:space="preserve"> jedoch eine lange Ausbildung und viel Erfahrung. Die reine Bildgebung durch das MRT ist nicht künstlich intelligent. Jedoch wird schon heute künstliche Intelligenz eingesetzt, um das medizinische Personal bei der Auswertung solcher Bilder zu unterstützen. </w:t>
             </w:r>
           </w:p>
           <w:p>
@@ -7221,6 +7009,7 @@
                 <w:right w:val="none" w:sz="4" w:space="0" w:color="000000"/>
               </w:pBdr>
               <w:spacing w:before="0" w:after="0" w:line="252" w:lineRule="atLeast"/>
+              <w:jc w:val="both"/>
             </w:pPr>
             <w:hyperlink r:id="rId58" w:tooltip="https://www.ibm.com/blogs/research/2019/07/ai-tools-for-cancer-research/" w:history="1">
               <w:r>
@@ -7248,19 +7037,14 @@
                 <w:right w:val="none" w:sz="4" w:space="0" w:color="000000"/>
               </w:pBdr>
               <w:spacing w:before="0" w:after="0" w:line="252" w:lineRule="atLeast"/>
+              <w:jc w:val="both"/>
             </w:pPr>
             <w:hyperlink r:id="rId59" w:tooltip="https://www.aerzteblatt.de/nachrichten/108688/Kuenstliche-Intelligenz-soll-MRT-Auswertung-beschleunigen" w:history="1">
               <w:r>
                 <w:rPr>
                   <w:rStyle w:val="Hyperlink"/>
                 </w:rPr>
-                <w:t>https://www.aerzteblatt.de/nachrichten/10868</w:t>
-              </w:r>
-              <w:r>
-                <w:rPr>
-                  <w:rStyle w:val="Hyperlink"/>
-                </w:rPr>
-                <w:t>8/Kuenstliche-Intelligenz-soll-MRT-Auswertung-beschleunigen</w:t>
+                <w:t>https://www.aerzteblatt.de/nachrichten/108688/Kuenstliche-Intelligenz-soll-MRT-Auswertung-beschleunigen</w:t>
               </w:r>
             </w:hyperlink>
             <w:r>
@@ -7298,6 +7082,7 @@
                 <w:right w:val="none" w:sz="4" w:space="0" w:color="000000"/>
               </w:pBdr>
               <w:spacing w:line="252" w:lineRule="atLeast"/>
+              <w:jc w:val="both"/>
             </w:pPr>
             <w:r>
               <w:rPr>
@@ -7334,6 +7119,7 @@
                 <w:right w:val="none" w:sz="4" w:space="0" w:color="000000"/>
               </w:pBdr>
               <w:spacing w:line="252" w:lineRule="atLeast"/>
+              <w:jc w:val="both"/>
               <w:rPr>
                 <w:color w:val="000000"/>
               </w:rPr>
@@ -7354,6 +7140,7 @@
                 <w:right w:val="none" w:sz="4" w:space="0" w:color="000000"/>
               </w:pBdr>
               <w:spacing w:line="252" w:lineRule="atLeast"/>
+              <w:jc w:val="both"/>
               <w:rPr>
                 <w:color w:val="000000"/>
               </w:rPr>
@@ -7362,13 +7149,7 @@
               <w:rPr>
                 <w:color w:val="000000"/>
               </w:rPr>
-              <w:t>Eine medizinische Untersuchung, bei der ein U</w:t>
-            </w:r>
-            <w:r>
-              <w:rPr>
-                <w:color w:val="000000"/>
-              </w:rPr>
-              <w:t xml:space="preserve">ltraschall zum Einsatz kommt, ist zunächst ohne künstliche Intelligenz durchführbar. Jedoch gibt es (wie beim MRT) bereits Systeme, die die Ärzte und Ärztinnen bei der Interpretation der Ultraschallbilder unterstützen und Krankheiten früh erkennen können. </w:t>
+              <w:t xml:space="preserve">Eine medizinische Untersuchung, bei der ein Ultraschall zum Einsatz kommt, ist zunächst ohne künstliche Intelligenz durchführbar. Jedoch gibt es (wie beim MRT) bereits Systeme, die die Ärzte und Ärztinnen bei der Interpretation der Ultraschallbilder unterstützen und Krankheiten früh erkennen können. </w:t>
             </w:r>
           </w:p>
           <w:p>
@@ -7385,6 +7166,7 @@
                 <w:right w:val="none" w:sz="4" w:space="0" w:color="000000"/>
               </w:pBdr>
               <w:spacing w:line="252" w:lineRule="atLeast"/>
+              <w:jc w:val="both"/>
             </w:pPr>
             <w:hyperlink r:id="rId60" w:anchor="Anwendungen" w:tooltip="https://de.wikipedia.org/wiki/Ultraschall#Anwendungen" w:history="1">
               <w:r>
@@ -7415,19 +7197,14 @@
                 <w:right w:val="none" w:sz="4" w:space="0" w:color="000000"/>
               </w:pBdr>
               <w:spacing w:line="252" w:lineRule="atLeast"/>
+              <w:jc w:val="both"/>
             </w:pPr>
             <w:hyperlink r:id="rId61" w:tooltip="https://www.medica.de/de/News/Archiv/KI_Wie_intelligenter_Ultraschall_die_Krebsfr%C3%BCherkennung_revolutioniert" w:history="1">
               <w:r>
                 <w:rPr>
                   <w:rStyle w:val="Hyperlink"/>
                 </w:rPr>
-                <w:t>https://www.medica.de/de/News/Archiv/KI_Wie_intelligenter_Ultraschall_die_K</w:t>
-              </w:r>
-              <w:r>
-                <w:rPr>
-                  <w:rStyle w:val="Hyperlink"/>
-                </w:rPr>
-                <w:t>rebsfr%C3%BCherkennung_revolutioniert</w:t>
+                <w:t>https://www.medica.de/de/News/Archiv/KI_Wie_intelligenter_Ultraschall_die_Krebsfr%C3%BCherkennung_revolutioniert</w:t>
               </w:r>
             </w:hyperlink>
             <w:r>
@@ -7466,6 +7243,7 @@
                 <w:right w:val="none" w:sz="4" w:space="0" w:color="000000"/>
               </w:pBdr>
               <w:spacing w:line="252" w:lineRule="atLeast"/>
+              <w:jc w:val="both"/>
             </w:pPr>
             <w:r>
               <w:rPr>
@@ -7502,6 +7280,7 @@
                 <w:right w:val="none" w:sz="4" w:space="0" w:color="000000"/>
               </w:pBdr>
               <w:spacing w:line="252" w:lineRule="atLeast"/>
+              <w:jc w:val="both"/>
               <w:rPr>
                 <w:color w:val="000000"/>
               </w:rPr>
@@ -7522,6 +7301,7 @@
                 <w:right w:val="none" w:sz="4" w:space="0" w:color="000000"/>
               </w:pBdr>
               <w:spacing w:line="252" w:lineRule="atLeast"/>
+              <w:jc w:val="both"/>
               <w:rPr>
                 <w:color w:val="000000"/>
               </w:rPr>
@@ -7530,19 +7310,7 @@
               <w:rPr>
                 <w:color w:val="000000"/>
               </w:rPr>
-              <w:t>Dem</w:t>
-            </w:r>
-            <w:r>
-              <w:rPr>
-                <w:color w:val="000000"/>
-              </w:rPr>
-              <w:t xml:space="preserve"> steigenden Fachkräftebedarf kann (zumindest teilweise) mit speziellen Robotern entgegengewirkt werden. Vor allem in Japan wird an solchen Systemen geforscht. Mit Hilfe künstlicher Intelligenz sind diese Roboter in der Lage sich mit Menschen zu unterhalten</w:t>
-            </w:r>
-            <w:r>
-              <w:rPr>
-                <w:color w:val="000000"/>
-              </w:rPr>
-              <w:t xml:space="preserve"> oder im Notfall einen Hilferuf abzusetzen.</w:t>
+              <w:t>Dem steigenden Fachkräftebedarf kann (zumindest teilweise) mit speziellen Robotern entgegengewirkt werden. Vor allem in Japan wird an solchen Systemen geforscht. Mit Hilfe künstlicher Intelligenz sind diese Roboter in der Lage sich mit Menschen zu unterhalten oder im Notfall einen Hilferuf abzusetzen.</w:t>
             </w:r>
           </w:p>
           <w:p>
@@ -7559,6 +7327,7 @@
                 <w:right w:val="none" w:sz="4" w:space="0" w:color="000000"/>
               </w:pBdr>
               <w:spacing w:before="0" w:after="0" w:line="252" w:lineRule="atLeast"/>
+              <w:jc w:val="both"/>
               <w:rPr>
                 <w:color w:val="000000"/>
               </w:rPr>
@@ -7592,6 +7361,7 @@
                 <w:right w:val="none" w:sz="4" w:space="0" w:color="000000"/>
               </w:pBdr>
               <w:spacing w:before="0" w:after="0" w:line="252" w:lineRule="atLeast"/>
+              <w:jc w:val="both"/>
               <w:rPr>
                 <w:color w:val="000000"/>
               </w:rPr>
@@ -7601,13 +7371,7 @@
                 <w:rPr>
                   <w:rStyle w:val="Hyperlink"/>
                 </w:rPr>
-                <w:t>https://www.bmwi.de/Redaktion</w:t>
-              </w:r>
-              <w:r>
-                <w:rPr>
-                  <w:rStyle w:val="Hyperlink"/>
-                </w:rPr>
-                <w:t>/DE/Publikationen/Studien/einsatz-von-robotischen-systemen-pflege-japan.pdf?__blob=publicationFile&amp;v=4</w:t>
+                <w:t>https://www.bmwi.de/Redaktion/DE/Publikationen/Studien/einsatz-von-robotischen-systemen-pflege-japan.pdf?__blob=publicationFile&amp;v=4</w:t>
               </w:r>
             </w:hyperlink>
             <w:r>
@@ -7646,6 +7410,7 @@
                 <w:right w:val="none" w:sz="4" w:space="0" w:color="000000"/>
               </w:pBdr>
               <w:spacing w:line="252" w:lineRule="atLeast"/>
+              <w:jc w:val="both"/>
             </w:pPr>
             <w:r>
               <w:rPr>
@@ -7682,6 +7447,7 @@
                 <w:right w:val="none" w:sz="4" w:space="0" w:color="000000"/>
               </w:pBdr>
               <w:spacing w:line="252" w:lineRule="atLeast"/>
+              <w:jc w:val="both"/>
               <w:rPr>
                 <w:color w:val="000000"/>
               </w:rPr>
@@ -7702,6 +7468,7 @@
                 <w:right w:val="none" w:sz="4" w:space="0" w:color="000000"/>
               </w:pBdr>
               <w:spacing w:line="252" w:lineRule="atLeast"/>
+              <w:jc w:val="both"/>
               <w:rPr>
                 <w:color w:val="000000"/>
               </w:rPr>
@@ -7710,13 +7477,7 @@
               <w:rPr>
                 <w:color w:val="000000"/>
               </w:rPr>
-              <w:t xml:space="preserve">Ein elektrisches Rollo bzw. eine elektrische Jalousie ist an sich kein Beispiel für künstliche Intelligenz. </w:t>
-            </w:r>
-            <w:r>
-              <w:rPr>
-                <w:color w:val="000000"/>
-              </w:rPr>
-              <w:t>Im Kontext Smart-Home kann eine künstliche Intelligenz Aufgaben übernehmen, um den Komfort und sie Sicherheit zu verbessern oder den Energieverbrauch zu optimieren.</w:t>
+              <w:t>Ein elektrisches Rollo bzw. eine elektrische Jalousie ist an sich kein Beispiel für künstliche Intelligenz. Im Kontext Smart-Home kann eine künstliche Intelligenz Aufgaben übernehmen, um den Komfort und sie Sicherheit zu verbessern oder den Energieverbrauch zu optimieren.</w:t>
             </w:r>
           </w:p>
           <w:p>
@@ -7733,6 +7494,7 @@
                 <w:right w:val="none" w:sz="4" w:space="0" w:color="000000"/>
               </w:pBdr>
               <w:spacing w:before="0" w:after="0" w:line="252" w:lineRule="atLeast"/>
+              <w:jc w:val="both"/>
               <w:rPr>
                 <w:color w:val="000000"/>
               </w:rPr>
@@ -7766,6 +7528,7 @@
                 <w:right w:val="none" w:sz="4" w:space="0" w:color="000000"/>
               </w:pBdr>
               <w:spacing w:before="0" w:after="0" w:line="252" w:lineRule="atLeast"/>
+              <w:jc w:val="both"/>
               <w:rPr>
                 <w:color w:val="000000"/>
               </w:rPr>
@@ -7788,7 +7551,11 @@
         </w:tc>
       </w:tr>
     </w:tbl>
-    <w:p/>
+    <w:p>
+      <w:pPr>
+        <w:jc w:val="both"/>
+      </w:pPr>
+    </w:p>
     <w:sectPr>
       <w:headerReference w:type="default" r:id="rId66"/>
       <w:footerReference w:type="default" r:id="rId67"/>
@@ -7841,7 +7608,7 @@
 </file>
 
 <file path=word/endnotes.xml><?xml version="1.0" encoding="utf-8"?>
-<w:endnotes xmlns:wpc="http://schemas.microsoft.com/office/word/2010/wordprocessingCanvas" xmlns:cx="http://schemas.microsoft.com/office/drawing/2014/chartex" xmlns:cx1="http://schemas.microsoft.com/office/drawing/2015/9/8/chartex" xmlns:cx2="http://schemas.microsoft.com/office/drawing/2015/10/21/chartex" xmlns:cx3="http://schemas.microsoft.com/office/drawing/2016/5/9/chartex" xmlns:cx4="http://schemas.microsoft.com/office/drawing/2016/5/10/chartex" xmlns:cx5="http://schemas.microsoft.com/office/drawing/2016/5/11/chartex" xmlns:cx6="http://schemas.microsoft.com/office/drawing/2016/5/12/chartex" xmlns:cx7="http://schemas.microsoft.com/office/drawing/2016/5/13/chartex" xmlns:cx8="http://schemas.microsoft.com/office/drawing/2016/5/14/chartex" xmlns:mc="http://schemas.openxmlformats.org/markup-compatibility/2006" xmlns:aink="http://schemas.microsoft.com/office/drawing/2016/ink" xmlns:am3d="http://schemas.microsoft.com/office/drawing/2017/model3d" xmlns:o="urn:schemas-microsoft-com:office:office" xmlns:r="http://schemas.openxmlformats.org/officeDocument/2006/relationships" xmlns:m="http://schemas.openxmlformats.org/officeDocument/2006/math" xmlns:v="urn:schemas-microsoft-com:vml" xmlns:wp14="http://schemas.microsoft.com/office/word/2010/wordprocessingDrawing" xmlns:wp="http://schemas.openxmlformats.org/drawingml/2006/wordprocessingDrawing" xmlns:w10="urn:schemas-microsoft-com:office:word" xmlns:w="http://schemas.openxmlformats.org/wordprocessingml/2006/main" xmlns:w14="http://schemas.microsoft.com/office/word/2010/wordml" xmlns:w15="http://schemas.microsoft.com/office/word/2012/wordml" xmlns:w16cid="http://schemas.microsoft.com/office/word/2016/wordml/cid" xmlns:w16se="http://schemas.microsoft.com/office/word/2015/wordml/symex" xmlns:wpg="http://schemas.microsoft.com/office/word/2010/wordprocessingGroup" xmlns:wpi="http://schemas.microsoft.com/office/word/2010/wordprocessingInk" xmlns:wne="http://schemas.microsoft.com/office/word/2006/wordml" xmlns:wps="http://schemas.microsoft.com/office/word/2010/wordprocessingShape" mc:Ignorable="w14 w15 w16se w16cid wp14">
+<w:endnotes xmlns:wpc="http://schemas.microsoft.com/office/word/2010/wordprocessingCanvas" xmlns:cx="http://schemas.microsoft.com/office/drawing/2014/chartex" xmlns:cx1="http://schemas.microsoft.com/office/drawing/2015/9/8/chartex" xmlns:cx2="http://schemas.microsoft.com/office/drawing/2015/10/21/chartex" xmlns:cx3="http://schemas.microsoft.com/office/drawing/2016/5/9/chartex" xmlns:cx4="http://schemas.microsoft.com/office/drawing/2016/5/10/chartex" xmlns:cx5="http://schemas.microsoft.com/office/drawing/2016/5/11/chartex" xmlns:cx6="http://schemas.microsoft.com/office/drawing/2016/5/12/chartex" xmlns:cx7="http://schemas.microsoft.com/office/drawing/2016/5/13/chartex" xmlns:cx8="http://schemas.microsoft.com/office/drawing/2016/5/14/chartex" xmlns:mc="http://schemas.openxmlformats.org/markup-compatibility/2006" xmlns:aink="http://schemas.microsoft.com/office/drawing/2016/ink" xmlns:am3d="http://schemas.microsoft.com/office/drawing/2017/model3d" xmlns:o="urn:schemas-microsoft-com:office:office" xmlns:oel="http://schemas.microsoft.com/office/2019/extlst" xmlns:r="http://schemas.openxmlformats.org/officeDocument/2006/relationships" xmlns:m="http://schemas.openxmlformats.org/officeDocument/2006/math" xmlns:v="urn:schemas-microsoft-com:vml" xmlns:wp14="http://schemas.microsoft.com/office/word/2010/wordprocessingDrawing" xmlns:wp="http://schemas.openxmlformats.org/drawingml/2006/wordprocessingDrawing" xmlns:w10="urn:schemas-microsoft-com:office:word" xmlns:w="http://schemas.openxmlformats.org/wordprocessingml/2006/main" xmlns:w14="http://schemas.microsoft.com/office/word/2010/wordml" xmlns:w15="http://schemas.microsoft.com/office/word/2012/wordml" xmlns:w16cex="http://schemas.microsoft.com/office/word/2018/wordml/cex" xmlns:w16cid="http://schemas.microsoft.com/office/word/2016/wordml/cid" xmlns:w16="http://schemas.microsoft.com/office/word/2018/wordml" xmlns:w16du="http://schemas.microsoft.com/office/word/2023/wordml/word16du" xmlns:w16sdtdh="http://schemas.microsoft.com/office/word/2020/wordml/sdtdatahash" xmlns:w16se="http://schemas.microsoft.com/office/word/2015/wordml/symex" xmlns:wpg="http://schemas.microsoft.com/office/word/2010/wordprocessingGroup" xmlns:wpi="http://schemas.microsoft.com/office/word/2010/wordprocessingInk" xmlns:wne="http://schemas.microsoft.com/office/word/2006/wordml" xmlns:wps="http://schemas.microsoft.com/office/word/2010/wordprocessingShape" mc:Ignorable="w14 w15 w16se w16cid w16 w16cex w16sdtdh wp14">
   <w:endnote w:type="separator" w:id="-1">
     <w:p>
       <w:r>
@@ -7860,7 +7627,7 @@
 </file>
 
 <file path=word/footer1.xml><?xml version="1.0" encoding="utf-8"?>
-<w:ftr xmlns:wpc="http://schemas.microsoft.com/office/word/2010/wordprocessingCanvas" xmlns:cx="http://schemas.microsoft.com/office/drawing/2014/chartex" xmlns:cx1="http://schemas.microsoft.com/office/drawing/2015/9/8/chartex" xmlns:cx2="http://schemas.microsoft.com/office/drawing/2015/10/21/chartex" xmlns:cx3="http://schemas.microsoft.com/office/drawing/2016/5/9/chartex" xmlns:cx4="http://schemas.microsoft.com/office/drawing/2016/5/10/chartex" xmlns:cx5="http://schemas.microsoft.com/office/drawing/2016/5/11/chartex" xmlns:cx6="http://schemas.microsoft.com/office/drawing/2016/5/12/chartex" xmlns:cx7="http://schemas.microsoft.com/office/drawing/2016/5/13/chartex" xmlns:cx8="http://schemas.microsoft.com/office/drawing/2016/5/14/chartex" xmlns:mc="http://schemas.openxmlformats.org/markup-compatibility/2006" xmlns:aink="http://schemas.microsoft.com/office/drawing/2016/ink" xmlns:am3d="http://schemas.microsoft.com/office/drawing/2017/model3d" xmlns:o="urn:schemas-microsoft-com:office:office" xmlns:r="http://schemas.openxmlformats.org/officeDocument/2006/relationships" xmlns:m="http://schemas.openxmlformats.org/officeDocument/2006/math" xmlns:v="urn:schemas-microsoft-com:vml" xmlns:wp14="http://schemas.microsoft.com/office/word/2010/wordprocessingDrawing" xmlns:wp="http://schemas.openxmlformats.org/drawingml/2006/wordprocessingDrawing" xmlns:w10="urn:schemas-microsoft-com:office:word" xmlns:w="http://schemas.openxmlformats.org/wordprocessingml/2006/main" xmlns:w14="http://schemas.microsoft.com/office/word/2010/wordml" xmlns:w15="http://schemas.microsoft.com/office/word/2012/wordml" xmlns:w16cid="http://schemas.microsoft.com/office/word/2016/wordml/cid" xmlns:w16se="http://schemas.microsoft.com/office/word/2015/wordml/symex" xmlns:wpg="http://schemas.microsoft.com/office/word/2010/wordprocessingGroup" xmlns:wpi="http://schemas.microsoft.com/office/word/2010/wordprocessingInk" xmlns:wne="http://schemas.microsoft.com/office/word/2006/wordml" xmlns:wps="http://schemas.microsoft.com/office/word/2010/wordprocessingShape" mc:Ignorable="w14 w15 w16se w16cid wp14">
+<w:ftr xmlns:wpc="http://schemas.microsoft.com/office/word/2010/wordprocessingCanvas" xmlns:cx="http://schemas.microsoft.com/office/drawing/2014/chartex" xmlns:cx1="http://schemas.microsoft.com/office/drawing/2015/9/8/chartex" xmlns:cx2="http://schemas.microsoft.com/office/drawing/2015/10/21/chartex" xmlns:cx3="http://schemas.microsoft.com/office/drawing/2016/5/9/chartex" xmlns:cx4="http://schemas.microsoft.com/office/drawing/2016/5/10/chartex" xmlns:cx5="http://schemas.microsoft.com/office/drawing/2016/5/11/chartex" xmlns:cx6="http://schemas.microsoft.com/office/drawing/2016/5/12/chartex" xmlns:cx7="http://schemas.microsoft.com/office/drawing/2016/5/13/chartex" xmlns:cx8="http://schemas.microsoft.com/office/drawing/2016/5/14/chartex" xmlns:mc="http://schemas.openxmlformats.org/markup-compatibility/2006" xmlns:aink="http://schemas.microsoft.com/office/drawing/2016/ink" xmlns:am3d="http://schemas.microsoft.com/office/drawing/2017/model3d" xmlns:o="urn:schemas-microsoft-com:office:office" xmlns:oel="http://schemas.microsoft.com/office/2019/extlst" xmlns:r="http://schemas.openxmlformats.org/officeDocument/2006/relationships" xmlns:m="http://schemas.openxmlformats.org/officeDocument/2006/math" xmlns:v="urn:schemas-microsoft-com:vml" xmlns:wp14="http://schemas.microsoft.com/office/word/2010/wordprocessingDrawing" xmlns:wp="http://schemas.openxmlformats.org/drawingml/2006/wordprocessingDrawing" xmlns:w10="urn:schemas-microsoft-com:office:word" xmlns:w="http://schemas.openxmlformats.org/wordprocessingml/2006/main" xmlns:w14="http://schemas.microsoft.com/office/word/2010/wordml" xmlns:w15="http://schemas.microsoft.com/office/word/2012/wordml" xmlns:w16cex="http://schemas.microsoft.com/office/word/2018/wordml/cex" xmlns:w16cid="http://schemas.microsoft.com/office/word/2016/wordml/cid" xmlns:w16="http://schemas.microsoft.com/office/word/2018/wordml" xmlns:w16du="http://schemas.microsoft.com/office/word/2023/wordml/word16du" xmlns:w16sdtdh="http://schemas.microsoft.com/office/word/2020/wordml/sdtdatahash" xmlns:w16se="http://schemas.microsoft.com/office/word/2015/wordml/symex" xmlns:wpg="http://schemas.microsoft.com/office/word/2010/wordprocessingGroup" xmlns:wpi="http://schemas.microsoft.com/office/word/2010/wordprocessingInk" xmlns:wne="http://schemas.microsoft.com/office/word/2006/wordml" xmlns:wps="http://schemas.microsoft.com/office/word/2010/wordprocessingShape" mc:Ignorable="w14 w15 w16se w16cid w16 w16cex w16sdtdh wp14">
   <w:p>
     <w:pPr>
       <w:pStyle w:val="Fuzeile"/>
@@ -7870,7 +7637,7 @@
 </file>
 
 <file path=word/footer2.xml><?xml version="1.0" encoding="utf-8"?>
-<w:ftr xmlns:wpc="http://schemas.microsoft.com/office/word/2010/wordprocessingCanvas" xmlns:cx="http://schemas.microsoft.com/office/drawing/2014/chartex" xmlns:cx1="http://schemas.microsoft.com/office/drawing/2015/9/8/chartex" xmlns:cx2="http://schemas.microsoft.com/office/drawing/2015/10/21/chartex" xmlns:cx3="http://schemas.microsoft.com/office/drawing/2016/5/9/chartex" xmlns:cx4="http://schemas.microsoft.com/office/drawing/2016/5/10/chartex" xmlns:cx5="http://schemas.microsoft.com/office/drawing/2016/5/11/chartex" xmlns:cx6="http://schemas.microsoft.com/office/drawing/2016/5/12/chartex" xmlns:cx7="http://schemas.microsoft.com/office/drawing/2016/5/13/chartex" xmlns:cx8="http://schemas.microsoft.com/office/drawing/2016/5/14/chartex" xmlns:mc="http://schemas.openxmlformats.org/markup-compatibility/2006" xmlns:aink="http://schemas.microsoft.com/office/drawing/2016/ink" xmlns:am3d="http://schemas.microsoft.com/office/drawing/2017/model3d" xmlns:o="urn:schemas-microsoft-com:office:office" xmlns:r="http://schemas.openxmlformats.org/officeDocument/2006/relationships" xmlns:m="http://schemas.openxmlformats.org/officeDocument/2006/math" xmlns:v="urn:schemas-microsoft-com:vml" xmlns:wp14="http://schemas.microsoft.com/office/word/2010/wordprocessingDrawing" xmlns:wp="http://schemas.openxmlformats.org/drawingml/2006/wordprocessingDrawing" xmlns:w10="urn:schemas-microsoft-com:office:word" xmlns:w="http://schemas.openxmlformats.org/wordprocessingml/2006/main" xmlns:w14="http://schemas.microsoft.com/office/word/2010/wordml" xmlns:w15="http://schemas.microsoft.com/office/word/2012/wordml" xmlns:w16cid="http://schemas.microsoft.com/office/word/2016/wordml/cid" xmlns:w16se="http://schemas.microsoft.com/office/word/2015/wordml/symex" xmlns:wpg="http://schemas.microsoft.com/office/word/2010/wordprocessingGroup" xmlns:wpi="http://schemas.microsoft.com/office/word/2010/wordprocessingInk" xmlns:wne="http://schemas.microsoft.com/office/word/2006/wordml" xmlns:wps="http://schemas.microsoft.com/office/word/2010/wordprocessingShape" mc:Ignorable="w14 w15 w16se w16cid wp14">
+<w:ftr xmlns:wpc="http://schemas.microsoft.com/office/word/2010/wordprocessingCanvas" xmlns:cx="http://schemas.microsoft.com/office/drawing/2014/chartex" xmlns:cx1="http://schemas.microsoft.com/office/drawing/2015/9/8/chartex" xmlns:cx2="http://schemas.microsoft.com/office/drawing/2015/10/21/chartex" xmlns:cx3="http://schemas.microsoft.com/office/drawing/2016/5/9/chartex" xmlns:cx4="http://schemas.microsoft.com/office/drawing/2016/5/10/chartex" xmlns:cx5="http://schemas.microsoft.com/office/drawing/2016/5/11/chartex" xmlns:cx6="http://schemas.microsoft.com/office/drawing/2016/5/12/chartex" xmlns:cx7="http://schemas.microsoft.com/office/drawing/2016/5/13/chartex" xmlns:cx8="http://schemas.microsoft.com/office/drawing/2016/5/14/chartex" xmlns:mc="http://schemas.openxmlformats.org/markup-compatibility/2006" xmlns:aink="http://schemas.microsoft.com/office/drawing/2016/ink" xmlns:am3d="http://schemas.microsoft.com/office/drawing/2017/model3d" xmlns:o="urn:schemas-microsoft-com:office:office" xmlns:oel="http://schemas.microsoft.com/office/2019/extlst" xmlns:r="http://schemas.openxmlformats.org/officeDocument/2006/relationships" xmlns:m="http://schemas.openxmlformats.org/officeDocument/2006/math" xmlns:v="urn:schemas-microsoft-com:vml" xmlns:wp14="http://schemas.microsoft.com/office/word/2010/wordprocessingDrawing" xmlns:wp="http://schemas.openxmlformats.org/drawingml/2006/wordprocessingDrawing" xmlns:w10="urn:schemas-microsoft-com:office:word" xmlns:w="http://schemas.openxmlformats.org/wordprocessingml/2006/main" xmlns:w14="http://schemas.microsoft.com/office/word/2010/wordml" xmlns:w15="http://schemas.microsoft.com/office/word/2012/wordml" xmlns:w16cex="http://schemas.microsoft.com/office/word/2018/wordml/cex" xmlns:w16cid="http://schemas.microsoft.com/office/word/2016/wordml/cid" xmlns:w16="http://schemas.microsoft.com/office/word/2018/wordml" xmlns:w16du="http://schemas.microsoft.com/office/word/2023/wordml/word16du" xmlns:w16sdtdh="http://schemas.microsoft.com/office/word/2020/wordml/sdtdatahash" xmlns:w16se="http://schemas.microsoft.com/office/word/2015/wordml/symex" xmlns:wpg="http://schemas.microsoft.com/office/word/2010/wordprocessingGroup" xmlns:wpi="http://schemas.microsoft.com/office/word/2010/wordprocessingInk" xmlns:wne="http://schemas.microsoft.com/office/word/2006/wordml" xmlns:wps="http://schemas.microsoft.com/office/word/2010/wordprocessingShape" mc:Ignorable="w14 w15 w16se w16cid w16 w16cex w16sdtdh wp14">
   <w:p>
     <w:pPr>
       <w:pStyle w:val="Kopfzeile"/>
@@ -7894,7 +7661,7 @@
       <mc:AlternateContent>
         <mc:Choice Requires="wpg">
           <w:drawing>
-            <wp:anchor distT="0" distB="0" distL="114300" distR="114300" simplePos="0" relativeHeight="251654144" behindDoc="0" locked="0" layoutInCell="1" allowOverlap="1">
+            <wp:anchor distT="0" distB="0" distL="114300" distR="114300" simplePos="0" relativeHeight="251654144" behindDoc="0" locked="0" layoutInCell="1" allowOverlap="1" wp14:anchorId="0A23D5B2" wp14:editId="1BC9C7A9">
               <wp:simplePos x="0" y="0"/>
               <wp:positionH relativeFrom="column">
                 <wp:posOffset>4552</wp:posOffset>
@@ -7981,15 +7748,7 @@
       <w:rPr>
         <w:sz w:val="18"/>
       </w:rPr>
-      <w:t>1</w:t>
-    </w:r>
-    <w:bookmarkStart w:id="0" w:name="_GoBack"/>
-    <w:bookmarkEnd w:id="0"/>
-    <w:r>
-      <w:rPr>
-        <w:sz w:val="18"/>
-      </w:rPr>
-      <w:t>3</w:t>
+      <w:t>13</w:t>
     </w:r>
     <w:r>
       <w:rPr>
@@ -8084,7 +7843,7 @@
 </file>
 
 <file path=word/footer3.xml><?xml version="1.0" encoding="utf-8"?>
-<w:ftr xmlns:wpc="http://schemas.microsoft.com/office/word/2010/wordprocessingCanvas" xmlns:cx="http://schemas.microsoft.com/office/drawing/2014/chartex" xmlns:cx1="http://schemas.microsoft.com/office/drawing/2015/9/8/chartex" xmlns:cx2="http://schemas.microsoft.com/office/drawing/2015/10/21/chartex" xmlns:cx3="http://schemas.microsoft.com/office/drawing/2016/5/9/chartex" xmlns:cx4="http://schemas.microsoft.com/office/drawing/2016/5/10/chartex" xmlns:cx5="http://schemas.microsoft.com/office/drawing/2016/5/11/chartex" xmlns:cx6="http://schemas.microsoft.com/office/drawing/2016/5/12/chartex" xmlns:cx7="http://schemas.microsoft.com/office/drawing/2016/5/13/chartex" xmlns:cx8="http://schemas.microsoft.com/office/drawing/2016/5/14/chartex" xmlns:mc="http://schemas.openxmlformats.org/markup-compatibility/2006" xmlns:aink="http://schemas.microsoft.com/office/drawing/2016/ink" xmlns:am3d="http://schemas.microsoft.com/office/drawing/2017/model3d" xmlns:o="urn:schemas-microsoft-com:office:office" xmlns:r="http://schemas.openxmlformats.org/officeDocument/2006/relationships" xmlns:m="http://schemas.openxmlformats.org/officeDocument/2006/math" xmlns:v="urn:schemas-microsoft-com:vml" xmlns:wp14="http://schemas.microsoft.com/office/word/2010/wordprocessingDrawing" xmlns:wp="http://schemas.openxmlformats.org/drawingml/2006/wordprocessingDrawing" xmlns:w10="urn:schemas-microsoft-com:office:word" xmlns:w="http://schemas.openxmlformats.org/wordprocessingml/2006/main" xmlns:w14="http://schemas.microsoft.com/office/word/2010/wordml" xmlns:w15="http://schemas.microsoft.com/office/word/2012/wordml" xmlns:w16cid="http://schemas.microsoft.com/office/word/2016/wordml/cid" xmlns:w16se="http://schemas.microsoft.com/office/word/2015/wordml/symex" xmlns:wpg="http://schemas.microsoft.com/office/word/2010/wordprocessingGroup" xmlns:wpi="http://schemas.microsoft.com/office/word/2010/wordprocessingInk" xmlns:wne="http://schemas.microsoft.com/office/word/2006/wordml" xmlns:wps="http://schemas.microsoft.com/office/word/2010/wordprocessingShape" mc:Ignorable="w14 w15 w16se w16cid wp14">
+<w:ftr xmlns:wpc="http://schemas.microsoft.com/office/word/2010/wordprocessingCanvas" xmlns:cx="http://schemas.microsoft.com/office/drawing/2014/chartex" xmlns:cx1="http://schemas.microsoft.com/office/drawing/2015/9/8/chartex" xmlns:cx2="http://schemas.microsoft.com/office/drawing/2015/10/21/chartex" xmlns:cx3="http://schemas.microsoft.com/office/drawing/2016/5/9/chartex" xmlns:cx4="http://schemas.microsoft.com/office/drawing/2016/5/10/chartex" xmlns:cx5="http://schemas.microsoft.com/office/drawing/2016/5/11/chartex" xmlns:cx6="http://schemas.microsoft.com/office/drawing/2016/5/12/chartex" xmlns:cx7="http://schemas.microsoft.com/office/drawing/2016/5/13/chartex" xmlns:cx8="http://schemas.microsoft.com/office/drawing/2016/5/14/chartex" xmlns:mc="http://schemas.openxmlformats.org/markup-compatibility/2006" xmlns:aink="http://schemas.microsoft.com/office/drawing/2016/ink" xmlns:am3d="http://schemas.microsoft.com/office/drawing/2017/model3d" xmlns:o="urn:schemas-microsoft-com:office:office" xmlns:oel="http://schemas.microsoft.com/office/2019/extlst" xmlns:r="http://schemas.openxmlformats.org/officeDocument/2006/relationships" xmlns:m="http://schemas.openxmlformats.org/officeDocument/2006/math" xmlns:v="urn:schemas-microsoft-com:vml" xmlns:wp14="http://schemas.microsoft.com/office/word/2010/wordprocessingDrawing" xmlns:wp="http://schemas.openxmlformats.org/drawingml/2006/wordprocessingDrawing" xmlns:w10="urn:schemas-microsoft-com:office:word" xmlns:w="http://schemas.openxmlformats.org/wordprocessingml/2006/main" xmlns:w14="http://schemas.microsoft.com/office/word/2010/wordml" xmlns:w15="http://schemas.microsoft.com/office/word/2012/wordml" xmlns:w16cex="http://schemas.microsoft.com/office/word/2018/wordml/cex" xmlns:w16cid="http://schemas.microsoft.com/office/word/2016/wordml/cid" xmlns:w16="http://schemas.microsoft.com/office/word/2018/wordml" xmlns:w16du="http://schemas.microsoft.com/office/word/2023/wordml/word16du" xmlns:w16sdtdh="http://schemas.microsoft.com/office/word/2020/wordml/sdtdatahash" xmlns:w16se="http://schemas.microsoft.com/office/word/2015/wordml/symex" xmlns:wpg="http://schemas.microsoft.com/office/word/2010/wordprocessingGroup" xmlns:wpi="http://schemas.microsoft.com/office/word/2010/wordprocessingInk" xmlns:wne="http://schemas.microsoft.com/office/word/2006/wordml" xmlns:wps="http://schemas.microsoft.com/office/word/2010/wordprocessingShape" mc:Ignorable="w14 w15 w16se w16cid w16 w16cex w16sdtdh wp14">
   <w:p>
     <w:pPr>
       <w:pStyle w:val="Fuzeile"/>
@@ -8094,7 +7853,7 @@
 </file>
 
 <file path=word/footer4.xml><?xml version="1.0" encoding="utf-8"?>
-<w:ftr xmlns:wpc="http://schemas.microsoft.com/office/word/2010/wordprocessingCanvas" xmlns:cx="http://schemas.microsoft.com/office/drawing/2014/chartex" xmlns:cx1="http://schemas.microsoft.com/office/drawing/2015/9/8/chartex" xmlns:cx2="http://schemas.microsoft.com/office/drawing/2015/10/21/chartex" xmlns:cx3="http://schemas.microsoft.com/office/drawing/2016/5/9/chartex" xmlns:cx4="http://schemas.microsoft.com/office/drawing/2016/5/10/chartex" xmlns:cx5="http://schemas.microsoft.com/office/drawing/2016/5/11/chartex" xmlns:cx6="http://schemas.microsoft.com/office/drawing/2016/5/12/chartex" xmlns:cx7="http://schemas.microsoft.com/office/drawing/2016/5/13/chartex" xmlns:cx8="http://schemas.microsoft.com/office/drawing/2016/5/14/chartex" xmlns:mc="http://schemas.openxmlformats.org/markup-compatibility/2006" xmlns:aink="http://schemas.microsoft.com/office/drawing/2016/ink" xmlns:am3d="http://schemas.microsoft.com/office/drawing/2017/model3d" xmlns:o="urn:schemas-microsoft-com:office:office" xmlns:r="http://schemas.openxmlformats.org/officeDocument/2006/relationships" xmlns:m="http://schemas.openxmlformats.org/officeDocument/2006/math" xmlns:v="urn:schemas-microsoft-com:vml" xmlns:wp14="http://schemas.microsoft.com/office/word/2010/wordprocessingDrawing" xmlns:wp="http://schemas.openxmlformats.org/drawingml/2006/wordprocessingDrawing" xmlns:w10="urn:schemas-microsoft-com:office:word" xmlns:w="http://schemas.openxmlformats.org/wordprocessingml/2006/main" xmlns:w14="http://schemas.microsoft.com/office/word/2010/wordml" xmlns:w15="http://schemas.microsoft.com/office/word/2012/wordml" xmlns:w16cid="http://schemas.microsoft.com/office/word/2016/wordml/cid" xmlns:w16se="http://schemas.microsoft.com/office/word/2015/wordml/symex" xmlns:wpg="http://schemas.microsoft.com/office/word/2010/wordprocessingGroup" xmlns:wpi="http://schemas.microsoft.com/office/word/2010/wordprocessingInk" xmlns:wne="http://schemas.microsoft.com/office/word/2006/wordml" xmlns:wps="http://schemas.microsoft.com/office/word/2010/wordprocessingShape" mc:Ignorable="w14 w15 w16se w16cid wp14">
+<w:ftr xmlns:wpc="http://schemas.microsoft.com/office/word/2010/wordprocessingCanvas" xmlns:cx="http://schemas.microsoft.com/office/drawing/2014/chartex" xmlns:cx1="http://schemas.microsoft.com/office/drawing/2015/9/8/chartex" xmlns:cx2="http://schemas.microsoft.com/office/drawing/2015/10/21/chartex" xmlns:cx3="http://schemas.microsoft.com/office/drawing/2016/5/9/chartex" xmlns:cx4="http://schemas.microsoft.com/office/drawing/2016/5/10/chartex" xmlns:cx5="http://schemas.microsoft.com/office/drawing/2016/5/11/chartex" xmlns:cx6="http://schemas.microsoft.com/office/drawing/2016/5/12/chartex" xmlns:cx7="http://schemas.microsoft.com/office/drawing/2016/5/13/chartex" xmlns:cx8="http://schemas.microsoft.com/office/drawing/2016/5/14/chartex" xmlns:mc="http://schemas.openxmlformats.org/markup-compatibility/2006" xmlns:aink="http://schemas.microsoft.com/office/drawing/2016/ink" xmlns:am3d="http://schemas.microsoft.com/office/drawing/2017/model3d" xmlns:o="urn:schemas-microsoft-com:office:office" xmlns:oel="http://schemas.microsoft.com/office/2019/extlst" xmlns:r="http://schemas.openxmlformats.org/officeDocument/2006/relationships" xmlns:m="http://schemas.openxmlformats.org/officeDocument/2006/math" xmlns:v="urn:schemas-microsoft-com:vml" xmlns:wp14="http://schemas.microsoft.com/office/word/2010/wordprocessingDrawing" xmlns:wp="http://schemas.openxmlformats.org/drawingml/2006/wordprocessingDrawing" xmlns:w10="urn:schemas-microsoft-com:office:word" xmlns:w="http://schemas.openxmlformats.org/wordprocessingml/2006/main" xmlns:w14="http://schemas.microsoft.com/office/word/2010/wordml" xmlns:w15="http://schemas.microsoft.com/office/word/2012/wordml" xmlns:w16cex="http://schemas.microsoft.com/office/word/2018/wordml/cex" xmlns:w16cid="http://schemas.microsoft.com/office/word/2016/wordml/cid" xmlns:w16="http://schemas.microsoft.com/office/word/2018/wordml" xmlns:w16du="http://schemas.microsoft.com/office/word/2023/wordml/word16du" xmlns:w16sdtdh="http://schemas.microsoft.com/office/word/2020/wordml/sdtdatahash" xmlns:w16se="http://schemas.microsoft.com/office/word/2015/wordml/symex" xmlns:wpg="http://schemas.microsoft.com/office/word/2010/wordprocessingGroup" xmlns:wpi="http://schemas.microsoft.com/office/word/2010/wordprocessingInk" xmlns:wne="http://schemas.microsoft.com/office/word/2006/wordml" xmlns:wps="http://schemas.microsoft.com/office/word/2010/wordprocessingShape" mc:Ignorable="w14 w15 w16se w16cid w16 w16cex w16sdtdh wp14">
   <w:p>
     <w:pPr>
       <w:pStyle w:val="Kopfzeile"/>
@@ -8118,7 +7877,7 @@
       <mc:AlternateContent>
         <mc:Choice Requires="wpg">
           <w:drawing>
-            <wp:anchor distT="0" distB="0" distL="114300" distR="114300" simplePos="0" relativeHeight="251661312" behindDoc="0" locked="0" layoutInCell="1" allowOverlap="1">
+            <wp:anchor distT="0" distB="0" distL="114300" distR="114300" simplePos="0" relativeHeight="251661312" behindDoc="0" locked="0" layoutInCell="1" allowOverlap="1" wp14:anchorId="4632F058" wp14:editId="2B3B31F1">
               <wp:simplePos x="0" y="0"/>
               <wp:positionH relativeFrom="column">
                 <wp:posOffset>6000115</wp:posOffset>
@@ -8178,7 +7937,7 @@
                             </w:pPr>
                             <w:r>
                               <w:rPr>
-                                <w:rFonts w:ascii="helvetica 55" w:hAnsi="helvetica 55"/>
+                                <w:rFonts w:ascii="Helvetica 55" w:hAnsi="Helvetica 55"/>
                                 <w:color w:val="A6A6A6" w:themeColor="background1" w:themeShade="A6"/>
                                 <w:sz w:val="14"/>
                                 <w:szCs w:val="14"/>
@@ -8335,7 +8094,7 @@
       <mc:AlternateContent>
         <mc:Choice Requires="wpg">
           <w:drawing>
-            <wp:anchor distT="0" distB="0" distL="114300" distR="114300" simplePos="0" relativeHeight="251655168" behindDoc="0" locked="0" layoutInCell="1" allowOverlap="1">
+            <wp:anchor distT="0" distB="0" distL="114300" distR="114300" simplePos="0" relativeHeight="251655168" behindDoc="0" locked="0" layoutInCell="1" allowOverlap="1" wp14:anchorId="18F7B974" wp14:editId="729254E1">
               <wp:simplePos x="0" y="0"/>
               <wp:positionH relativeFrom="column">
                 <wp:posOffset>6985</wp:posOffset>
@@ -8416,14 +8175,7 @@
         <w:sz w:val="18"/>
       </w:rPr>
       <w:tab/>
-      <w:t xml:space="preserve">zuletzt aktualisiert </w:t>
-    </w:r>
-    <w:proofErr w:type="gramStart"/>
-    <w:r>
-      <w:rPr>
-        <w:sz w:val="18"/>
-      </w:rPr>
-      <w:t xml:space="preserve">am  </w:t>
+      <w:t xml:space="preserve">zuletzt aktualisiert am  </w:t>
     </w:r>
     <w:r>
       <w:rPr>
@@ -8435,14 +8187,7 @@
       <w:rPr>
         <w:sz w:val="18"/>
       </w:rPr>
-      <w:t>.</w:t>
-    </w:r>
-    <w:proofErr w:type="gramEnd"/>
-    <w:r>
-      <w:rPr>
-        <w:sz w:val="18"/>
-      </w:rPr>
-      <w:t>12.22</w:t>
+      <w:t>.12.22</w:t>
     </w:r>
     <w:r>
       <w:rPr>
@@ -8494,13 +8239,7 @@
       <w:rPr>
         <w:sz w:val="18"/>
       </w:rPr>
-      <w:t xml:space="preserve"> v</w:t>
-    </w:r>
-    <w:r>
-      <w:rPr>
-        <w:sz w:val="18"/>
-      </w:rPr>
-      <w:t xml:space="preserve">on </w:t>
+      <w:t xml:space="preserve"> von </w:t>
     </w:r>
     <w:r>
       <w:rPr>
@@ -8537,7 +8276,7 @@
 </file>
 
 <file path=word/footnotes.xml><?xml version="1.0" encoding="utf-8"?>
-<w:footnotes xmlns:wpc="http://schemas.microsoft.com/office/word/2010/wordprocessingCanvas" xmlns:cx="http://schemas.microsoft.com/office/drawing/2014/chartex" xmlns:cx1="http://schemas.microsoft.com/office/drawing/2015/9/8/chartex" xmlns:cx2="http://schemas.microsoft.com/office/drawing/2015/10/21/chartex" xmlns:cx3="http://schemas.microsoft.com/office/drawing/2016/5/9/chartex" xmlns:cx4="http://schemas.microsoft.com/office/drawing/2016/5/10/chartex" xmlns:cx5="http://schemas.microsoft.com/office/drawing/2016/5/11/chartex" xmlns:cx6="http://schemas.microsoft.com/office/drawing/2016/5/12/chartex" xmlns:cx7="http://schemas.microsoft.com/office/drawing/2016/5/13/chartex" xmlns:cx8="http://schemas.microsoft.com/office/drawing/2016/5/14/chartex" xmlns:mc="http://schemas.openxmlformats.org/markup-compatibility/2006" xmlns:aink="http://schemas.microsoft.com/office/drawing/2016/ink" xmlns:am3d="http://schemas.microsoft.com/office/drawing/2017/model3d" xmlns:o="urn:schemas-microsoft-com:office:office" xmlns:r="http://schemas.openxmlformats.org/officeDocument/2006/relationships" xmlns:m="http://schemas.openxmlformats.org/officeDocument/2006/math" xmlns:v="urn:schemas-microsoft-com:vml" xmlns:wp14="http://schemas.microsoft.com/office/word/2010/wordprocessingDrawing" xmlns:wp="http://schemas.openxmlformats.org/drawingml/2006/wordprocessingDrawing" xmlns:w10="urn:schemas-microsoft-com:office:word" xmlns:w="http://schemas.openxmlformats.org/wordprocessingml/2006/main" xmlns:w14="http://schemas.microsoft.com/office/word/2010/wordml" xmlns:w15="http://schemas.microsoft.com/office/word/2012/wordml" xmlns:w16cid="http://schemas.microsoft.com/office/word/2016/wordml/cid" xmlns:w16se="http://schemas.microsoft.com/office/word/2015/wordml/symex" xmlns:wpg="http://schemas.microsoft.com/office/word/2010/wordprocessingGroup" xmlns:wpi="http://schemas.microsoft.com/office/word/2010/wordprocessingInk" xmlns:wne="http://schemas.microsoft.com/office/word/2006/wordml" xmlns:wps="http://schemas.microsoft.com/office/word/2010/wordprocessingShape" mc:Ignorable="w14 w15 w16se w16cid wp14">
+<w:footnotes xmlns:wpc="http://schemas.microsoft.com/office/word/2010/wordprocessingCanvas" xmlns:cx="http://schemas.microsoft.com/office/drawing/2014/chartex" xmlns:cx1="http://schemas.microsoft.com/office/drawing/2015/9/8/chartex" xmlns:cx2="http://schemas.microsoft.com/office/drawing/2015/10/21/chartex" xmlns:cx3="http://schemas.microsoft.com/office/drawing/2016/5/9/chartex" xmlns:cx4="http://schemas.microsoft.com/office/drawing/2016/5/10/chartex" xmlns:cx5="http://schemas.microsoft.com/office/drawing/2016/5/11/chartex" xmlns:cx6="http://schemas.microsoft.com/office/drawing/2016/5/12/chartex" xmlns:cx7="http://schemas.microsoft.com/office/drawing/2016/5/13/chartex" xmlns:cx8="http://schemas.microsoft.com/office/drawing/2016/5/14/chartex" xmlns:mc="http://schemas.openxmlformats.org/markup-compatibility/2006" xmlns:aink="http://schemas.microsoft.com/office/drawing/2016/ink" xmlns:am3d="http://schemas.microsoft.com/office/drawing/2017/model3d" xmlns:o="urn:schemas-microsoft-com:office:office" xmlns:oel="http://schemas.microsoft.com/office/2019/extlst" xmlns:r="http://schemas.openxmlformats.org/officeDocument/2006/relationships" xmlns:m="http://schemas.openxmlformats.org/officeDocument/2006/math" xmlns:v="urn:schemas-microsoft-com:vml" xmlns:wp14="http://schemas.microsoft.com/office/word/2010/wordprocessingDrawing" xmlns:wp="http://schemas.openxmlformats.org/drawingml/2006/wordprocessingDrawing" xmlns:w10="urn:schemas-microsoft-com:office:word" xmlns:w="http://schemas.openxmlformats.org/wordprocessingml/2006/main" xmlns:w14="http://schemas.microsoft.com/office/word/2010/wordml" xmlns:w15="http://schemas.microsoft.com/office/word/2012/wordml" xmlns:w16cex="http://schemas.microsoft.com/office/word/2018/wordml/cex" xmlns:w16cid="http://schemas.microsoft.com/office/word/2016/wordml/cid" xmlns:w16="http://schemas.microsoft.com/office/word/2018/wordml" xmlns:w16du="http://schemas.microsoft.com/office/word/2023/wordml/word16du" xmlns:w16sdtdh="http://schemas.microsoft.com/office/word/2020/wordml/sdtdatahash" xmlns:w16se="http://schemas.microsoft.com/office/word/2015/wordml/symex" xmlns:wpg="http://schemas.microsoft.com/office/word/2010/wordprocessingGroup" xmlns:wpi="http://schemas.microsoft.com/office/word/2010/wordprocessingInk" xmlns:wne="http://schemas.microsoft.com/office/word/2006/wordml" xmlns:wps="http://schemas.microsoft.com/office/word/2010/wordprocessingShape" mc:Ignorable="w14 w15 w16se w16cid w16 w16cex w16sdtdh wp14">
   <w:footnote w:type="separator" w:id="-1">
     <w:p>
       <w:r>
@@ -8556,7 +8295,7 @@
 </file>
 
 <file path=word/header1.xml><?xml version="1.0" encoding="utf-8"?>
-<w:hdr xmlns:wpc="http://schemas.microsoft.com/office/word/2010/wordprocessingCanvas" xmlns:cx="http://schemas.microsoft.com/office/drawing/2014/chartex" xmlns:cx1="http://schemas.microsoft.com/office/drawing/2015/9/8/chartex" xmlns:cx2="http://schemas.microsoft.com/office/drawing/2015/10/21/chartex" xmlns:cx3="http://schemas.microsoft.com/office/drawing/2016/5/9/chartex" xmlns:cx4="http://schemas.microsoft.com/office/drawing/2016/5/10/chartex" xmlns:cx5="http://schemas.microsoft.com/office/drawing/2016/5/11/chartex" xmlns:cx6="http://schemas.microsoft.com/office/drawing/2016/5/12/chartex" xmlns:cx7="http://schemas.microsoft.com/office/drawing/2016/5/13/chartex" xmlns:cx8="http://schemas.microsoft.com/office/drawing/2016/5/14/chartex" xmlns:mc="http://schemas.openxmlformats.org/markup-compatibility/2006" xmlns:aink="http://schemas.microsoft.com/office/drawing/2016/ink" xmlns:am3d="http://schemas.microsoft.com/office/drawing/2017/model3d" xmlns:o="urn:schemas-microsoft-com:office:office" xmlns:r="http://schemas.openxmlformats.org/officeDocument/2006/relationships" xmlns:m="http://schemas.openxmlformats.org/officeDocument/2006/math" xmlns:v="urn:schemas-microsoft-com:vml" xmlns:wp14="http://schemas.microsoft.com/office/word/2010/wordprocessingDrawing" xmlns:wp="http://schemas.openxmlformats.org/drawingml/2006/wordprocessingDrawing" xmlns:w10="urn:schemas-microsoft-com:office:word" xmlns:w="http://schemas.openxmlformats.org/wordprocessingml/2006/main" xmlns:w14="http://schemas.microsoft.com/office/word/2010/wordml" xmlns:w15="http://schemas.microsoft.com/office/word/2012/wordml" xmlns:w16cid="http://schemas.microsoft.com/office/word/2016/wordml/cid" xmlns:w16se="http://schemas.microsoft.com/office/word/2015/wordml/symex" xmlns:wpg="http://schemas.microsoft.com/office/word/2010/wordprocessingGroup" xmlns:wpi="http://schemas.microsoft.com/office/word/2010/wordprocessingInk" xmlns:wne="http://schemas.microsoft.com/office/word/2006/wordml" xmlns:wps="http://schemas.microsoft.com/office/word/2010/wordprocessingShape" mc:Ignorable="w14 w15 w16se w16cid wp14">
+<w:hdr xmlns:wpc="http://schemas.microsoft.com/office/word/2010/wordprocessingCanvas" xmlns:cx="http://schemas.microsoft.com/office/drawing/2014/chartex" xmlns:cx1="http://schemas.microsoft.com/office/drawing/2015/9/8/chartex" xmlns:cx2="http://schemas.microsoft.com/office/drawing/2015/10/21/chartex" xmlns:cx3="http://schemas.microsoft.com/office/drawing/2016/5/9/chartex" xmlns:cx4="http://schemas.microsoft.com/office/drawing/2016/5/10/chartex" xmlns:cx5="http://schemas.microsoft.com/office/drawing/2016/5/11/chartex" xmlns:cx6="http://schemas.microsoft.com/office/drawing/2016/5/12/chartex" xmlns:cx7="http://schemas.microsoft.com/office/drawing/2016/5/13/chartex" xmlns:cx8="http://schemas.microsoft.com/office/drawing/2016/5/14/chartex" xmlns:mc="http://schemas.openxmlformats.org/markup-compatibility/2006" xmlns:aink="http://schemas.microsoft.com/office/drawing/2016/ink" xmlns:am3d="http://schemas.microsoft.com/office/drawing/2017/model3d" xmlns:o="urn:schemas-microsoft-com:office:office" xmlns:oel="http://schemas.microsoft.com/office/2019/extlst" xmlns:r="http://schemas.openxmlformats.org/officeDocument/2006/relationships" xmlns:m="http://schemas.openxmlformats.org/officeDocument/2006/math" xmlns:v="urn:schemas-microsoft-com:vml" xmlns:wp14="http://schemas.microsoft.com/office/word/2010/wordprocessingDrawing" xmlns:wp="http://schemas.openxmlformats.org/drawingml/2006/wordprocessingDrawing" xmlns:w10="urn:schemas-microsoft-com:office:word" xmlns:w="http://schemas.openxmlformats.org/wordprocessingml/2006/main" xmlns:w14="http://schemas.microsoft.com/office/word/2010/wordml" xmlns:w15="http://schemas.microsoft.com/office/word/2012/wordml" xmlns:w16cex="http://schemas.microsoft.com/office/word/2018/wordml/cex" xmlns:w16cid="http://schemas.microsoft.com/office/word/2016/wordml/cid" xmlns:w16="http://schemas.microsoft.com/office/word/2018/wordml" xmlns:w16du="http://schemas.microsoft.com/office/word/2023/wordml/word16du" xmlns:w16sdtdh="http://schemas.microsoft.com/office/word/2020/wordml/sdtdatahash" xmlns:w16se="http://schemas.microsoft.com/office/word/2015/wordml/symex" xmlns:wpg="http://schemas.microsoft.com/office/word/2010/wordprocessingGroup" xmlns:wpi="http://schemas.microsoft.com/office/word/2010/wordprocessingInk" xmlns:wne="http://schemas.microsoft.com/office/word/2006/wordml" xmlns:wps="http://schemas.microsoft.com/office/word/2010/wordprocessingShape" mc:Ignorable="w14 w15 w16se w16cid w16 w16cex w16sdtdh wp14">
   <w:p>
     <w:pPr>
       <w:pStyle w:val="Kopfzeile"/>
@@ -8566,7 +8305,7 @@
 </file>
 
 <file path=word/header2.xml><?xml version="1.0" encoding="utf-8"?>
-<w:hdr xmlns:wpc="http://schemas.microsoft.com/office/word/2010/wordprocessingCanvas" xmlns:cx="http://schemas.microsoft.com/office/drawing/2014/chartex" xmlns:cx1="http://schemas.microsoft.com/office/drawing/2015/9/8/chartex" xmlns:cx2="http://schemas.microsoft.com/office/drawing/2015/10/21/chartex" xmlns:cx3="http://schemas.microsoft.com/office/drawing/2016/5/9/chartex" xmlns:cx4="http://schemas.microsoft.com/office/drawing/2016/5/10/chartex" xmlns:cx5="http://schemas.microsoft.com/office/drawing/2016/5/11/chartex" xmlns:cx6="http://schemas.microsoft.com/office/drawing/2016/5/12/chartex" xmlns:cx7="http://schemas.microsoft.com/office/drawing/2016/5/13/chartex" xmlns:cx8="http://schemas.microsoft.com/office/drawing/2016/5/14/chartex" xmlns:mc="http://schemas.openxmlformats.org/markup-compatibility/2006" xmlns:aink="http://schemas.microsoft.com/office/drawing/2016/ink" xmlns:am3d="http://schemas.microsoft.com/office/drawing/2017/model3d" xmlns:o="urn:schemas-microsoft-com:office:office" xmlns:r="http://schemas.openxmlformats.org/officeDocument/2006/relationships" xmlns:m="http://schemas.openxmlformats.org/officeDocument/2006/math" xmlns:v="urn:schemas-microsoft-com:vml" xmlns:wp14="http://schemas.microsoft.com/office/word/2010/wordprocessingDrawing" xmlns:wp="http://schemas.openxmlformats.org/drawingml/2006/wordprocessingDrawing" xmlns:w10="urn:schemas-microsoft-com:office:word" xmlns:w="http://schemas.openxmlformats.org/wordprocessingml/2006/main" xmlns:w14="http://schemas.microsoft.com/office/word/2010/wordml" xmlns:w15="http://schemas.microsoft.com/office/word/2012/wordml" xmlns:w16cid="http://schemas.microsoft.com/office/word/2016/wordml/cid" xmlns:w16se="http://schemas.microsoft.com/office/word/2015/wordml/symex" xmlns:wpg="http://schemas.microsoft.com/office/word/2010/wordprocessingGroup" xmlns:wpi="http://schemas.microsoft.com/office/word/2010/wordprocessingInk" xmlns:wne="http://schemas.microsoft.com/office/word/2006/wordml" xmlns:wps="http://schemas.microsoft.com/office/word/2010/wordprocessingShape" mc:Ignorable="w14 w15 w16se w16cid wp14">
+<w:hdr xmlns:wpc="http://schemas.microsoft.com/office/word/2010/wordprocessingCanvas" xmlns:cx="http://schemas.microsoft.com/office/drawing/2014/chartex" xmlns:cx1="http://schemas.microsoft.com/office/drawing/2015/9/8/chartex" xmlns:cx2="http://schemas.microsoft.com/office/drawing/2015/10/21/chartex" xmlns:cx3="http://schemas.microsoft.com/office/drawing/2016/5/9/chartex" xmlns:cx4="http://schemas.microsoft.com/office/drawing/2016/5/10/chartex" xmlns:cx5="http://schemas.microsoft.com/office/drawing/2016/5/11/chartex" xmlns:cx6="http://schemas.microsoft.com/office/drawing/2016/5/12/chartex" xmlns:cx7="http://schemas.microsoft.com/office/drawing/2016/5/13/chartex" xmlns:cx8="http://schemas.microsoft.com/office/drawing/2016/5/14/chartex" xmlns:mc="http://schemas.openxmlformats.org/markup-compatibility/2006" xmlns:aink="http://schemas.microsoft.com/office/drawing/2016/ink" xmlns:am3d="http://schemas.microsoft.com/office/drawing/2017/model3d" xmlns:o="urn:schemas-microsoft-com:office:office" xmlns:oel="http://schemas.microsoft.com/office/2019/extlst" xmlns:r="http://schemas.openxmlformats.org/officeDocument/2006/relationships" xmlns:m="http://schemas.openxmlformats.org/officeDocument/2006/math" xmlns:v="urn:schemas-microsoft-com:vml" xmlns:wp14="http://schemas.microsoft.com/office/word/2010/wordprocessingDrawing" xmlns:wp="http://schemas.openxmlformats.org/drawingml/2006/wordprocessingDrawing" xmlns:w10="urn:schemas-microsoft-com:office:word" xmlns:w="http://schemas.openxmlformats.org/wordprocessingml/2006/main" xmlns:w14="http://schemas.microsoft.com/office/word/2010/wordml" xmlns:w15="http://schemas.microsoft.com/office/word/2012/wordml" xmlns:w16cex="http://schemas.microsoft.com/office/word/2018/wordml/cex" xmlns:w16cid="http://schemas.microsoft.com/office/word/2016/wordml/cid" xmlns:w16="http://schemas.microsoft.com/office/word/2018/wordml" xmlns:w16du="http://schemas.microsoft.com/office/word/2023/wordml/word16du" xmlns:w16sdtdh="http://schemas.microsoft.com/office/word/2020/wordml/sdtdatahash" xmlns:w16se="http://schemas.microsoft.com/office/word/2015/wordml/symex" xmlns:wpg="http://schemas.microsoft.com/office/word/2010/wordprocessingGroup" xmlns:wpi="http://schemas.microsoft.com/office/word/2010/wordprocessingInk" xmlns:wne="http://schemas.microsoft.com/office/word/2006/wordml" xmlns:wps="http://schemas.microsoft.com/office/word/2010/wordprocessingShape" mc:Ignorable="w14 w15 w16se w16cid w16 w16cex w16sdtdh wp14">
   <w:p>
     <w:pPr>
       <w:pStyle w:val="Kopfzeile"/>
@@ -8588,7 +8327,7 @@
       <mc:AlternateContent>
         <mc:Choice Requires="wpg">
           <w:drawing>
-            <wp:anchor distT="0" distB="0" distL="114300" distR="114300" simplePos="0" relativeHeight="251660288" behindDoc="0" locked="0" layoutInCell="1" allowOverlap="1">
+            <wp:anchor distT="0" distB="0" distL="114300" distR="114300" simplePos="0" relativeHeight="251660288" behindDoc="0" locked="0" layoutInCell="1" allowOverlap="1" wp14:anchorId="3AAEF182" wp14:editId="6473D09B">
               <wp:simplePos x="0" y="0"/>
               <wp:positionH relativeFrom="column">
                 <wp:posOffset>9295765</wp:posOffset>
@@ -8648,7 +8387,7 @@
                             </w:pPr>
                             <w:r>
                               <w:rPr>
-                                <w:rFonts w:ascii="helvetica 55" w:hAnsi="helvetica 55"/>
+                                <w:rFonts w:ascii="Helvetica 55" w:hAnsi="Helvetica 55"/>
                                 <w:color w:val="A6A6A6" w:themeColor="background1" w:themeShade="A6"/>
                                 <w:sz w:val="14"/>
                                 <w:szCs w:val="14"/>
@@ -8806,7 +8545,7 @@
       <mc:AlternateContent>
         <mc:Choice Requires="wpg">
           <w:drawing>
-            <wp:anchor distT="0" distB="0" distL="114300" distR="114300" simplePos="0" relativeHeight="251656192" behindDoc="1" locked="0" layoutInCell="1" allowOverlap="1">
+            <wp:anchor distT="0" distB="0" distL="114300" distR="114300" simplePos="0" relativeHeight="251656192" behindDoc="1" locked="0" layoutInCell="1" allowOverlap="1" wp14:anchorId="4A16B5FB" wp14:editId="645038B2">
               <wp:simplePos x="0" y="0"/>
               <wp:positionH relativeFrom="column">
                 <wp:posOffset>6422975</wp:posOffset>
@@ -8817,7 +8556,7 @@
               <wp:extent cx="3060000" cy="340242"/>
               <wp:effectExtent l="0" t="0" r="1270" b="3175"/>
               <wp:wrapNone/>
-              <wp:docPr id="2" name="Rechteck 22"/>
+              <wp:docPr id="318167679" name="Rechteck 22"/>
               <wp:cNvGraphicFramePr/>
               <a:graphic xmlns:a="http://schemas.openxmlformats.org/drawingml/2006/main">
                 <a:graphicData uri="http://schemas.microsoft.com/office/word/2010/wordprocessingShape">
@@ -8949,7 +8688,7 @@
       <mc:AlternateContent>
         <mc:Choice Requires="wpg">
           <w:drawing>
-            <wp:anchor distT="0" distB="0" distL="114300" distR="114300" simplePos="0" relativeHeight="251658240" behindDoc="0" locked="0" layoutInCell="1" allowOverlap="1">
+            <wp:anchor distT="0" distB="0" distL="114300" distR="114300" simplePos="0" relativeHeight="251658240" behindDoc="0" locked="0" layoutInCell="1" allowOverlap="1" wp14:anchorId="749BEEAF" wp14:editId="1D20B09A">
               <wp:simplePos x="0" y="0"/>
               <wp:positionH relativeFrom="column">
                 <wp:posOffset>-1912620</wp:posOffset>
@@ -9058,7 +8797,7 @@
 </file>
 
 <file path=word/header3.xml><?xml version="1.0" encoding="utf-8"?>
-<w:hdr xmlns:wpc="http://schemas.microsoft.com/office/word/2010/wordprocessingCanvas" xmlns:cx="http://schemas.microsoft.com/office/drawing/2014/chartex" xmlns:cx1="http://schemas.microsoft.com/office/drawing/2015/9/8/chartex" xmlns:cx2="http://schemas.microsoft.com/office/drawing/2015/10/21/chartex" xmlns:cx3="http://schemas.microsoft.com/office/drawing/2016/5/9/chartex" xmlns:cx4="http://schemas.microsoft.com/office/drawing/2016/5/10/chartex" xmlns:cx5="http://schemas.microsoft.com/office/drawing/2016/5/11/chartex" xmlns:cx6="http://schemas.microsoft.com/office/drawing/2016/5/12/chartex" xmlns:cx7="http://schemas.microsoft.com/office/drawing/2016/5/13/chartex" xmlns:cx8="http://schemas.microsoft.com/office/drawing/2016/5/14/chartex" xmlns:mc="http://schemas.openxmlformats.org/markup-compatibility/2006" xmlns:aink="http://schemas.microsoft.com/office/drawing/2016/ink" xmlns:am3d="http://schemas.microsoft.com/office/drawing/2017/model3d" xmlns:o="urn:schemas-microsoft-com:office:office" xmlns:r="http://schemas.openxmlformats.org/officeDocument/2006/relationships" xmlns:m="http://schemas.openxmlformats.org/officeDocument/2006/math" xmlns:v="urn:schemas-microsoft-com:vml" xmlns:wp14="http://schemas.microsoft.com/office/word/2010/wordprocessingDrawing" xmlns:wp="http://schemas.openxmlformats.org/drawingml/2006/wordprocessingDrawing" xmlns:w10="urn:schemas-microsoft-com:office:word" xmlns:w="http://schemas.openxmlformats.org/wordprocessingml/2006/main" xmlns:w14="http://schemas.microsoft.com/office/word/2010/wordml" xmlns:w15="http://schemas.microsoft.com/office/word/2012/wordml" xmlns:w16cid="http://schemas.microsoft.com/office/word/2016/wordml/cid" xmlns:w16se="http://schemas.microsoft.com/office/word/2015/wordml/symex" xmlns:wpg="http://schemas.microsoft.com/office/word/2010/wordprocessingGroup" xmlns:wpi="http://schemas.microsoft.com/office/word/2010/wordprocessingInk" xmlns:wne="http://schemas.microsoft.com/office/word/2006/wordml" xmlns:wps="http://schemas.microsoft.com/office/word/2010/wordprocessingShape" mc:Ignorable="w14 w15 w16se w16cid wp14">
+<w:hdr xmlns:wpc="http://schemas.microsoft.com/office/word/2010/wordprocessingCanvas" xmlns:cx="http://schemas.microsoft.com/office/drawing/2014/chartex" xmlns:cx1="http://schemas.microsoft.com/office/drawing/2015/9/8/chartex" xmlns:cx2="http://schemas.microsoft.com/office/drawing/2015/10/21/chartex" xmlns:cx3="http://schemas.microsoft.com/office/drawing/2016/5/9/chartex" xmlns:cx4="http://schemas.microsoft.com/office/drawing/2016/5/10/chartex" xmlns:cx5="http://schemas.microsoft.com/office/drawing/2016/5/11/chartex" xmlns:cx6="http://schemas.microsoft.com/office/drawing/2016/5/12/chartex" xmlns:cx7="http://schemas.microsoft.com/office/drawing/2016/5/13/chartex" xmlns:cx8="http://schemas.microsoft.com/office/drawing/2016/5/14/chartex" xmlns:mc="http://schemas.openxmlformats.org/markup-compatibility/2006" xmlns:aink="http://schemas.microsoft.com/office/drawing/2016/ink" xmlns:am3d="http://schemas.microsoft.com/office/drawing/2017/model3d" xmlns:o="urn:schemas-microsoft-com:office:office" xmlns:oel="http://schemas.microsoft.com/office/2019/extlst" xmlns:r="http://schemas.openxmlformats.org/officeDocument/2006/relationships" xmlns:m="http://schemas.openxmlformats.org/officeDocument/2006/math" xmlns:v="urn:schemas-microsoft-com:vml" xmlns:wp14="http://schemas.microsoft.com/office/word/2010/wordprocessingDrawing" xmlns:wp="http://schemas.openxmlformats.org/drawingml/2006/wordprocessingDrawing" xmlns:w10="urn:schemas-microsoft-com:office:word" xmlns:w="http://schemas.openxmlformats.org/wordprocessingml/2006/main" xmlns:w14="http://schemas.microsoft.com/office/word/2010/wordml" xmlns:w15="http://schemas.microsoft.com/office/word/2012/wordml" xmlns:w16cex="http://schemas.microsoft.com/office/word/2018/wordml/cex" xmlns:w16cid="http://schemas.microsoft.com/office/word/2016/wordml/cid" xmlns:w16="http://schemas.microsoft.com/office/word/2018/wordml" xmlns:w16du="http://schemas.microsoft.com/office/word/2023/wordml/word16du" xmlns:w16sdtdh="http://schemas.microsoft.com/office/word/2020/wordml/sdtdatahash" xmlns:w16se="http://schemas.microsoft.com/office/word/2015/wordml/symex" xmlns:wpg="http://schemas.microsoft.com/office/word/2010/wordprocessingGroup" xmlns:wpi="http://schemas.microsoft.com/office/word/2010/wordprocessingInk" xmlns:wne="http://schemas.microsoft.com/office/word/2006/wordml" xmlns:wps="http://schemas.microsoft.com/office/word/2010/wordprocessingShape" mc:Ignorable="w14 w15 w16se w16cid w16 w16cex w16sdtdh wp14">
   <w:p>
     <w:pPr>
       <w:pStyle w:val="Kopfzeile"/>
@@ -9068,7 +8807,7 @@
 </file>
 
 <file path=word/header4.xml><?xml version="1.0" encoding="utf-8"?>
-<w:hdr xmlns:wpc="http://schemas.microsoft.com/office/word/2010/wordprocessingCanvas" xmlns:cx="http://schemas.microsoft.com/office/drawing/2014/chartex" xmlns:cx1="http://schemas.microsoft.com/office/drawing/2015/9/8/chartex" xmlns:cx2="http://schemas.microsoft.com/office/drawing/2015/10/21/chartex" xmlns:cx3="http://schemas.microsoft.com/office/drawing/2016/5/9/chartex" xmlns:cx4="http://schemas.microsoft.com/office/drawing/2016/5/10/chartex" xmlns:cx5="http://schemas.microsoft.com/office/drawing/2016/5/11/chartex" xmlns:cx6="http://schemas.microsoft.com/office/drawing/2016/5/12/chartex" xmlns:cx7="http://schemas.microsoft.com/office/drawing/2016/5/13/chartex" xmlns:cx8="http://schemas.microsoft.com/office/drawing/2016/5/14/chartex" xmlns:mc="http://schemas.openxmlformats.org/markup-compatibility/2006" xmlns:aink="http://schemas.microsoft.com/office/drawing/2016/ink" xmlns:am3d="http://schemas.microsoft.com/office/drawing/2017/model3d" xmlns:o="urn:schemas-microsoft-com:office:office" xmlns:r="http://schemas.openxmlformats.org/officeDocument/2006/relationships" xmlns:m="http://schemas.openxmlformats.org/officeDocument/2006/math" xmlns:v="urn:schemas-microsoft-com:vml" xmlns:wp14="http://schemas.microsoft.com/office/word/2010/wordprocessingDrawing" xmlns:wp="http://schemas.openxmlformats.org/drawingml/2006/wordprocessingDrawing" xmlns:w10="urn:schemas-microsoft-com:office:word" xmlns:w="http://schemas.openxmlformats.org/wordprocessingml/2006/main" xmlns:w14="http://schemas.microsoft.com/office/word/2010/wordml" xmlns:w15="http://schemas.microsoft.com/office/word/2012/wordml" xmlns:w16cid="http://schemas.microsoft.com/office/word/2016/wordml/cid" xmlns:w16se="http://schemas.microsoft.com/office/word/2015/wordml/symex" xmlns:wpg="http://schemas.microsoft.com/office/word/2010/wordprocessingGroup" xmlns:wpi="http://schemas.microsoft.com/office/word/2010/wordprocessingInk" xmlns:wne="http://schemas.microsoft.com/office/word/2006/wordml" xmlns:wps="http://schemas.microsoft.com/office/word/2010/wordprocessingShape" mc:Ignorable="w14 w15 w16se w16cid wp14">
+<w:hdr xmlns:wpc="http://schemas.microsoft.com/office/word/2010/wordprocessingCanvas" xmlns:cx="http://schemas.microsoft.com/office/drawing/2014/chartex" xmlns:cx1="http://schemas.microsoft.com/office/drawing/2015/9/8/chartex" xmlns:cx2="http://schemas.microsoft.com/office/drawing/2015/10/21/chartex" xmlns:cx3="http://schemas.microsoft.com/office/drawing/2016/5/9/chartex" xmlns:cx4="http://schemas.microsoft.com/office/drawing/2016/5/10/chartex" xmlns:cx5="http://schemas.microsoft.com/office/drawing/2016/5/11/chartex" xmlns:cx6="http://schemas.microsoft.com/office/drawing/2016/5/12/chartex" xmlns:cx7="http://schemas.microsoft.com/office/drawing/2016/5/13/chartex" xmlns:cx8="http://schemas.microsoft.com/office/drawing/2016/5/14/chartex" xmlns:mc="http://schemas.openxmlformats.org/markup-compatibility/2006" xmlns:aink="http://schemas.microsoft.com/office/drawing/2016/ink" xmlns:am3d="http://schemas.microsoft.com/office/drawing/2017/model3d" xmlns:o="urn:schemas-microsoft-com:office:office" xmlns:oel="http://schemas.microsoft.com/office/2019/extlst" xmlns:r="http://schemas.openxmlformats.org/officeDocument/2006/relationships" xmlns:m="http://schemas.openxmlformats.org/officeDocument/2006/math" xmlns:v="urn:schemas-microsoft-com:vml" xmlns:wp14="http://schemas.microsoft.com/office/word/2010/wordprocessingDrawing" xmlns:wp="http://schemas.openxmlformats.org/drawingml/2006/wordprocessingDrawing" xmlns:w10="urn:schemas-microsoft-com:office:word" xmlns:w="http://schemas.openxmlformats.org/wordprocessingml/2006/main" xmlns:w14="http://schemas.microsoft.com/office/word/2010/wordml" xmlns:w15="http://schemas.microsoft.com/office/word/2012/wordml" xmlns:w16cex="http://schemas.microsoft.com/office/word/2018/wordml/cex" xmlns:w16cid="http://schemas.microsoft.com/office/word/2016/wordml/cid" xmlns:w16="http://schemas.microsoft.com/office/word/2018/wordml" xmlns:w16du="http://schemas.microsoft.com/office/word/2023/wordml/word16du" xmlns:w16sdtdh="http://schemas.microsoft.com/office/word/2020/wordml/sdtdatahash" xmlns:w16se="http://schemas.microsoft.com/office/word/2015/wordml/symex" xmlns:wpg="http://schemas.microsoft.com/office/word/2010/wordprocessingGroup" xmlns:wpi="http://schemas.microsoft.com/office/word/2010/wordprocessingInk" xmlns:wne="http://schemas.microsoft.com/office/word/2006/wordml" xmlns:wps="http://schemas.microsoft.com/office/word/2010/wordprocessingShape" mc:Ignorable="w14 w15 w16se w16cid w16 w16cex w16sdtdh wp14">
   <w:p>
     <w:pPr>
       <w:pStyle w:val="Kopfzeile"/>
@@ -9091,7 +8830,7 @@
       <mc:AlternateContent>
         <mc:Choice Requires="wpg">
           <w:drawing>
-            <wp:anchor distT="0" distB="0" distL="114300" distR="114300" simplePos="0" relativeHeight="251657216" behindDoc="1" locked="0" layoutInCell="1" allowOverlap="1">
+            <wp:anchor distT="0" distB="0" distL="114300" distR="114300" simplePos="0" relativeHeight="251657216" behindDoc="1" locked="0" layoutInCell="1" allowOverlap="1" wp14:anchorId="26FD6880" wp14:editId="629EC2A0">
               <wp:simplePos x="0" y="0"/>
               <wp:positionH relativeFrom="column">
                 <wp:posOffset>2557145</wp:posOffset>
@@ -9246,7 +8985,7 @@
       <mc:AlternateContent>
         <mc:Choice Requires="wpg">
           <w:drawing>
-            <wp:anchor distT="0" distB="0" distL="114300" distR="114300" simplePos="0" relativeHeight="251659264" behindDoc="0" locked="0" layoutInCell="1" allowOverlap="1">
+            <wp:anchor distT="0" distB="0" distL="114300" distR="114300" simplePos="0" relativeHeight="251659264" behindDoc="0" locked="0" layoutInCell="1" allowOverlap="1" wp14:anchorId="7F9D62F1" wp14:editId="53E9AA31">
               <wp:simplePos x="0" y="0"/>
               <wp:positionH relativeFrom="column">
                 <wp:posOffset>-1912620</wp:posOffset>
@@ -9355,7 +9094,7 @@
 </file>
 
 <file path=word/numbering.xml><?xml version="1.0" encoding="utf-8"?>
-<w:numbering xmlns:wpc="http://schemas.microsoft.com/office/word/2010/wordprocessingCanvas" xmlns:cx="http://schemas.microsoft.com/office/drawing/2014/chartex" xmlns:cx1="http://schemas.microsoft.com/office/drawing/2015/9/8/chartex" xmlns:cx2="http://schemas.microsoft.com/office/drawing/2015/10/21/chartex" xmlns:cx3="http://schemas.microsoft.com/office/drawing/2016/5/9/chartex" xmlns:cx4="http://schemas.microsoft.com/office/drawing/2016/5/10/chartex" xmlns:cx5="http://schemas.microsoft.com/office/drawing/2016/5/11/chartex" xmlns:cx6="http://schemas.microsoft.com/office/drawing/2016/5/12/chartex" xmlns:cx7="http://schemas.microsoft.com/office/drawing/2016/5/13/chartex" xmlns:cx8="http://schemas.microsoft.com/office/drawing/2016/5/14/chartex" xmlns:mc="http://schemas.openxmlformats.org/markup-compatibility/2006" xmlns:aink="http://schemas.microsoft.com/office/drawing/2016/ink" xmlns:am3d="http://schemas.microsoft.com/office/drawing/2017/model3d" xmlns:o="urn:schemas-microsoft-com:office:office" xmlns:r="http://schemas.openxmlformats.org/officeDocument/2006/relationships" xmlns:m="http://schemas.openxmlformats.org/officeDocument/2006/math" xmlns:v="urn:schemas-microsoft-com:vml" xmlns:wp14="http://schemas.microsoft.com/office/word/2010/wordprocessingDrawing" xmlns:wp="http://schemas.openxmlformats.org/drawingml/2006/wordprocessingDrawing" xmlns:w10="urn:schemas-microsoft-com:office:word" xmlns:w="http://schemas.openxmlformats.org/wordprocessingml/2006/main" xmlns:w14="http://schemas.microsoft.com/office/word/2010/wordml" xmlns:w15="http://schemas.microsoft.com/office/word/2012/wordml" xmlns:w16cid="http://schemas.microsoft.com/office/word/2016/wordml/cid" xmlns:w16se="http://schemas.microsoft.com/office/word/2015/wordml/symex" xmlns:wpg="http://schemas.microsoft.com/office/word/2010/wordprocessingGroup" xmlns:wpi="http://schemas.microsoft.com/office/word/2010/wordprocessingInk" xmlns:wne="http://schemas.microsoft.com/office/word/2006/wordml" xmlns:wps="http://schemas.microsoft.com/office/word/2010/wordprocessingShape" mc:Ignorable="w14 w15 w16se w16cid wp14">
+<w:numbering xmlns:wpc="http://schemas.microsoft.com/office/word/2010/wordprocessingCanvas" xmlns:cx="http://schemas.microsoft.com/office/drawing/2014/chartex" xmlns:cx1="http://schemas.microsoft.com/office/drawing/2015/9/8/chartex" xmlns:cx2="http://schemas.microsoft.com/office/drawing/2015/10/21/chartex" xmlns:cx3="http://schemas.microsoft.com/office/drawing/2016/5/9/chartex" xmlns:cx4="http://schemas.microsoft.com/office/drawing/2016/5/10/chartex" xmlns:cx5="http://schemas.microsoft.com/office/drawing/2016/5/11/chartex" xmlns:cx6="http://schemas.microsoft.com/office/drawing/2016/5/12/chartex" xmlns:cx7="http://schemas.microsoft.com/office/drawing/2016/5/13/chartex" xmlns:cx8="http://schemas.microsoft.com/office/drawing/2016/5/14/chartex" xmlns:mc="http://schemas.openxmlformats.org/markup-compatibility/2006" xmlns:aink="http://schemas.microsoft.com/office/drawing/2016/ink" xmlns:am3d="http://schemas.microsoft.com/office/drawing/2017/model3d" xmlns:o="urn:schemas-microsoft-com:office:office" xmlns:oel="http://schemas.microsoft.com/office/2019/extlst" xmlns:r="http://schemas.openxmlformats.org/officeDocument/2006/relationships" xmlns:m="http://schemas.openxmlformats.org/officeDocument/2006/math" xmlns:v="urn:schemas-microsoft-com:vml" xmlns:wp14="http://schemas.microsoft.com/office/word/2010/wordprocessingDrawing" xmlns:wp="http://schemas.openxmlformats.org/drawingml/2006/wordprocessingDrawing" xmlns:w10="urn:schemas-microsoft-com:office:word" xmlns:w="http://schemas.openxmlformats.org/wordprocessingml/2006/main" xmlns:w14="http://schemas.microsoft.com/office/word/2010/wordml" xmlns:w15="http://schemas.microsoft.com/office/word/2012/wordml" xmlns:w16cex="http://schemas.microsoft.com/office/word/2018/wordml/cex" xmlns:w16cid="http://schemas.microsoft.com/office/word/2016/wordml/cid" xmlns:w16="http://schemas.microsoft.com/office/word/2018/wordml" xmlns:w16du="http://schemas.microsoft.com/office/word/2023/wordml/word16du" xmlns:w16sdtdh="http://schemas.microsoft.com/office/word/2020/wordml/sdtdatahash" xmlns:w16se="http://schemas.microsoft.com/office/word/2015/wordml/symex" xmlns:wpg="http://schemas.microsoft.com/office/word/2010/wordprocessingGroup" xmlns:wpi="http://schemas.microsoft.com/office/word/2010/wordprocessingInk" xmlns:wne="http://schemas.microsoft.com/office/word/2006/wordml" xmlns:wps="http://schemas.microsoft.com/office/word/2010/wordprocessingShape" mc:Ignorable="w14 w15 w16se w16cid w16 w16cex w16sdtdh wp14">
   <w:abstractNum w:abstractNumId="0" w15:restartNumberingAfterBreak="0">
     <w:nsid w:val="03FA2DD6"/>
     <w:multiLevelType w:val="hybridMultilevel"/>
@@ -12276,93 +12015,85 @@
       </w:rPr>
     </w:lvl>
   </w:abstractNum>
-  <w:num w:numId="1">
+  <w:num w:numId="1" w16cid:durableId="1680620086">
     <w:abstractNumId w:val="14"/>
   </w:num>
-  <w:num w:numId="2">
+  <w:num w:numId="2" w16cid:durableId="106387575">
     <w:abstractNumId w:val="24"/>
   </w:num>
-  <w:num w:numId="3">
+  <w:num w:numId="3" w16cid:durableId="2141534117">
     <w:abstractNumId w:val="15"/>
   </w:num>
-  <w:num w:numId="4">
+  <w:num w:numId="4" w16cid:durableId="334265664">
     <w:abstractNumId w:val="3"/>
   </w:num>
-  <w:num w:numId="5">
+  <w:num w:numId="5" w16cid:durableId="1207447479">
     <w:abstractNumId w:val="0"/>
   </w:num>
-  <w:num w:numId="6">
+  <w:num w:numId="6" w16cid:durableId="486286400">
     <w:abstractNumId w:val="25"/>
   </w:num>
-  <w:num w:numId="7">
+  <w:num w:numId="7" w16cid:durableId="1698236968">
     <w:abstractNumId w:val="10"/>
   </w:num>
-  <w:num w:numId="8">
+  <w:num w:numId="8" w16cid:durableId="640842416">
     <w:abstractNumId w:val="5"/>
   </w:num>
-  <w:num w:numId="9">
+  <w:num w:numId="9" w16cid:durableId="1248147787">
     <w:abstractNumId w:val="18"/>
   </w:num>
-  <w:num w:numId="10">
+  <w:num w:numId="10" w16cid:durableId="2125494089">
     <w:abstractNumId w:val="17"/>
   </w:num>
-  <w:num w:numId="11">
+  <w:num w:numId="11" w16cid:durableId="1031808687">
     <w:abstractNumId w:val="1"/>
   </w:num>
-  <w:num w:numId="12">
+  <w:num w:numId="12" w16cid:durableId="56632885">
     <w:abstractNumId w:val="23"/>
   </w:num>
-  <w:num w:numId="13">
+  <w:num w:numId="13" w16cid:durableId="1295066054">
     <w:abstractNumId w:val="7"/>
   </w:num>
-  <w:num w:numId="14">
+  <w:num w:numId="14" w16cid:durableId="929850482">
     <w:abstractNumId w:val="19"/>
   </w:num>
-  <w:num w:numId="15">
+  <w:num w:numId="15" w16cid:durableId="450589469">
     <w:abstractNumId w:val="2"/>
   </w:num>
-  <w:num w:numId="16">
+  <w:num w:numId="16" w16cid:durableId="1629362071">
     <w:abstractNumId w:val="22"/>
   </w:num>
-  <w:num w:numId="17">
+  <w:num w:numId="17" w16cid:durableId="1589384867">
     <w:abstractNumId w:val="11"/>
   </w:num>
-  <w:num w:numId="18">
+  <w:num w:numId="18" w16cid:durableId="74589859">
     <w:abstractNumId w:val="16"/>
   </w:num>
-  <w:num w:numId="19">
+  <w:num w:numId="19" w16cid:durableId="31854595">
     <w:abstractNumId w:val="21"/>
   </w:num>
-  <w:num w:numId="20">
+  <w:num w:numId="20" w16cid:durableId="1457330653">
     <w:abstractNumId w:val="6"/>
   </w:num>
-  <w:num w:numId="21">
+  <w:num w:numId="21" w16cid:durableId="334265004">
     <w:abstractNumId w:val="8"/>
   </w:num>
-  <w:num w:numId="22">
+  <w:num w:numId="22" w16cid:durableId="1272592872">
     <w:abstractNumId w:val="12"/>
   </w:num>
-  <w:num w:numId="23">
+  <w:num w:numId="23" w16cid:durableId="1856766578">
     <w:abstractNumId w:val="9"/>
   </w:num>
-  <w:num w:numId="24">
+  <w:num w:numId="24" w16cid:durableId="184099809">
     <w:abstractNumId w:val="4"/>
   </w:num>
-  <w:num w:numId="25">
+  <w:num w:numId="25" w16cid:durableId="979263653">
     <w:abstractNumId w:val="20"/>
   </w:num>
-  <w:num w:numId="26">
+  <w:num w:numId="26" w16cid:durableId="1179856307">
     <w:abstractNumId w:val="13"/>
   </w:num>
 </w:numbering>
-</file>
-
-<file path=word/people.xml><?xml version="1.0" encoding="utf-8"?>
-<w15:people xmlns:wpc="http://schemas.microsoft.com/office/word/2010/wordprocessingCanvas" xmlns:cx="http://schemas.microsoft.com/office/drawing/2014/chartex" xmlns:cx1="http://schemas.microsoft.com/office/drawing/2015/9/8/chartex" xmlns:cx2="http://schemas.microsoft.com/office/drawing/2015/10/21/chartex" xmlns:cx3="http://schemas.microsoft.com/office/drawing/2016/5/9/chartex" xmlns:cx4="http://schemas.microsoft.com/office/drawing/2016/5/10/chartex" xmlns:cx5="http://schemas.microsoft.com/office/drawing/2016/5/11/chartex" xmlns:cx6="http://schemas.microsoft.com/office/drawing/2016/5/12/chartex" xmlns:cx7="http://schemas.microsoft.com/office/drawing/2016/5/13/chartex" xmlns:cx8="http://schemas.microsoft.com/office/drawing/2016/5/14/chartex" xmlns:mc="http://schemas.openxmlformats.org/markup-compatibility/2006" xmlns:aink="http://schemas.microsoft.com/office/drawing/2016/ink" xmlns:am3d="http://schemas.microsoft.com/office/drawing/2017/model3d" xmlns:o="urn:schemas-microsoft-com:office:office" xmlns:r="http://schemas.openxmlformats.org/officeDocument/2006/relationships" xmlns:m="http://schemas.openxmlformats.org/officeDocument/2006/math" xmlns:v="urn:schemas-microsoft-com:vml" xmlns:wp14="http://schemas.microsoft.com/office/word/2010/wordprocessingDrawing" xmlns:wp="http://schemas.openxmlformats.org/drawingml/2006/wordprocessingDrawing" xmlns:w10="urn:schemas-microsoft-com:office:word" xmlns:w="http://schemas.openxmlformats.org/wordprocessingml/2006/main" xmlns:w14="http://schemas.microsoft.com/office/word/2010/wordml" xmlns:w15="http://schemas.microsoft.com/office/word/2012/wordml" xmlns:w16cid="http://schemas.microsoft.com/office/word/2016/wordml/cid" xmlns:w16se="http://schemas.microsoft.com/office/word/2015/wordml/symex" xmlns:wpg="http://schemas.microsoft.com/office/word/2010/wordprocessingGroup" xmlns:wpi="http://schemas.microsoft.com/office/word/2010/wordprocessingInk" xmlns:wne="http://schemas.microsoft.com/office/word/2006/wordml" xmlns:wps="http://schemas.microsoft.com/office/word/2010/wordprocessingShape" mc:Ignorable="w14 w15 w16se w16cid wp14">
-  <w15:person w15:author="Imke Endjer">
-    <w15:presenceInfo w15:providerId="AD" w15:userId="S-1-5-21-1085031214-1614895754-682003330-382812"/>
-  </w15:person>
-</w15:people>
 </file>
 
 <file path=word/peopleDocument.xml><?xml version="1.0" encoding="utf-8"?>
@@ -12374,7 +12105,7 @@
 </file>
 
 <file path=word/styles.xml><?xml version="1.0" encoding="utf-8"?>
-<w:styles xmlns:mc="http://schemas.openxmlformats.org/markup-compatibility/2006" xmlns:r="http://schemas.openxmlformats.org/officeDocument/2006/relationships" xmlns:w="http://schemas.openxmlformats.org/wordprocessingml/2006/main" xmlns:w14="http://schemas.microsoft.com/office/word/2010/wordml" xmlns:w15="http://schemas.microsoft.com/office/word/2012/wordml" xmlns:w16cid="http://schemas.microsoft.com/office/word/2016/wordml/cid" xmlns:w16se="http://schemas.microsoft.com/office/word/2015/wordml/symex" mc:Ignorable="w14 w15 w16se w16cid">
+<w:styles xmlns:mc="http://schemas.openxmlformats.org/markup-compatibility/2006" xmlns:r="http://schemas.openxmlformats.org/officeDocument/2006/relationships" xmlns:w="http://schemas.openxmlformats.org/wordprocessingml/2006/main" xmlns:w14="http://schemas.microsoft.com/office/word/2010/wordml" xmlns:w15="http://schemas.microsoft.com/office/word/2012/wordml" xmlns:w16cex="http://schemas.microsoft.com/office/word/2018/wordml/cex" xmlns:w16cid="http://schemas.microsoft.com/office/word/2016/wordml/cid" xmlns:w16="http://schemas.microsoft.com/office/word/2018/wordml" xmlns:w16sdtdh="http://schemas.microsoft.com/office/word/2020/wordml/sdtdatahash" xmlns:w16se="http://schemas.microsoft.com/office/word/2015/wordml/symex" mc:Ignorable="w14 w15 w16se w16cid w16 w16cex w16sdtdh">
   <w:docDefaults>
     <w:rPrDefault>
       <w:rPr>
@@ -12390,7 +12121,7 @@
       </w:pPr>
     </w:pPrDefault>
   </w:docDefaults>
-  <w:latentStyles w:defLockedState="0" w:defUIPriority="99" w:defSemiHidden="0" w:defUnhideWhenUsed="0" w:defQFormat="0" w:count="375">
+  <w:latentStyles w:defLockedState="0" w:defUIPriority="99" w:defSemiHidden="0" w:defUnhideWhenUsed="0" w:defQFormat="0" w:count="376">
     <w:lsdException w:name="Normal" w:uiPriority="0" w:qFormat="1"/>
     <w:lsdException w:name="heading 1" w:uiPriority="9" w:qFormat="1"/>
     <w:lsdException w:name="heading 2" w:semiHidden="1" w:uiPriority="9" w:unhideWhenUsed="1" w:qFormat="1"/>
@@ -12496,7 +12227,6 @@
     <w:lsdException w:name="HTML Sample" w:semiHidden="1" w:unhideWhenUsed="1"/>
     <w:lsdException w:name="HTML Typewriter" w:semiHidden="1" w:unhideWhenUsed="1"/>
     <w:lsdException w:name="HTML Variable" w:semiHidden="1" w:unhideWhenUsed="1"/>
-    <w:lsdException w:name="Normal Table" w:semiHidden="1" w:unhideWhenUsed="1"/>
     <w:lsdException w:name="annotation subject" w:semiHidden="1" w:unhideWhenUsed="1"/>
     <w:lsdException w:name="No List" w:semiHidden="1" w:unhideWhenUsed="1"/>
     <w:lsdException w:name="Outline List 1" w:semiHidden="1" w:unhideWhenUsed="1"/>
@@ -12543,10 +12273,8 @@
     <w:lsdException w:name="Table Subtle 2" w:semiHidden="1" w:unhideWhenUsed="1"/>
     <w:lsdException w:name="Table Web 1" w:semiHidden="1" w:unhideWhenUsed="1"/>
     <w:lsdException w:name="Table Web 2" w:semiHidden="1" w:unhideWhenUsed="1"/>
-    <w:lsdException w:name="Table Web 3" w:semiHidden="1" w:unhideWhenUsed="1"/>
     <w:lsdException w:name="Balloon Text" w:semiHidden="1" w:unhideWhenUsed="1"/>
-    <w:lsdException w:name="Table Grid" w:semiHidden="1" w:uiPriority="59" w:unhideWhenUsed="1"/>
-    <w:lsdException w:name="Table Theme" w:semiHidden="1" w:unhideWhenUsed="1"/>
+    <w:lsdException w:name="Table Grid" w:uiPriority="59"/>
     <w:lsdException w:name="Placeholder Text" w:semiHidden="1"/>
     <w:lsdException w:name="No Spacing" w:uiPriority="1" w:qFormat="1"/>
     <w:lsdException w:name="Light Shading" w:uiPriority="60"/>
@@ -12766,6 +12494,7 @@
     <w:lsdException w:name="Smart Hyperlink" w:semiHidden="1" w:unhideWhenUsed="1"/>
     <w:lsdException w:name="Hashtag" w:semiHidden="1" w:unhideWhenUsed="1"/>
     <w:lsdException w:name="Unresolved Mention" w:semiHidden="1" w:unhideWhenUsed="1"/>
+    <w:lsdException w:name="Smart Link" w:semiHidden="1" w:unhideWhenUsed="1"/>
   </w:latentStyles>
   <w:style w:type="paragraph" w:default="1" w:styleId="Standard">
     <w:name w:val="Normal"/>
@@ -12793,7 +12522,7 @@
       <w:outlineLvl w:val="0"/>
     </w:pPr>
     <w:rPr>
-      <w:rFonts w:ascii="helvetica 65" w:hAnsi="helvetica 65"/>
+      <w:rFonts w:ascii="Helvetica 65" w:hAnsi="Helvetica 65"/>
       <w:bCs w:val="0"/>
       <w:color w:val="000000" w:themeColor="text1"/>
       <w:sz w:val="28"/>
@@ -12819,7 +12548,7 @@
       <w:outlineLvl w:val="1"/>
     </w:pPr>
     <w:rPr>
-      <w:rFonts w:ascii="helvetica 65" w:hAnsi="helvetica 65"/>
+      <w:rFonts w:ascii="Helvetica 65" w:hAnsi="Helvetica 65"/>
       <w:bCs w:val="0"/>
       <w:color w:val="000000" w:themeColor="text1"/>
       <w:sz w:val="24"/>
@@ -12845,7 +12574,7 @@
       <w:outlineLvl w:val="2"/>
     </w:pPr>
     <w:rPr>
-      <w:rFonts w:ascii="helvetica 65" w:hAnsi="helvetica 65"/>
+      <w:rFonts w:ascii="Helvetica 65" w:hAnsi="Helvetica 65"/>
       <w:bCs w:val="0"/>
       <w:color w:val="000000" w:themeColor="text1"/>
       <w:sz w:val="22"/>
@@ -24316,7 +24045,7 @@
     <w:link w:val="berschrift1"/>
     <w:uiPriority w:val="9"/>
     <w:rPr>
-      <w:rFonts w:ascii="helvetica 65" w:eastAsia="Arial" w:hAnsi="helvetica 65" w:cs="Arial"/>
+      <w:rFonts w:ascii="Helvetica 65" w:eastAsia="Arial" w:hAnsi="Helvetica 65" w:cs="Arial"/>
       <w:color w:val="000000" w:themeColor="text1"/>
       <w:sz w:val="28"/>
       <w:szCs w:val="36"/>
@@ -24345,7 +24074,7 @@
     <w:link w:val="berschrift2"/>
     <w:uiPriority w:val="9"/>
     <w:rPr>
-      <w:rFonts w:ascii="helvetica 65" w:hAnsi="helvetica 65"/>
+      <w:rFonts w:ascii="Helvetica 65" w:hAnsi="Helvetica 65"/>
       <w:color w:val="000000" w:themeColor="text1"/>
       <w:sz w:val="24"/>
       <w:szCs w:val="28"/>
@@ -24450,7 +24179,7 @@
     <w:link w:val="berschrift3"/>
     <w:uiPriority w:val="9"/>
     <w:rPr>
-      <w:rFonts w:ascii="helvetica 65" w:hAnsi="helvetica 65"/>
+      <w:rFonts w:ascii="Helvetica 65" w:hAnsi="Helvetica 65"/>
       <w:color w:val="000000" w:themeColor="text1"/>
       <w:lang w:eastAsia="de-DE"/>
     </w:rPr>
@@ -25016,7 +24745,7 @@
     <w:link w:val="Listenabsatz"/>
     <w:uiPriority w:val="34"/>
     <w:rPr>
-      <w:rFonts w:ascii="helvetica 45" w:eastAsia="Arial" w:hAnsi="helvetica 45"/>
+      <w:rFonts w:ascii="Helvetica 45" w:eastAsia="Arial" w:hAnsi="Helvetica 45"/>
       <w:bCs/>
       <w:sz w:val="21"/>
       <w:lang w:eastAsia="de-DE"/>
@@ -25028,7 +24757,7 @@
     <w:link w:val="WF-InhaltsverzeichnisZchn"/>
     <w:qFormat/>
     <w:rPr>
-      <w:rFonts w:ascii="helvetica 65" w:hAnsi="helvetica 65"/>
+      <w:rFonts w:ascii="Helvetica 65" w:hAnsi="Helvetica 65"/>
       <w:color w:val="000000" w:themeColor="text1"/>
       <w:sz w:val="28"/>
       <w:szCs w:val="36"/>
@@ -25039,7 +24768,7 @@
     <w:basedOn w:val="berschrift1Zchn"/>
     <w:link w:val="WF-Inhaltsverzeichnis"/>
     <w:rPr>
-      <w:rFonts w:ascii="helvetica 65" w:eastAsia="Arial" w:hAnsi="helvetica 65" w:cs="Arial"/>
+      <w:rFonts w:ascii="Helvetica 65" w:eastAsia="Arial" w:hAnsi="Helvetica 65" w:cs="Arial"/>
       <w:bCs/>
       <w:color w:val="000000" w:themeColor="text1"/>
       <w:sz w:val="28"/>
@@ -25064,7 +24793,7 @@
     <w:basedOn w:val="ListenabsatzZchn"/>
     <w:link w:val="WF-Listenabsatz-1-facherZeilenabstand"/>
     <w:rPr>
-      <w:rFonts w:ascii="helvetica 45" w:eastAsia="Arial" w:hAnsi="helvetica 45"/>
+      <w:rFonts w:ascii="Helvetica 45" w:eastAsia="Arial" w:hAnsi="Helvetica 45"/>
       <w:bCs/>
       <w:sz w:val="21"/>
       <w:lang w:eastAsia="de-DE"/>
@@ -25075,7 +24804,7 @@
     <w:basedOn w:val="Standard"/>
     <w:qFormat/>
     <w:rPr>
-      <w:rFonts w:ascii="helvetica 65" w:hAnsi="helvetica 65"/>
+      <w:rFonts w:ascii="Helvetica 65" w:hAnsi="Helvetica 65"/>
       <w:sz w:val="44"/>
       <w:szCs w:val="44"/>
     </w:rPr>
@@ -25085,7 +24814,7 @@
     <w:basedOn w:val="Beschriftung"/>
     <w:qFormat/>
     <w:rPr>
-      <w:rFonts w:ascii="helvetica 55" w:hAnsi="helvetica 55"/>
+      <w:rFonts w:ascii="Helvetica 55" w:hAnsi="Helvetica 55"/>
       <w:lang w:val="en-US"/>
     </w:rPr>
   </w:style>

</xml_diff>